<commit_message>
New methodology is created with help text. (Not verified yet by Farouk)
</commit_message>
<xml_diff>
--- a/People_Rise_Phase1_Detailed_Design.docx
+++ b/People_Rise_Phase1_Detailed_Design.docx
@@ -1,10 +1,10 @@
 
 <file path=word/document.xml><?xml version="1.0" encoding="utf-8"?>
-<w:document xmlns:wpc="http://schemas.microsoft.com/office/word/2010/wordprocessingCanvas" xmlns:mc="http://schemas.openxmlformats.org/markup-compatibility/2006" xmlns:o="urn:schemas-microsoft-com:office:office" xmlns:r="http://schemas.openxmlformats.org/officeDocument/2006/relationships" xmlns:m="http://schemas.openxmlformats.org/officeDocument/2006/math" xmlns:v="urn:schemas-microsoft-com:vml" xmlns:wp14="http://schemas.microsoft.com/office/word/2010/wordprocessingDrawing" xmlns:wp="http://schemas.openxmlformats.org/drawingml/2006/wordprocessingDrawing" xmlns:w10="urn:schemas-microsoft-com:office:word" xmlns:w="http://schemas.openxmlformats.org/wordprocessingml/2006/main" xmlns:w14="http://schemas.microsoft.com/office/word/2010/wordml" xmlns:w15="http://schemas.microsoft.com/office/word/2012/wordml" xmlns:wpg="http://schemas.microsoft.com/office/word/2010/wordprocessingGroup" xmlns:wpi="http://schemas.microsoft.com/office/word/2010/wordprocessingInk" xmlns:wne="http://schemas.microsoft.com/office/word/2006/wordml" xmlns:wps="http://schemas.microsoft.com/office/word/2010/wordprocessingShape" xmlns:cx="http://schemas.microsoft.com/office/drawing/2014/chartex" xmlns:cx1="http://schemas.microsoft.com/office/drawing/2015/9/8/chartex" xmlns:cx2="http://schemas.microsoft.com/office/drawing/2015/10/21/chartex" xmlns:cx3="http://schemas.microsoft.com/office/drawing/2016/5/9/chartex" xmlns:cx4="http://schemas.microsoft.com/office/drawing/2016/5/10/chartex" xmlns:cx5="http://schemas.microsoft.com/office/drawing/2016/5/11/chartex" xmlns:cx6="http://schemas.microsoft.com/office/drawing/2016/5/12/chartex" xmlns:cx7="http://schemas.microsoft.com/office/drawing/2016/5/13/chartex" xmlns:cx8="http://schemas.microsoft.com/office/drawing/2016/5/14/chartex" xmlns:aink="http://schemas.microsoft.com/office/drawing/2016/ink" xmlns:am3d="http://schemas.microsoft.com/office/drawing/2017/model3d" xmlns:w16cex="http://schemas.microsoft.com/office/word/2018/wordml/cex" xmlns:w16cid="http://schemas.microsoft.com/office/word/2016/wordml/cid" xmlns:w16="http://schemas.microsoft.com/office/word/2018/wordml" xmlns:w16sdtdh="http://schemas.microsoft.com/office/word/2020/wordml/sdtdatahash" xmlns:w16se="http://schemas.microsoft.com/office/word/2015/wordml/symex" mc:Ignorable="w14 w15 wp14">
+<w:document xmlns:wpc="http://schemas.microsoft.com/office/word/2010/wordprocessingCanvas" xmlns:cx="http://schemas.microsoft.com/office/drawing/2014/chartex" xmlns:cx1="http://schemas.microsoft.com/office/drawing/2015/9/8/chartex" xmlns:cx2="http://schemas.microsoft.com/office/drawing/2015/10/21/chartex" xmlns:cx3="http://schemas.microsoft.com/office/drawing/2016/5/9/chartex" xmlns:cx4="http://schemas.microsoft.com/office/drawing/2016/5/10/chartex" xmlns:cx5="http://schemas.microsoft.com/office/drawing/2016/5/11/chartex" xmlns:cx6="http://schemas.microsoft.com/office/drawing/2016/5/12/chartex" xmlns:cx7="http://schemas.microsoft.com/office/drawing/2016/5/13/chartex" xmlns:cx8="http://schemas.microsoft.com/office/drawing/2016/5/14/chartex" xmlns:mc="http://schemas.openxmlformats.org/markup-compatibility/2006" xmlns:aink="http://schemas.microsoft.com/office/drawing/2016/ink" xmlns:am3d="http://schemas.microsoft.com/office/drawing/2017/model3d" xmlns:o="urn:schemas-microsoft-com:office:office" xmlns:oel="http://schemas.microsoft.com/office/2019/extlst" xmlns:r="http://schemas.openxmlformats.org/officeDocument/2006/relationships" xmlns:m="http://schemas.openxmlformats.org/officeDocument/2006/math" xmlns:v="urn:schemas-microsoft-com:vml" xmlns:wp14="http://schemas.microsoft.com/office/word/2010/wordprocessingDrawing" xmlns:wp="http://schemas.openxmlformats.org/drawingml/2006/wordprocessingDrawing" xmlns:w10="urn:schemas-microsoft-com:office:word" xmlns:w="http://schemas.openxmlformats.org/wordprocessingml/2006/main" xmlns:w14="http://schemas.microsoft.com/office/word/2010/wordml" xmlns:w15="http://schemas.microsoft.com/office/word/2012/wordml" xmlns:w16cex="http://schemas.microsoft.com/office/word/2018/wordml/cex" xmlns:w16cid="http://schemas.microsoft.com/office/word/2016/wordml/cid" xmlns:w16="http://schemas.microsoft.com/office/word/2018/wordml" xmlns:w16du="http://schemas.microsoft.com/office/word/2023/wordml/word16du" xmlns:w16sdtdh="http://schemas.microsoft.com/office/word/2020/wordml/sdtdatahash" xmlns:w16sdtfl="http://schemas.microsoft.com/office/word/2024/wordml/sdtformatlock" xmlns:w16se="http://schemas.microsoft.com/office/word/2015/wordml/symex" xmlns:wpg="http://schemas.microsoft.com/office/word/2010/wordprocessingGroup" xmlns:wpi="http://schemas.microsoft.com/office/word/2010/wordprocessingInk" xmlns:wne="http://schemas.microsoft.com/office/word/2006/wordml" xmlns:wps="http://schemas.microsoft.com/office/word/2010/wordprocessingShape" mc:Ignorable="w14 w15 w16se w16cid w16 w16cex w16sdtdh w16sdtfl w16du wp14">
   <w:body>
     <w:p>
       <w:pPr>
-        <w:spacing w:after="0" w:before="2400"/>
+        <w:spacing w:before="2400"/>
       </w:pPr>
       <w:r>
         <w:rPr>
@@ -14,7 +14,7 @@
           <w:sz w:val="60"/>
           <w:szCs w:val="60"/>
         </w:rPr>
-        <w:t xml:space="preserve">Phase 1 — Detailed Design</w:t>
+        <w:t>Phase 1 — Detailed Design</w:t>
       </w:r>
     </w:p>
     <w:p>
@@ -27,13 +27,13 @@
           <w:sz w:val="30"/>
           <w:szCs w:val="30"/>
         </w:rPr>
-        <w:t xml:space="preserve">Job &amp; Reward Design: workflows, concepts, data model</w:t>
+        <w:t>Job &amp; Reward Design: workflows, concepts, data model</w:t>
       </w:r>
     </w:p>
     <w:p>
       <w:pPr>
         <w:pBdr>
-          <w:bottom w:val="single" w:color="2E75B6" w:sz="12" w:space="4"/>
+          <w:bottom w:val="single" w:sz="12" w:space="4" w:color="2E75B6"/>
         </w:pBdr>
         <w:spacing w:after="240"/>
       </w:pPr>
@@ -47,10 +47,8 @@
           <w:i/>
           <w:iCs/>
           <w:color w:val="595959"/>
-          <w:sz w:val="22"/>
-          <w:szCs w:val="22"/>
-        </w:rPr>
-        <w:t xml:space="preserve">Companion to the Product Scope and the Build Approach</w:t>
+        </w:rPr>
+        <w:t>Companion to the Product Scope and the Build Approach</w:t>
       </w:r>
     </w:p>
     <w:p>
@@ -62,7 +60,7 @@
           <w:sz w:val="18"/>
           <w:szCs w:val="18"/>
         </w:rPr>
-        <w:t xml:space="preserve">Working document — confidential</w:t>
+        <w:t>Working document — confidential</w:t>
       </w:r>
     </w:p>
     <w:p>
@@ -75,7 +73,8 @@
         <w:pStyle w:val="Heading1"/>
       </w:pPr>
       <w:r>
-        <w:t xml:space="preserve">Contents</w:t>
+        <w:lastRenderedPageBreak/>
+        <w:t>Contents</w:t>
       </w:r>
     </w:p>
     <w:p>
@@ -86,18 +85,11 @@
         <w:spacing w:after="100"/>
       </w:pPr>
       <w:r>
-        <w:rPr>
-          <w:sz w:val="22"/>
-          <w:szCs w:val="22"/>
-        </w:rPr>
-        <w:t xml:space="preserve">1.  Scope — what's in and out of Phase 1</w:t>
-      </w:r>
-      <w:r>
-        <w:rPr>
-          <w:sz w:val="22"/>
-          <w:szCs w:val="22"/>
-        </w:rPr>
-        <w:t xml:space="preserve">	3</w:t>
+        <w:t>1.  Scope — what's in and out of Phase 1</w:t>
+      </w:r>
+      <w:r>
+        <w:tab/>
+        <w:t>3</w:t>
       </w:r>
     </w:p>
     <w:p>
@@ -108,18 +100,11 @@
         <w:spacing w:after="100"/>
       </w:pPr>
       <w:r>
-        <w:rPr>
-          <w:sz w:val="22"/>
-          <w:szCs w:val="22"/>
-        </w:rPr>
-        <w:t xml:space="preserve">2.  Core concepts</w:t>
-      </w:r>
-      <w:r>
-        <w:rPr>
-          <w:sz w:val="22"/>
-          <w:szCs w:val="22"/>
-        </w:rPr>
-        <w:t xml:space="preserve">	3</w:t>
+        <w:t>2.  Core concepts</w:t>
+      </w:r>
+      <w:r>
+        <w:tab/>
+        <w:t>3</w:t>
       </w:r>
     </w:p>
     <w:p>
@@ -130,18 +115,11 @@
         <w:spacing w:after="100"/>
       </w:pPr>
       <w:r>
-        <w:rPr>
-          <w:sz w:val="22"/>
-          <w:szCs w:val="22"/>
-        </w:rPr>
-        <w:t xml:space="preserve">3.  The pipeline</w:t>
-      </w:r>
-      <w:r>
-        <w:rPr>
-          <w:sz w:val="22"/>
-          <w:szCs w:val="22"/>
-        </w:rPr>
-        <w:t xml:space="preserve">	4</w:t>
+        <w:t>3.  The pipeline</w:t>
+      </w:r>
+      <w:r>
+        <w:tab/>
+        <w:t>4</w:t>
       </w:r>
     </w:p>
     <w:p>
@@ -152,18 +130,11 @@
         <w:spacing w:after="100"/>
       </w:pPr>
       <w:r>
-        <w:rPr>
-          <w:sz w:val="22"/>
-          <w:szCs w:val="22"/>
-        </w:rPr>
-        <w:t xml:space="preserve">4.  Job Evaluation — workflow</w:t>
-      </w:r>
-      <w:r>
-        <w:rPr>
-          <w:sz w:val="22"/>
-          <w:szCs w:val="22"/>
-        </w:rPr>
-        <w:t xml:space="preserve">	4</w:t>
+        <w:t>4.  Job Evaluation — workflow</w:t>
+      </w:r>
+      <w:r>
+        <w:tab/>
+        <w:t>4</w:t>
       </w:r>
     </w:p>
     <w:p>
@@ -174,18 +145,11 @@
         <w:spacing w:after="100"/>
       </w:pPr>
       <w:r>
-        <w:rPr>
-          <w:sz w:val="22"/>
-          <w:szCs w:val="22"/>
-        </w:rPr>
-        <w:t xml:space="preserve">5.  Grading Structure — workflow</w:t>
-      </w:r>
-      <w:r>
-        <w:rPr>
-          <w:sz w:val="22"/>
-          <w:szCs w:val="22"/>
-        </w:rPr>
-        <w:t xml:space="preserve">	6</w:t>
+        <w:t>5.  Grading Structure — workflow</w:t>
+      </w:r>
+      <w:r>
+        <w:tab/>
+        <w:t>6</w:t>
       </w:r>
     </w:p>
     <w:p>
@@ -196,18 +160,11 @@
         <w:spacing w:after="100"/>
       </w:pPr>
       <w:r>
-        <w:rPr>
-          <w:sz w:val="22"/>
-          <w:szCs w:val="22"/>
-        </w:rPr>
-        <w:t xml:space="preserve">6.  Salary Builder — workflow</w:t>
-      </w:r>
-      <w:r>
-        <w:rPr>
-          <w:sz w:val="22"/>
-          <w:szCs w:val="22"/>
-        </w:rPr>
-        <w:t xml:space="preserve">	7</w:t>
+        <w:t>6.  Salary Builder — workflow</w:t>
+      </w:r>
+      <w:r>
+        <w:tab/>
+        <w:t>7</w:t>
       </w:r>
     </w:p>
     <w:p>
@@ -218,18 +175,11 @@
         <w:spacing w:after="100"/>
       </w:pPr>
       <w:r>
-        <w:rPr>
-          <w:sz w:val="22"/>
-          <w:szCs w:val="22"/>
-        </w:rPr>
-        <w:t xml:space="preserve">7.  Data model</w:t>
-      </w:r>
-      <w:r>
-        <w:rPr>
-          <w:sz w:val="22"/>
-          <w:szCs w:val="22"/>
-        </w:rPr>
-        <w:t xml:space="preserve">	8</w:t>
+        <w:t>7.  Data model</w:t>
+      </w:r>
+      <w:r>
+        <w:tab/>
+        <w:t>8</w:t>
       </w:r>
     </w:p>
     <w:p>
@@ -240,18 +190,11 @@
         <w:spacing w:after="100"/>
       </w:pPr>
       <w:r>
-        <w:rPr>
-          <w:sz w:val="22"/>
-          <w:szCs w:val="22"/>
-        </w:rPr>
-        <w:t xml:space="preserve">8.  Calibration back-test (the gate)</w:t>
-      </w:r>
-      <w:r>
-        <w:rPr>
-          <w:sz w:val="22"/>
-          <w:szCs w:val="22"/>
-        </w:rPr>
-        <w:t xml:space="preserve">	9</w:t>
+        <w:t>8.  Calibration back-test (the gate)</w:t>
+      </w:r>
+      <w:r>
+        <w:tab/>
+        <w:t>9</w:t>
       </w:r>
     </w:p>
     <w:p>
@@ -262,18 +205,11 @@
         <w:spacing w:after="100"/>
       </w:pPr>
       <w:r>
-        <w:rPr>
-          <w:sz w:val="22"/>
-          <w:szCs w:val="22"/>
-        </w:rPr>
-        <w:t xml:space="preserve">9.  El-Delta defaults &amp; open items</w:t>
-      </w:r>
-      <w:r>
-        <w:rPr>
-          <w:sz w:val="22"/>
-          <w:szCs w:val="22"/>
-        </w:rPr>
-        <w:t xml:space="preserve">	9</w:t>
+        <w:t>9.  El-Delta defaults &amp; open items</w:t>
+      </w:r>
+      <w:r>
+        <w:tab/>
+        <w:t>9</w:t>
       </w:r>
     </w:p>
     <w:p>
@@ -286,12 +222,21 @@
         <w:pStyle w:val="Heading1"/>
       </w:pPr>
       <w:r>
-        <w:t xml:space="preserve">1. Scope — What's In and Out of Phase 1</w:t>
-      </w:r>
-    </w:p>
-    <w:p>
-      <w:pPr>
-        <w:spacing w:after="140" w:line="276"/>
+        <w:lastRenderedPageBreak/>
+        <w:t xml:space="preserve">1. Scope — What's </w:t>
+      </w:r>
+      <w:proofErr w:type="gramStart"/>
+      <w:r>
+        <w:t>In</w:t>
+      </w:r>
+      <w:proofErr w:type="gramEnd"/>
+      <w:r>
+        <w:t xml:space="preserve"> and Out of Phase 1</w:t>
+      </w:r>
+    </w:p>
+    <w:p>
+      <w:pPr>
+        <w:spacing w:after="140" w:line="276" w:lineRule="auto"/>
       </w:pPr>
       <w:r>
         <w:t xml:space="preserve">Phase 1 is the </w:t>
@@ -301,7 +246,7 @@
           <w:b/>
           <w:bCs/>
         </w:rPr>
-        <w:t xml:space="preserve">Job &amp; Reward Design trio</w:t>
+        <w:t>Job &amp; Reward Design trio</w:t>
       </w:r>
       <w:r>
         <w:t xml:space="preserve">: Job Evaluation → Grading Structure → Salary Builder. It is </w:t>
@@ -311,7 +256,7 @@
           <w:b/>
           <w:bCs/>
         </w:rPr>
-        <w:t xml:space="preserve">consulting-led</w:t>
+        <w:t>consulting-led</w:t>
       </w:r>
       <w:r>
         <w:t xml:space="preserve"> and </w:t>
@@ -321,22 +266,30 @@
           <w:b/>
           <w:bCs/>
         </w:rPr>
-        <w:t xml:space="preserve">design-time</w:t>
-      </w:r>
-      <w:r>
-        <w:t xml:space="preserve">: its core deliverable — a defensible grade and salary structure — needs no employee data. That is what lets it sell as a consulting engagement without a Payroll product underneath it.</w:t>
-      </w:r>
-    </w:p>
-    <w:p>
-      <w:pPr>
-        <w:spacing w:after="140" w:line="276"/>
-      </w:pPr>
-      <w:r>
-        <w:rPr>
-          <w:b/>
-          <w:bCs/>
-        </w:rPr>
-        <w:t xml:space="preserve">In scope:</w:t>
+        <w:t>design-time</w:t>
+      </w:r>
+      <w:r>
+        <w:t xml:space="preserve">: its core deliverable — a defensible grade and salary structure — needs no employee data. That is what lets it sell as a consulting engagement without a </w:t>
+      </w:r>
+      <w:proofErr w:type="gramStart"/>
+      <w:r>
+        <w:t>Payroll</w:t>
+      </w:r>
+      <w:proofErr w:type="gramEnd"/>
+      <w:r>
+        <w:t xml:space="preserve"> product underneath it.</w:t>
+      </w:r>
+    </w:p>
+    <w:p>
+      <w:pPr>
+        <w:spacing w:after="140" w:line="276" w:lineRule="auto"/>
+      </w:pPr>
+      <w:r>
+        <w:rPr>
+          <w:b/>
+          <w:bCs/>
+        </w:rPr>
+        <w:t>In scope:</w:t>
       </w:r>
     </w:p>
     <w:p>
@@ -346,10 +299,10 @@
           <w:ilvl w:val="0"/>
           <w:numId w:val="2"/>
         </w:numPr>
-        <w:spacing w:after="90" w:line="276"/>
-      </w:pPr>
-      <w:r>
-        <w:t xml:space="preserve">Configurable, versioned job-evaluation engine (point-factor preset) with an audit trail.</w:t>
+        <w:spacing w:after="90" w:line="276" w:lineRule="auto"/>
+      </w:pPr>
+      <w:r>
+        <w:t>Configurable, versioned job-evaluation engine (point-factor preset) with an audit trail.</w:t>
       </w:r>
     </w:p>
     <w:p>
@@ -359,10 +312,10 @@
           <w:ilvl w:val="0"/>
           <w:numId w:val="2"/>
         </w:numPr>
-        <w:spacing w:after="90" w:line="276"/>
-      </w:pPr>
-      <w:r>
-        <w:t xml:space="preserve">Grading structure: grades, the level × family grid, and where career-path / promotion-progression rules attach.</w:t>
+        <w:spacing w:after="90" w:line="276" w:lineRule="auto"/>
+      </w:pPr>
+      <w:r>
+        <w:t>Grading structure: grades, the level × family grid, and where career-path / promotion-progression rules attach.</w:t>
       </w:r>
     </w:p>
     <w:p>
@@ -372,10 +325,10 @@
           <w:ilvl w:val="0"/>
           <w:numId w:val="2"/>
         </w:numPr>
-        <w:spacing w:after="90" w:line="276"/>
-      </w:pPr>
-      <w:r>
-        <w:t xml:space="preserve">Salary structure: market-data import, positioning per family, bands at 67% spread, 25% overlap.</w:t>
+        <w:spacing w:after="90" w:line="276" w:lineRule="auto"/>
+      </w:pPr>
+      <w:r>
+        <w:t>Salary structure: market-data import, positioning per family, bands at 67% spread, 25% overlap.</w:t>
       </w:r>
     </w:p>
     <w:p>
@@ -385,22 +338,22 @@
           <w:ilvl w:val="0"/>
           <w:numId w:val="2"/>
         </w:numPr>
-        <w:spacing w:after="90" w:line="276"/>
-      </w:pPr>
-      <w:r>
-        <w:t xml:space="preserve">Standalone design output, plus an integrated analysis layer (compa-ratio, internal equity) when real salaries are imported.</w:t>
-      </w:r>
-    </w:p>
-    <w:p>
-      <w:pPr>
-        <w:spacing w:after="140" w:line="276"/>
-      </w:pPr>
-      <w:r>
-        <w:rPr>
-          <w:b/>
-          <w:bCs/>
-        </w:rPr>
-        <w:t xml:space="preserve">Out of scope (later phases), but the foundation is laid now:</w:t>
+        <w:spacing w:after="90" w:line="276" w:lineRule="auto"/>
+      </w:pPr>
+      <w:r>
+        <w:t>Standalone design output, plus an integrated analysis layer (compa-ratio, internal equity) when real salaries are imported.</w:t>
+      </w:r>
+    </w:p>
+    <w:p>
+      <w:pPr>
+        <w:spacing w:after="140" w:line="276" w:lineRule="auto"/>
+      </w:pPr>
+      <w:r>
+        <w:rPr>
+          <w:b/>
+          <w:bCs/>
+        </w:rPr>
+        <w:t>Out of scope (later phases), but the foundation is laid now:</w:t>
       </w:r>
     </w:p>
     <w:p>
@@ -410,7 +363,7 @@
           <w:ilvl w:val="0"/>
           <w:numId w:val="2"/>
         </w:numPr>
-        <w:spacing w:after="90" w:line="276"/>
+        <w:spacing w:after="90" w:line="276" w:lineRule="auto"/>
       </w:pPr>
       <w:r>
         <w:rPr>
@@ -420,7 +373,7 @@
         <w:t xml:space="preserve">Promotion workflow — </w:t>
       </w:r>
       <w:r>
-        <w:t xml:space="preserve">Phase 2/3. It needs performance ratings (Performance product) and operational personnel data. Phase 1 only builds the grades, establishment, and bands it will later run on.</w:t>
+        <w:t>Phase 2/3. It needs performance ratings (Performance product) and operational personnel data. Phase 1 only builds the grades, establishment, and bands it will later run on.</w:t>
       </w:r>
     </w:p>
     <w:p>
@@ -430,7 +383,7 @@
           <w:ilvl w:val="0"/>
           <w:numId w:val="2"/>
         </w:numPr>
-        <w:spacing w:after="90" w:line="276"/>
+        <w:spacing w:after="90" w:line="276" w:lineRule="auto"/>
       </w:pPr>
       <w:r>
         <w:rPr>
@@ -440,7 +393,7 @@
         <w:t xml:space="preserve">Live payroll integration — </w:t>
       </w:r>
       <w:r>
-        <w:t xml:space="preserve">Phase 1 uses a point-in-time salary snapshot via CSV, not a live feed.</w:t>
+        <w:t>Phase 1 uses a point-in-time salary snapshot via CSV, not a live feed.</w:t>
       </w:r>
     </w:p>
     <w:p>
@@ -450,7 +403,7 @@
           <w:ilvl w:val="0"/>
           <w:numId w:val="2"/>
         </w:numPr>
-        <w:spacing w:after="90" w:line="276"/>
+        <w:spacing w:after="90" w:line="276" w:lineRule="auto"/>
       </w:pPr>
       <w:r>
         <w:rPr>
@@ -460,7 +413,7 @@
         <w:t xml:space="preserve">Performance, Goals, Analytics — </w:t>
       </w:r>
       <w:r>
-        <w:t xml:space="preserve">downstream consumers; not built now, but not precluded (events and shared spines are planned for).</w:t>
+        <w:t>downstream consumers; not built now, but not precluded (events and shared spines are planned for).</w:t>
       </w:r>
     </w:p>
     <w:p>
@@ -468,15 +421,15 @@
         <w:pStyle w:val="Heading1"/>
       </w:pPr>
       <w:r>
-        <w:t xml:space="preserve">2. Core Concepts</w:t>
-      </w:r>
-    </w:p>
-    <w:p>
-      <w:pPr>
-        <w:spacing w:after="140" w:line="276"/>
-      </w:pPr>
-      <w:r>
-        <w:t xml:space="preserve">The load-bearing ideas the workflows and data model rest on. Get these right and the rest follows.</w:t>
+        <w:t>2. Core Concepts</w:t>
+      </w:r>
+    </w:p>
+    <w:p>
+      <w:pPr>
+        <w:spacing w:after="140" w:line="276" w:lineRule="auto"/>
+      </w:pPr>
+      <w:r>
+        <w:t>The load-bearing ideas the workflows and data model rest on. Get these right and the rest follows.</w:t>
       </w:r>
     </w:p>
     <w:p>
@@ -484,12 +437,12 @@
         <w:pStyle w:val="Heading2"/>
       </w:pPr>
       <w:r>
-        <w:t xml:space="preserve">Job vs. Position vs. Employee</w:t>
-      </w:r>
-    </w:p>
-    <w:p>
-      <w:pPr>
-        <w:spacing w:after="140" w:line="276"/>
+        <w:t>Job vs. Position vs. Employee</w:t>
+      </w:r>
+    </w:p>
+    <w:p>
+      <w:pPr>
+        <w:spacing w:after="140" w:line="276" w:lineRule="auto"/>
       </w:pPr>
       <w:r>
         <w:t xml:space="preserve">Three separate things, never merged: a </w:t>
@@ -499,7 +452,7 @@
           <w:b/>
           <w:bCs/>
         </w:rPr>
-        <w:t xml:space="preserve">Job</w:t>
+        <w:t>Job</w:t>
       </w:r>
       <w:r>
         <w:t xml:space="preserve"> is a role definition (“Senior Accountant”) — the thing you </w:t>
@@ -509,7 +462,7 @@
           <w:b/>
           <w:bCs/>
         </w:rPr>
-        <w:t xml:space="preserve">evaluate</w:t>
+        <w:t>evaluate</w:t>
       </w:r>
       <w:r>
         <w:t xml:space="preserve">; a </w:t>
@@ -519,7 +472,7 @@
           <w:b/>
           <w:bCs/>
         </w:rPr>
-        <w:t xml:space="preserve">Position</w:t>
+        <w:t>Position</w:t>
       </w:r>
       <w:r>
         <w:t xml:space="preserve"> is a specific seat (“…Cairo Finance, slot 3”) — the thing the establishment </w:t>
@@ -529,7 +482,7 @@
           <w:b/>
           <w:bCs/>
         </w:rPr>
-        <w:t xml:space="preserve">counts</w:t>
+        <w:t>counts</w:t>
       </w:r>
       <w:r>
         <w:t xml:space="preserve">; an </w:t>
@@ -539,7 +492,7 @@
           <w:b/>
           <w:bCs/>
         </w:rPr>
-        <w:t xml:space="preserve">Employee</w:t>
+        <w:t>Employee</w:t>
       </w:r>
       <w:r>
         <w:t xml:space="preserve"> is a person — the one you </w:t>
@@ -549,10 +502,10 @@
           <w:b/>
           <w:bCs/>
         </w:rPr>
-        <w:t xml:space="preserve">pay</w:t>
-      </w:r>
-      <w:r>
-        <w:t xml:space="preserve">. You evaluate jobs, count positions, pay employees. Position-control (the open-box promotion gate) only works if these stay distinct.</w:t>
+        <w:t>pay</w:t>
+      </w:r>
+      <w:r>
+        <w:t>. You evaluate jobs, count positions, pay employees. Position-control (the open-box promotion gate) only works if these stay distinct.</w:t>
       </w:r>
     </w:p>
     <w:p>
@@ -560,22 +513,22 @@
         <w:pStyle w:val="Heading2"/>
       </w:pPr>
       <w:r>
-        <w:t xml:space="preserve">Methodology as data, and versioning</w:t>
-      </w:r>
-    </w:p>
-    <w:p>
-      <w:pPr>
-        <w:spacing w:after="140" w:line="276"/>
-      </w:pPr>
-      <w:r>
-        <w:t xml:space="preserve">The evaluation methodology — factors, the questionnaire, answer points, score-to-grade thresholds — is </w:t>
-      </w:r>
-      <w:r>
-        <w:rPr>
-          <w:b/>
-          <w:bCs/>
-        </w:rPr>
-        <w:t xml:space="preserve">configuration data, not code</w:t>
+        <w:t>Methodology as data, and versioning</w:t>
+      </w:r>
+    </w:p>
+    <w:p>
+      <w:pPr>
+        <w:spacing w:after="140" w:line="276" w:lineRule="auto"/>
+      </w:pPr>
+      <w:r>
+        <w:t xml:space="preserve">The evaluation methodology — factors and their weights, the questionnaire, answer ratings, grade score-ranges — is </w:t>
+      </w:r>
+      <w:r>
+        <w:rPr>
+          <w:b/>
+          <w:bCs/>
+        </w:rPr>
+        <w:t>configuration data, not code</w:t>
       </w:r>
       <w:r>
         <w:t xml:space="preserve">. “Point-factor” is a seeded set of these rows; one engine runs them. The methodology is </w:t>
@@ -585,10 +538,14 @@
           <w:b/>
           <w:bCs/>
         </w:rPr>
-        <w:t xml:space="preserve">versioned</w:t>
-      </w:r>
-      <w:r>
-        <w:t xml:space="preserve">: every evaluation pins the exact version it used, so re-tuning the weights publishes a v2 and leaves already-evaluated jobs pointing safely at v1. Nothing is silently re-graded.</w:t>
+        <w:t>versioned</w:t>
+      </w:r>
+      <w:r>
+        <w:t xml:space="preserve">: every evaluation pins the exact </w:t>
+      </w:r>
+      <w:r>
+        <w:lastRenderedPageBreak/>
+        <w:t>version it used, so re-tuning the weights publishes a v2 and leaves already-evaluated jobs pointing safely at v1. Nothing is silently re-graded.</w:t>
       </w:r>
     </w:p>
     <w:p>
@@ -596,12 +553,12 @@
         <w:pStyle w:val="Heading2"/>
       </w:pPr>
       <w:r>
-        <w:t xml:space="preserve">The audit trail</w:t>
-      </w:r>
-    </w:p>
-    <w:p>
-      <w:pPr>
-        <w:spacing w:after="140" w:line="276"/>
+        <w:t>The audit trail</w:t>
+      </w:r>
+    </w:p>
+    <w:p>
+      <w:pPr>
+        <w:spacing w:after="140" w:line="276" w:lineRule="auto"/>
       </w:pPr>
       <w:r>
         <w:t xml:space="preserve">Every answer chosen in an evaluation is stored as an immutable row carrying the points it was worth. Corrections happen by creating a </w:t>
@@ -611,7 +568,7 @@
           <w:b/>
           <w:bCs/>
         </w:rPr>
-        <w:t xml:space="preserve">new</w:t>
+        <w:t>new</w:t>
       </w:r>
       <w:r>
         <w:t xml:space="preserve"> evaluation, never by editing history. Those rows are the audit trail: a grade traces back to the exact answers a named evaluator picked under a specific methodology version — the defensibility that is the actual product in a consulting engagement.</w:t>
@@ -622,12 +579,12 @@
         <w:pStyle w:val="Heading2"/>
       </w:pPr>
       <w:r>
-        <w:t xml:space="preserve">Standalone vs. integrated</w:t>
-      </w:r>
-    </w:p>
-    <w:p>
-      <w:pPr>
-        <w:spacing w:after="140" w:line="276"/>
+        <w:t>Standalone vs. integrated</w:t>
+      </w:r>
+    </w:p>
+    <w:p>
+      <w:pPr>
+        <w:spacing w:after="140" w:line="276" w:lineRule="auto"/>
       </w:pPr>
       <w:r>
         <w:t xml:space="preserve">Each product has honest standalone value and gets richer when siblings are present. Job Evaluation alone proposes generic grades; with Grading Structure it maps onto El-Delta's real grades. Salary Builder alone designs bands; with real salaries imported it computes compa-ratio and equity. The rule: </w:t>
@@ -637,7 +594,7 @@
           <w:b/>
           <w:bCs/>
         </w:rPr>
-        <w:t xml:space="preserve">own your data, pull from siblings if present, fall back gracefully if not.</w:t>
+        <w:t>own your data, pull from siblings if present, fall back gracefully if not.</w:t>
       </w:r>
     </w:p>
     <w:p>
@@ -645,12 +602,12 @@
         <w:pStyle w:val="Heading2"/>
       </w:pPr>
       <w:r>
-        <w:t xml:space="preserve">Families are nullable, added in the design phase</w:t>
-      </w:r>
-    </w:p>
-    <w:p>
-      <w:pPr>
-        <w:spacing w:after="140" w:line="276"/>
+        <w:t>Families are nullable, added in the design phase</w:t>
+      </w:r>
+    </w:p>
+    <w:p>
+      <w:pPr>
+        <w:spacing w:after="140" w:line="276" w:lineRule="auto"/>
       </w:pPr>
       <w:r>
         <w:t xml:space="preserve">A job needs only a </w:t>
@@ -660,7 +617,7 @@
           <w:b/>
           <w:bCs/>
         </w:rPr>
-        <w:t xml:space="preserve">level</w:t>
+        <w:t>level</w:t>
       </w:r>
       <w:r>
         <w:t xml:space="preserve"> to be evaluated and scored; its </w:t>
@@ -670,10 +627,18 @@
           <w:b/>
           <w:bCs/>
         </w:rPr>
-        <w:t xml:space="preserve">family</w:t>
-      </w:r>
-      <w:r>
-        <w:t xml:space="preserve"> is optional and assigned later when families are defined. So El-Delta can start with its five levels and no families, run evaluations, and place jobs on the horizontal axis once families exist. Family is nullable and editable everywhere — no feature may assume it is set.</w:t>
+        <w:t>family</w:t>
+      </w:r>
+      <w:r>
+        <w:t xml:space="preserve"> is optional and assigned later when families are defined. </w:t>
+      </w:r>
+      <w:proofErr w:type="gramStart"/>
+      <w:r>
+        <w:t>So</w:t>
+      </w:r>
+      <w:proofErr w:type="gramEnd"/>
+      <w:r>
+        <w:t xml:space="preserve"> El-Delta can start with its five levels and no families, run evaluations, and place jobs on the horizontal axis once families exist. Family is nullable and editable everywhere — no feature may assume it is set.</w:t>
       </w:r>
     </w:p>
     <w:p>
@@ -681,15 +646,15 @@
         <w:pStyle w:val="Heading2"/>
       </w:pPr>
       <w:r>
-        <w:t xml:space="preserve">End-to-end traceability</w:t>
-      </w:r>
-    </w:p>
-    <w:p>
-      <w:pPr>
-        <w:spacing w:after="140" w:line="276"/>
-      </w:pPr>
-      <w:r>
-        <w:t xml:space="preserve">The chain runs both ways: a salary band → its grade → the score → the specific questionnaire answers → the evaluator and methodology version. “Here is exactly why this job sits in this band” is the through-line of all three products, and the antidote to favoritism concerns in the market.</w:t>
+        <w:t>End-to-end traceability</w:t>
+      </w:r>
+    </w:p>
+    <w:p>
+      <w:pPr>
+        <w:spacing w:after="140" w:line="276" w:lineRule="auto"/>
+      </w:pPr>
+      <w:r>
+        <w:t>The chain runs both ways: a salary band → its grade → the score → the specific questionnaire answers → the evaluator and methodology version. “Here is exactly why this job sits in this band” is the through-line of all three products, and the antidote to favoritism concerns in the market.</w:t>
       </w:r>
     </w:p>
     <w:p>
@@ -697,27 +662,38 @@
         <w:pStyle w:val="Heading1"/>
       </w:pPr>
       <w:r>
-        <w:t xml:space="preserve">3. The Pipeline</w:t>
-      </w:r>
-    </w:p>
-    <w:p>
-      <w:pPr>
-        <w:spacing w:after="140" w:line="276"/>
-      </w:pPr>
-      <w:r>
-        <w:t xml:space="preserve">The trio is one continuous flow: a job comes in, a defensible salary band comes out. Each product hands its output to the next.</w:t>
-      </w:r>
-    </w:p>
-    <w:p>
-      <w:pPr>
-        <w:spacing w:after="40" w:before="120"/>
+        <w:t>3. The Pipeline</w:t>
+      </w:r>
+    </w:p>
+    <w:p>
+      <w:pPr>
+        <w:spacing w:after="140" w:line="276" w:lineRule="auto"/>
+      </w:pPr>
+      <w:r>
+        <w:t xml:space="preserve">The trio is one continuous flow: a job comes </w:t>
+      </w:r>
+      <w:proofErr w:type="gramStart"/>
+      <w:r>
+        <w:t>in,</w:t>
+      </w:r>
+      <w:proofErr w:type="gramEnd"/>
+      <w:r>
+        <w:t xml:space="preserve"> a defensible salary band comes out. Each product hands its output to the next.</w:t>
+      </w:r>
+    </w:p>
+    <w:p>
+      <w:pPr>
+        <w:spacing w:before="120" w:after="40"/>
         <w:jc w:val="center"/>
       </w:pPr>
       <w:r>
+        <w:rPr>
+          <w:noProof/>
+        </w:rPr>
         <w:drawing>
-          <wp:inline distT="0" distB="0" distL="0" distR="0">
+          <wp:inline distT="0" distB="0" distL="0" distR="0" wp14:anchorId="437A60CB" wp14:editId="48E02C7A">
             <wp:extent cx="5334000" cy="1181100"/>
-            <wp:effectExtent t="0" r="0" b="0" l="0"/>
+            <wp:effectExtent l="0" t="0" r="0" b="0"/>
             <wp:docPr id="1" name="Job Evaluation scores jobs, Grading Structure organizes them into grades, Salary Builder prices the grades" descr="Job Evaluation scores jobs, Grading Structure organizes them into grades, Salary Builder prices the grades" title="Job Evaluation scores jobs, Grading Structure organizes them into grades, Salary Builder prices the grades"/>
             <wp:cNvGraphicFramePr>
               <a:graphicFrameLocks xmlns:a="http://schemas.openxmlformats.org/drawingml/2006/main" noChangeAspect="1"/>
@@ -726,13 +702,13 @@
               <a:graphicData uri="http://schemas.openxmlformats.org/drawingml/2006/picture">
                 <pic:pic xmlns:pic="http://schemas.openxmlformats.org/drawingml/2006/picture">
                   <pic:nvPicPr>
-                    <pic:cNvPr id="0" name="" descr=""/>
+                    <pic:cNvPr id="0" name=""/>
                     <pic:cNvPicPr>
                       <a:picLocks noChangeAspect="1" noChangeArrowheads="1"/>
                     </pic:cNvPicPr>
                   </pic:nvPicPr>
                   <pic:blipFill>
-                    <a:blip r:embed="rId9" cstate="none"/>
+                    <a:blip r:embed="rId7"/>
                     <a:srcRect/>
                     <a:stretch>
                       <a:fillRect/>
@@ -767,7 +743,7 @@
           <w:sz w:val="18"/>
           <w:szCs w:val="18"/>
         </w:rPr>
-        <w:t xml:space="preserve">Score → grades → bands. One pipeline, three sellable products.</w:t>
+        <w:t>Score → grades → bands. One pipeline, three sellable products.</w:t>
       </w:r>
     </w:p>
     <w:p>
@@ -775,28 +751,32 @@
         <w:pStyle w:val="Heading1"/>
       </w:pPr>
       <w:r>
-        <w:t xml:space="preserve">4. Job Evaluation — Workflow</w:t>
-      </w:r>
-    </w:p>
-    <w:p>
-      <w:pPr>
-        <w:spacing w:after="140" w:line="276"/>
-      </w:pPr>
-      <w:r>
-        <w:t xml:space="preserve">Job Evaluation is first because everything downstream needs the score. It turns a job into a defensible grade recommendation.</w:t>
-      </w:r>
-    </w:p>
-    <w:p>
-      <w:pPr>
-        <w:spacing w:after="40" w:before="120"/>
+        <w:t>4. Job Evaluation — Workflow</w:t>
+      </w:r>
+    </w:p>
+    <w:p>
+      <w:pPr>
+        <w:spacing w:after="140" w:line="276" w:lineRule="auto"/>
+      </w:pPr>
+      <w:r>
+        <w:lastRenderedPageBreak/>
+        <w:t>Job Evaluation is first because everything downstream needs the score. It turns a job into a defensible grade recommendation.</w:t>
+      </w:r>
+    </w:p>
+    <w:p>
+      <w:pPr>
+        <w:spacing w:before="120" w:after="40"/>
         <w:jc w:val="center"/>
       </w:pPr>
       <w:r>
+        <w:rPr>
+          <w:noProof/>
+        </w:rPr>
         <w:drawing>
-          <wp:inline distT="0" distB="0" distL="0" distR="0">
+          <wp:inline distT="0" distB="0" distL="0" distR="0" wp14:anchorId="5B173144" wp14:editId="23C9DB97">
             <wp:extent cx="4095750" cy="2828925"/>
-            <wp:effectExtent t="0" r="0" b="0" l="0"/>
-            <wp:docPr id="1" name="Answer questionnaire, map answers to factor points, sum to total, score to grade, recommended grade with audit trail, under a pinned methodology version" descr="Answer questionnaire, map answers to factor points, sum to total, score to grade, recommended grade with audit trail, under a pinned methodology version" title="Answer questionnaire, map answers to factor points, sum to total, score to grade, recommended grade with audit trail, under a pinned methodology version"/>
+            <wp:effectExtent l="0" t="0" r="0" b="0"/>
+            <wp:docPr id="50771534" name="Answer questionnaire, map answers to factor points, sum to total, score to grade, recommended grade with audit trail, under a pinned methodology version" descr="Answer questionnaire, map answers to factor points, sum to total, score to grade, recommended grade with audit trail, under a pinned methodology version" title="Answer questionnaire, map answers to factor points, sum to total, score to grade, recommended grade with audit trail, under a pinned methodology version"/>
             <wp:cNvGraphicFramePr>
               <a:graphicFrameLocks xmlns:a="http://schemas.openxmlformats.org/drawingml/2006/main" noChangeAspect="1"/>
             </wp:cNvGraphicFramePr>
@@ -804,13 +784,13 @@
               <a:graphicData uri="http://schemas.openxmlformats.org/drawingml/2006/picture">
                 <pic:pic xmlns:pic="http://schemas.openxmlformats.org/drawingml/2006/picture">
                   <pic:nvPicPr>
-                    <pic:cNvPr id="0" name="" descr=""/>
+                    <pic:cNvPr id="0" name=""/>
                     <pic:cNvPicPr>
                       <a:picLocks noChangeAspect="1" noChangeArrowheads="1"/>
                     </pic:cNvPicPr>
                   </pic:nvPicPr>
                   <pic:blipFill>
-                    <a:blip r:embed="rId10" cstate="none"/>
+                    <a:blip r:embed="rId8"/>
                     <a:srcRect/>
                     <a:stretch>
                       <a:fillRect/>
@@ -845,7 +825,7 @@
           <w:sz w:val="18"/>
           <w:szCs w:val="18"/>
         </w:rPr>
-        <w:t xml:space="preserve">Answers → points → total → grade, every step traceable, under a pinned version.</w:t>
+        <w:t>Answers → points → total → grade, every step traceable, under a pinned version.</w:t>
       </w:r>
     </w:p>
     <w:p>
@@ -853,55 +833,101 @@
         <w:pStyle w:val="Heading2"/>
       </w:pPr>
       <w:r>
-        <w:t xml:space="preserve">Setting up the methodology (design-time)</w:t>
-      </w:r>
-    </w:p>
-    <w:p>
-      <w:pPr>
-        <w:spacing w:after="140" w:line="276"/>
-      </w:pPr>
-      <w:r>
-        <w:t xml:space="preserve">Before any job is scored, the methodology is configured: its </w:t>
-      </w:r>
-      <w:r>
-        <w:rPr>
-          <w:b/>
-          <w:bCs/>
-        </w:rPr>
-        <w:t xml:space="preserve">factors</w:t>
-      </w:r>
-      <w:r>
-        <w:t xml:space="preserve"> (Know-How, Problem Solving, Accountability…), a </w:t>
-      </w:r>
-      <w:r>
-        <w:rPr>
-          <w:b/>
-          <w:bCs/>
-        </w:rPr>
-        <w:t xml:space="preserve">questionnaire</w:t>
-      </w:r>
-      <w:r>
-        <w:t xml:space="preserve"> of questions per factor, each </w:t>
-      </w:r>
-      <w:r>
-        <w:rPr>
-          <w:b/>
-          <w:bCs/>
-        </w:rPr>
-        <w:t xml:space="preserve">answer option</w:t>
-      </w:r>
-      <w:r>
-        <w:t xml:space="preserve"> carrying fixed points, and a </w:t>
-      </w:r>
-      <w:r>
-        <w:rPr>
-          <w:b/>
-          <w:bCs/>
-        </w:rPr>
-        <w:t xml:space="preserve">grade-mapping</w:t>
-      </w:r>
-      <w:r>
-        <w:t xml:space="preserve"> table (score ranges → grades). This is the methodology work in milestone M1.</w:t>
+        <w:t>Setting up the methodology (design-time)</w:t>
+      </w:r>
+    </w:p>
+    <w:p>
+      <w:pPr>
+        <w:spacing w:after="140" w:line="276" w:lineRule="auto"/>
+      </w:pPr>
+      <w:r>
+        <w:t xml:space="preserve">Before any job is scored, the methodology is configured. The version carries a </w:t>
+      </w:r>
+      <w:r>
+        <w:rPr>
+          <w:b/>
+          <w:bCs/>
+        </w:rPr>
+        <w:t>point budget</w:t>
+      </w:r>
+      <w:r>
+        <w:t xml:space="preserve"> — a floor and a ceiling for the total score (El-Delta's default is 200–1000). Its </w:t>
+      </w:r>
+      <w:r>
+        <w:rPr>
+          <w:b/>
+          <w:bCs/>
+        </w:rPr>
+        <w:t>factors</w:t>
+      </w:r>
+      <w:r>
+        <w:t xml:space="preserve"> (Know-How, Problem Solving, Accountability…) each carry a </w:t>
+      </w:r>
+      <w:r>
+        <w:rPr>
+          <w:b/>
+          <w:bCs/>
+        </w:rPr>
+        <w:t>percentage weight</w:t>
+      </w:r>
+      <w:r>
+        <w:t xml:space="preserve">, and the budget flows down by weight: a factor's points are the budget × its weight, and the factor weights across a version sum to 100%. Inside each factor a </w:t>
+      </w:r>
+      <w:r>
+        <w:rPr>
+          <w:b/>
+          <w:bCs/>
+        </w:rPr>
+        <w:t>questionnaire</w:t>
+      </w:r>
+      <w:r>
+        <w:t xml:space="preserve"> of questions splits that factor's points the same way — each </w:t>
+      </w:r>
+      <w:r>
+        <w:rPr>
+          <w:b/>
+          <w:bCs/>
+        </w:rPr>
+        <w:t>question</w:t>
+      </w:r>
+      <w:r>
+        <w:t xml:space="preserve"> carries a percentage weight of its factor (question weights within a factor sum to 100%), and a question can be </w:t>
+      </w:r>
+      <w:r>
+        <w:rPr>
+          <w:b/>
+          <w:bCs/>
+        </w:rPr>
+        <w:t>required or optional</w:t>
+      </w:r>
+      <w:r>
+        <w:t xml:space="preserve">. Answer options are no longer free-entry points: every question is answered on a </w:t>
+      </w:r>
+      <w:r>
+        <w:rPr>
+          <w:b/>
+          <w:bCs/>
+        </w:rPr>
+        <w:t>unified 1–5 rating</w:t>
+      </w:r>
+      <w:r>
+        <w:t xml:space="preserve"> scale, identical everywhere. </w:t>
+      </w:r>
+      <w:r>
+        <w:t>Finally,</w:t>
+      </w:r>
+      <w:r>
+        <w:t xml:space="preserve"> the version's </w:t>
+      </w:r>
+      <w:r>
+        <w:rPr>
+          <w:b/>
+          <w:bCs/>
+        </w:rPr>
+        <w:t>grades</w:t>
+      </w:r>
+      <w:r>
+        <w:t xml:space="preserve"> are assigned and given score ranges (the score-to-grade mapping). This is the methodology work in milestone M1.</w:t>
       </w:r>
     </w:p>
     <w:p>
@@ -909,12 +935,12 @@
         <w:pStyle w:val="Heading2"/>
       </w:pPr>
       <w:r>
-        <w:t xml:space="preserve">Who authors the questionnaire</w:t>
-      </w:r>
-    </w:p>
-    <w:p>
-      <w:pPr>
-        <w:spacing w:after="140" w:line="276"/>
+        <w:t>Who authors the questionnaire</w:t>
+      </w:r>
+    </w:p>
+    <w:p>
+      <w:pPr>
+        <w:spacing w:after="140" w:line="276" w:lineRule="auto"/>
       </w:pPr>
       <w:r>
         <w:t xml:space="preserve">Two senses of “generate.” </w:t>
@@ -924,17 +950,17 @@
           <w:b/>
           <w:bCs/>
         </w:rPr>
-        <w:t xml:space="preserve">Farouk authors the content</w:t>
-      </w:r>
-      <w:r>
-        <w:t xml:space="preserve"> — the questions, answers, and points are HR methodology, set once per methodology version (and a real differentiator). The </w:t>
-      </w:r>
-      <w:r>
-        <w:rPr>
-          <w:b/>
-          <w:bCs/>
-        </w:rPr>
-        <w:t xml:space="preserve">system generates the screen</w:t>
+        <w:t>Farouk authors the content</w:t>
+      </w:r>
+      <w:r>
+        <w:t xml:space="preserve"> — the questions, answers, the factor and question weights, and the 1–5 rating scale are HR methodology, set once per methodology version (and a real differentiator). The </w:t>
+      </w:r>
+      <w:r>
+        <w:rPr>
+          <w:b/>
+          <w:bCs/>
+        </w:rPr>
+        <w:t>system generates the screen</w:t>
       </w:r>
       <w:r>
         <w:t xml:space="preserve">: because the questionnaire is stored as data, the Angular front-end renders the form dynamically from the current version. The consultant then </w:t>
@@ -944,10 +970,10 @@
           <w:b/>
           <w:bCs/>
         </w:rPr>
-        <w:t xml:space="preserve">answers it per job</w:t>
-      </w:r>
-      <w:r>
-        <w:t xml:space="preserve">. Author once, render many. Any AI assistance stays a suggestion Farouk approves, never an autonomous author.</w:t>
+        <w:t>answers it per job</w:t>
+      </w:r>
+      <w:r>
+        <w:t>. Author once, render many. Any AI assistance stays a suggestion Farouk approves, never an autonomous author.</w:t>
       </w:r>
     </w:p>
     <w:p>
@@ -955,32 +981,56 @@
         <w:pStyle w:val="Heading2"/>
       </w:pPr>
       <w:r>
-        <w:t xml:space="preserve">Scoring</w:t>
-      </w:r>
-    </w:p>
-    <w:p>
-      <w:pPr>
-        <w:spacing w:after="140" w:line="276"/>
-      </w:pPr>
-      <w:r>
-        <w:t xml:space="preserve">Answers map to points by </w:t>
-      </w:r>
-      <w:r>
-        <w:rPr>
-          <w:b/>
-          <w:bCs/>
-        </w:rPr>
-        <w:t xml:space="preserve">simple rule</w:t>
-      </w:r>
-      <w:r>
-        <w:t xml:space="preserve"> (answer X = Y points — the locked decision), the engine sums per-factor subtotals and a total server-side (never trust the browser to compute a grade), and the total falls into a grade range. Scope is four levels (Blue Collar, IC, Supervisory, Managerial); </w:t>
-      </w:r>
-      <w:r>
-        <w:rPr>
-          <w:b/>
-          <w:bCs/>
-        </w:rPr>
-        <w:t xml:space="preserve">C-level is excluded</w:t>
+        <w:t>Scoring</w:t>
+      </w:r>
+    </w:p>
+    <w:p>
+      <w:pPr>
+        <w:spacing w:after="140" w:line="276" w:lineRule="auto"/>
+      </w:pPr>
+      <w:r>
+        <w:t xml:space="preserve">Scoring is weight-driven and computed </w:t>
+      </w:r>
+      <w:r>
+        <w:rPr>
+          <w:b/>
+          <w:bCs/>
+        </w:rPr>
+        <w:t>server-side</w:t>
+      </w:r>
+      <w:r>
+        <w:t xml:space="preserve"> (never trust the browser to compute a grade). Each answered question earns its </w:t>
+      </w:r>
+      <w:r>
+        <w:rPr>
+          <w:b/>
+          <w:bCs/>
+        </w:rPr>
+        <w:t>question points scaled by the chosen rating</w:t>
+      </w:r>
+      <w:r>
+        <w:t xml:space="preserve"> — question points × (rating ÷ 5), so a 5 earns the question's full share and a 1 earns a fifth of it. A </w:t>
+      </w:r>
+      <w:r>
+        <w:lastRenderedPageBreak/>
+        <w:t xml:space="preserve">factor's subtotal is the sum of its question scores, the total is the sum of the factor subtotals, and — because the weights partition a fixed budget — the total stays within the methodology's floor and ceiling, then falls into a grade range. If a question is </w:t>
+      </w:r>
+      <w:r>
+        <w:rPr>
+          <w:b/>
+          <w:bCs/>
+        </w:rPr>
+        <w:t>optional and left unanswered</w:t>
+      </w:r>
+      <w:r>
+        <w:t xml:space="preserve">, its points are redistributed equally across the other questions in the same factor, so skipping one never shrinks the factor. Scope is four levels (Blue Collar, IC, Supervisory, Managerial); </w:t>
+      </w:r>
+      <w:r>
+        <w:rPr>
+          <w:b/>
+          <w:bCs/>
+        </w:rPr>
+        <w:t>C-level is excluded</w:t>
       </w:r>
       <w:r>
         <w:t xml:space="preserve"> — executive pay is market/board-benchmarked above the evaluated structure.</w:t>
@@ -991,12 +1041,58 @@
         <w:pStyle w:val="Heading2"/>
       </w:pPr>
       <w:r>
-        <w:t xml:space="preserve">Job titles are aliases; content is identity</w:t>
-      </w:r>
-    </w:p>
-    <w:p>
-      <w:pPr>
-        <w:spacing w:after="140" w:line="276"/>
+        <w:t>Assigning grades to a version</w:t>
+      </w:r>
+    </w:p>
+    <w:p>
+      <w:pPr>
+        <w:spacing w:after="140" w:line="276" w:lineRule="auto"/>
+      </w:pPr>
+      <w:r>
+        <w:t xml:space="preserve">Grades attach to a version in two steps: first the grades are </w:t>
+      </w:r>
+      <w:r>
+        <w:rPr>
+          <w:b/>
+          <w:bCs/>
+        </w:rPr>
+        <w:t>assigned</w:t>
+      </w:r>
+      <w:r>
+        <w:t xml:space="preserve"> with no score ranges, then the ranges are set — </w:t>
+      </w:r>
+      <w:r>
+        <w:rPr>
+          <w:b/>
+          <w:bCs/>
+        </w:rPr>
+        <w:t>automatically or manually</w:t>
+      </w:r>
+      <w:r>
+        <w:t xml:space="preserve">. Automatic tiling spreads the grades evenly across the point budget with no gaps: with G grades and a budget from min to max, each band is (max − min) ÷ G wide, and grade N (ranked from 1) runs from min + (N − 1) × width up to min + N × width — so every possible score falls into exactly one grade. </w:t>
+      </w:r>
+      <w:r>
+        <w:rPr>
+          <w:b/>
+          <w:bCs/>
+        </w:rPr>
+        <w:t>Manual</w:t>
+      </w:r>
+      <w:r>
+        <w:t xml:space="preserve"> mode lets the consultant set each grade's min and max by hand when even tiling isn't the shape they want — the same nudge-the-defaults principle the salary bands use.</w:t>
+      </w:r>
+    </w:p>
+    <w:p>
+      <w:pPr>
+        <w:pStyle w:val="Heading2"/>
+      </w:pPr>
+      <w:r>
+        <w:t>Job titles are aliases; content is identity</w:t>
+      </w:r>
+    </w:p>
+    <w:p>
+      <w:pPr>
+        <w:spacing w:after="140" w:line="276" w:lineRule="auto"/>
       </w:pPr>
       <w:r>
         <w:t xml:space="preserve">Job titles are unreliable across companies and even within one — El-Delta's “Senior Tech Lead” and another firm's “Senior Specialist Team Lead” may be the same work under different names, or not; the title alone tells you nothing. This is why evaluation scores </w:t>
@@ -1006,7 +1102,7 @@
           <w:b/>
           <w:bCs/>
         </w:rPr>
-        <w:t xml:space="preserve">content, not names</w:t>
+        <w:t>content, not names</w:t>
       </w:r>
       <w:r>
         <w:t xml:space="preserve">: the point total is a content-based identity that makes two differently-named jobs comparable (the same score means equivalent measured work). Reconciling differently-named jobs across companies to shared </w:t>
@@ -1016,7 +1112,7 @@
           <w:b/>
           <w:bCs/>
         </w:rPr>
-        <w:t xml:space="preserve">reference jobs</w:t>
+        <w:t>reference jobs</w:t>
       </w:r>
       <w:r>
         <w:t xml:space="preserve"> is the backbone of the future cross-company benchmark, but it is </w:t>
@@ -1026,7 +1122,7 @@
           <w:b/>
           <w:bCs/>
         </w:rPr>
-        <w:t xml:space="preserve">deferred</w:t>
+        <w:t>deferred</w:t>
       </w:r>
       <w:r>
         <w:t xml:space="preserve"> — Phase 1 is single-tenant and needs no reference-job layer. The seam is left open: company titles are aliases over content-defined jobs, the evaluation score is the match key, and a reference-job link is an additive column when the benchmark phase arrives.</w:t>
@@ -1037,28 +1133,32 @@
         <w:pStyle w:val="Heading1"/>
       </w:pPr>
       <w:r>
-        <w:t xml:space="preserve">5. Grading Structure — Workflow</w:t>
-      </w:r>
-    </w:p>
-    <w:p>
-      <w:pPr>
-        <w:spacing w:after="140" w:line="276"/>
-      </w:pPr>
-      <w:r>
-        <w:t xml:space="preserve">Grading Structure takes scored jobs and builds the skeleton: grades, the grid, and the rules that hang off it.</w:t>
-      </w:r>
-    </w:p>
-    <w:p>
-      <w:pPr>
-        <w:spacing w:after="40" w:before="120"/>
+        <w:t>5. Grading Structure — Workflow</w:t>
+      </w:r>
+    </w:p>
+    <w:p>
+      <w:pPr>
+        <w:spacing w:after="140" w:line="276" w:lineRule="auto"/>
+      </w:pPr>
+      <w:r>
+        <w:t>Grading Structure takes scored jobs and builds the skeleton: grades, the grid, and the rules that hang off it.</w:t>
+      </w:r>
+    </w:p>
+    <w:p>
+      <w:pPr>
+        <w:spacing w:before="120" w:after="40"/>
         <w:jc w:val="center"/>
       </w:pPr>
       <w:r>
+        <w:rPr>
+          <w:noProof/>
+        </w:rPr>
+        <w:lastRenderedPageBreak/>
         <w:drawing>
-          <wp:inline distT="0" distB="0" distL="0" distR="0">
+          <wp:inline distT="0" distB="0" distL="0" distR="0" wp14:anchorId="11F9FA30" wp14:editId="3DFFBE1B">
             <wp:extent cx="4095750" cy="2828925"/>
-            <wp:effectExtent t="0" r="0" b="0" l="0"/>
-            <wp:docPr id="1" name="Evaluated jobs get a grade from their score, are placed in a level-by-family grid, then paths and rules are defined, producing the job architecture" descr="Evaluated jobs get a grade from their score, are placed in a level-by-family grid, then paths and rules are defined, producing the job architecture" title="Evaluated jobs get a grade from their score, are placed in a level-by-family grid, then paths and rules are defined, producing the job architecture"/>
+            <wp:effectExtent l="0" t="0" r="0" b="0"/>
+            <wp:docPr id="663172347" name="Evaluated jobs get a grade from their score, are placed in a level-by-family grid, then paths and rules are defined, producing the job architecture" descr="Evaluated jobs get a grade from their score, are placed in a level-by-family grid, then paths and rules are defined, producing the job architecture" title="Evaluated jobs get a grade from their score, are placed in a level-by-family grid, then paths and rules are defined, producing the job architecture"/>
             <wp:cNvGraphicFramePr>
               <a:graphicFrameLocks xmlns:a="http://schemas.openxmlformats.org/drawingml/2006/main" noChangeAspect="1"/>
             </wp:cNvGraphicFramePr>
@@ -1066,13 +1166,13 @@
               <a:graphicData uri="http://schemas.openxmlformats.org/drawingml/2006/picture">
                 <pic:pic xmlns:pic="http://schemas.openxmlformats.org/drawingml/2006/picture">
                   <pic:nvPicPr>
-                    <pic:cNvPr id="0" name="" descr=""/>
+                    <pic:cNvPr id="0" name=""/>
                     <pic:cNvPicPr>
                       <a:picLocks noChangeAspect="1" noChangeArrowheads="1"/>
                     </pic:cNvPicPr>
                   </pic:nvPicPr>
                   <pic:blipFill>
-                    <a:blip r:embed="rId11" cstate="none"/>
+                    <a:blip r:embed="rId9"/>
                     <a:srcRect/>
                     <a:stretch>
                       <a:fillRect/>
@@ -1107,7 +1207,7 @@
           <w:sz w:val="18"/>
           <w:szCs w:val="18"/>
         </w:rPr>
-        <w:t xml:space="preserve">Jobs become a populated grid — level × family — with paths and rules attached.</w:t>
+        <w:t>Jobs become a populated grid — level × family — with paths and rules attached.</w:t>
       </w:r>
     </w:p>
     <w:p>
@@ -1115,12 +1215,12 @@
         <w:pStyle w:val="Heading2"/>
       </w:pPr>
       <w:r>
-        <w:t xml:space="preserve">Grid, paths, and rules</w:t>
-      </w:r>
-    </w:p>
-    <w:p>
-      <w:pPr>
-        <w:spacing w:after="140" w:line="276"/>
+        <w:t>Grid, paths, and rules</w:t>
+      </w:r>
+    </w:p>
+    <w:p>
+      <w:pPr>
+        <w:spacing w:after="140" w:line="276" w:lineRule="auto"/>
       </w:pPr>
       <w:r>
         <w:t xml:space="preserve">A </w:t>
@@ -1130,7 +1230,7 @@
           <w:b/>
           <w:bCs/>
         </w:rPr>
-        <w:t xml:space="preserve">grade</w:t>
+        <w:t>grade</w:t>
       </w:r>
       <w:r>
         <w:t xml:space="preserve"> comes from the score (via the mapping the methodology owns — Grading reads it, doesn't redefine it). The job is placed in the grid: its </w:t>
@@ -1140,7 +1240,7 @@
           <w:b/>
           <w:bCs/>
         </w:rPr>
-        <w:t xml:space="preserve">level</w:t>
+        <w:t>level</w:t>
       </w:r>
       <w:r>
         <w:t xml:space="preserve"> (one of the five) crossed with its </w:t>
@@ -1150,7 +1250,7 @@
           <w:b/>
           <w:bCs/>
         </w:rPr>
-        <w:t xml:space="preserve">family</w:t>
+        <w:t>family</w:t>
       </w:r>
       <w:r>
         <w:t xml:space="preserve">. Career paths are routes through a family's levels, and the </w:t>
@@ -1160,7 +1260,7 @@
           <w:b/>
           <w:bCs/>
         </w:rPr>
-        <w:t xml:space="preserve">promotion vs. progression</w:t>
+        <w:t>promotion vs. progression</w:t>
       </w:r>
       <w:r>
         <w:t xml:space="preserve"> rules attach here.</w:t>
@@ -1171,7 +1271,7 @@
         <w:pStyle w:val="Heading2"/>
       </w:pPr>
       <w:r>
-        <w:t xml:space="preserve">Promotion vs. progression (definitions)</w:t>
+        <w:t>Promotion vs. progression (definitions)</w:t>
       </w:r>
     </w:p>
     <w:p>
@@ -1181,7 +1281,7 @@
           <w:ilvl w:val="0"/>
           <w:numId w:val="2"/>
         </w:numPr>
-        <w:spacing w:after="90" w:line="276"/>
+        <w:spacing w:after="90" w:line="276" w:lineRule="auto"/>
       </w:pPr>
       <w:r>
         <w:rPr>
@@ -1191,7 +1291,7 @@
         <w:t xml:space="preserve">Progression — </w:t>
       </w:r>
       <w:r>
-        <w:t xml:space="preserve">movement within a grade (same job, more pay), performance-based annual increase inside the band. A quiet comp event.</w:t>
+        <w:t>movement within a grade (same job, more pay), performance-based annual increase inside the band. A quiet comp event.</w:t>
       </w:r>
     </w:p>
     <w:p>
@@ -1201,7 +1301,7 @@
           <w:ilvl w:val="0"/>
           <w:numId w:val="2"/>
         </w:numPr>
-        <w:spacing w:after="90" w:line="276"/>
+        <w:spacing w:after="90" w:line="276" w:lineRule="auto"/>
       </w:pPr>
       <w:r>
         <w:rPr>
@@ -1211,7 +1311,7 @@
         <w:t xml:space="preserve">Promotion — </w:t>
       </w:r>
       <w:r>
-        <w:t xml:space="preserve">movement between grades. Gated by three independent conditions: ≥ 2 years in grade, a rating of Excellent/Very good, and an open box (vacant approved position) in the target grade. Triggers a cascade (new grade → new band → pay adjustment → new competency profile). This is Phase 2/3; Phase 1 only lays its foundation.</w:t>
+        <w:t>movement between grades. Gated by three independent conditions: ≥ 2 years in grade, a rating of Excellent/Very good, and an open box (vacant approved position) in the target grade. Triggers a cascade (new grade → new band → pay adjustment → new competency profile). This is Phase 2/3; Phase 1 only lays its foundation.</w:t>
       </w:r>
     </w:p>
     <w:p>
@@ -1219,12 +1319,12 @@
         <w:pStyle w:val="Heading2"/>
       </w:pPr>
       <w:r>
-        <w:t xml:space="preserve">Position-control / establishment</w:t>
-      </w:r>
-    </w:p>
-    <w:p>
-      <w:pPr>
-        <w:spacing w:after="140" w:line="276"/>
+        <w:t>Position-control / establishment</w:t>
+      </w:r>
+    </w:p>
+    <w:p>
+      <w:pPr>
+        <w:spacing w:after="140" w:line="276" w:lineRule="auto"/>
       </w:pPr>
       <w:r>
         <w:t xml:space="preserve">El-Delta runs a position-controlled model: a fixed number of approved seats per grade per unit. The structure needs an </w:t>
@@ -1234,7 +1334,7 @@
           <w:b/>
           <w:bCs/>
         </w:rPr>
-        <w:t xml:space="preserve">establishment</w:t>
+        <w:t>establishment</w:t>
       </w:r>
       <w:r>
         <w:t xml:space="preserve"> view (approved positions, vacant or filled) so a future promotion can check for an open box. This shape maps recognizably onto government/SOE grade ladders.</w:t>
@@ -1245,28 +1345,32 @@
         <w:pStyle w:val="Heading1"/>
       </w:pPr>
       <w:r>
-        <w:t xml:space="preserve">6. Salary Builder — Workflow</w:t>
-      </w:r>
-    </w:p>
-    <w:p>
-      <w:pPr>
-        <w:spacing w:after="140" w:line="276"/>
-      </w:pPr>
-      <w:r>
-        <w:t xml:space="preserve">Salary Builder prices the grades into bands. Everything down to the band is pure design; employee data only enters for the integrated analysis layer.</w:t>
-      </w:r>
-    </w:p>
-    <w:p>
-      <w:pPr>
-        <w:spacing w:after="40" w:before="120"/>
+        <w:t>6. Salary Builder — Workflow</w:t>
+      </w:r>
+    </w:p>
+    <w:p>
+      <w:pPr>
+        <w:spacing w:after="140" w:line="276" w:lineRule="auto"/>
+      </w:pPr>
+      <w:r>
+        <w:t>Salary Builder prices the grades into bands. Everything down to the band is pure design; employee data only enters for the integrated analysis layer.</w:t>
+      </w:r>
+    </w:p>
+    <w:p>
+      <w:pPr>
+        <w:spacing w:before="120" w:after="40"/>
         <w:jc w:val="center"/>
       </w:pPr>
       <w:r>
+        <w:rPr>
+          <w:noProof/>
+        </w:rPr>
+        <w:lastRenderedPageBreak/>
         <w:drawing>
-          <wp:inline distT="0" distB="0" distL="0" distR="0">
+          <wp:inline distT="0" distB="0" distL="0" distR="0" wp14:anchorId="172CF444" wp14:editId="32A3A21B">
             <wp:extent cx="4095750" cy="3190875"/>
-            <wp:effectExtent t="0" r="0" b="0" l="0"/>
-            <wp:docPr id="1" name="Import market data, set positioning per family, derive midpoint, apply plus-or-minus 25 percent spread, salary band per grade; integrated adds compa-ratio and equity" descr="Import market data, set positioning per family, derive midpoint, apply plus-or-minus 25 percent spread, salary band per grade; integrated adds compa-ratio and equity" title="Import market data, set positioning per family, derive midpoint, apply plus-or-minus 25 percent spread, salary band per grade; integrated adds compa-ratio and equity"/>
+            <wp:effectExtent l="0" t="0" r="0" b="0"/>
+            <wp:docPr id="1404312333" name="Import market data, set positioning per family, derive midpoint, apply plus-or-minus 25 percent spread, salary band per grade; integrated adds compa-ratio and equity" descr="Import market data, set positioning per family, derive midpoint, apply plus-or-minus 25 percent spread, salary band per grade; integrated adds compa-ratio and equity" title="Import market data, set positioning per family, derive midpoint, apply plus-or-minus 25 percent spread, salary band per grade; integrated adds compa-ratio and equity"/>
             <wp:cNvGraphicFramePr>
               <a:graphicFrameLocks xmlns:a="http://schemas.openxmlformats.org/drawingml/2006/main" noChangeAspect="1"/>
             </wp:cNvGraphicFramePr>
@@ -1274,13 +1378,13 @@
               <a:graphicData uri="http://schemas.openxmlformats.org/drawingml/2006/picture">
                 <pic:pic xmlns:pic="http://schemas.openxmlformats.org/drawingml/2006/picture">
                   <pic:nvPicPr>
-                    <pic:cNvPr id="0" name="" descr=""/>
+                    <pic:cNvPr id="0" name=""/>
                     <pic:cNvPicPr>
                       <a:picLocks noChangeAspect="1" noChangeArrowheads="1"/>
                     </pic:cNvPicPr>
                   </pic:nvPicPr>
                   <pic:blipFill>
-                    <a:blip r:embed="rId12" cstate="none"/>
+                    <a:blip r:embed="rId10"/>
                     <a:srcRect/>
                     <a:stretch>
                       <a:fillRect/>
@@ -1315,7 +1419,7 @@
           <w:sz w:val="18"/>
           <w:szCs w:val="18"/>
         </w:rPr>
-        <w:t xml:space="preserve">Market data → positioning → midpoint → 67% band (min 75 / max 125). Integrated mode adds compa-ratio and equity.</w:t>
+        <w:t>Market data → positioning → midpoint → 67% band (min 75 / max 125). Integrated mode adds compa-ratio and equity.</w:t>
       </w:r>
     </w:p>
     <w:p>
@@ -1323,12 +1427,12 @@
         <w:pStyle w:val="Heading2"/>
       </w:pPr>
       <w:r>
-        <w:t xml:space="preserve">Market data</w:t>
-      </w:r>
-    </w:p>
-    <w:p>
-      <w:pPr>
-        <w:spacing w:after="140" w:line="276"/>
+        <w:t>Market data</w:t>
+      </w:r>
+    </w:p>
+    <w:p>
+      <w:pPr>
+        <w:spacing w:after="140" w:line="276" w:lineRule="auto"/>
       </w:pPr>
       <w:r>
         <w:t xml:space="preserve">A point-in-time </w:t>
@@ -1338,7 +1442,7 @@
           <w:b/>
           <w:bCs/>
         </w:rPr>
-        <w:t xml:space="preserve">snapshot</w:t>
+        <w:t>snapshot</w:t>
       </w:r>
       <w:r>
         <w:t xml:space="preserve"> is imported (the locked sourcing model: customer-import v1 → own benchmark later), tagged with the attributes that make it meaningful — </w:t>
@@ -1348,7 +1452,7 @@
           <w:b/>
           <w:bCs/>
         </w:rPr>
-        <w:t xml:space="preserve">geography, industry, company size, and recency</w:t>
+        <w:t>geography, industry, company size, and recency</w:t>
       </w:r>
       <w:r>
         <w:t xml:space="preserve"> (recency especially, given currency and inflation volatility). Each survey row reports the salary distribution as </w:t>
@@ -1358,7 +1462,7 @@
           <w:b/>
           <w:bCs/>
         </w:rPr>
-        <w:t xml:space="preserve">percentiles</w:t>
+        <w:t>percentiles</w:t>
       </w:r>
       <w:r>
         <w:t xml:space="preserve"> — P25, P50 (the median, the typical market rate), P75, and P90 — because pay data is skewed and the median plus quartiles describe it more honestly than an average. The positioning posture is then a choice of which percentile anchors the band: match ≈ target P50, lead ≈ nearer P75, lag ≈ nearer P25.</w:t>
@@ -1366,7 +1470,7 @@
     </w:p>
     <w:p>
       <w:pPr>
-        <w:spacing w:after="140" w:line="276"/>
+        <w:spacing w:after="140" w:line="276" w:lineRule="auto"/>
       </w:pPr>
       <w:r>
         <w:t xml:space="preserve">Market data binds to the </w:t>
@@ -1376,7 +1480,7 @@
           <w:b/>
           <w:bCs/>
         </w:rPr>
-        <w:t xml:space="preserve">job</w:t>
+        <w:t>job</w:t>
       </w:r>
       <w:r>
         <w:t xml:space="preserve"> — the unit the market actually prices (“senior accountant” is both a job and a survey line). </w:t>
@@ -1386,7 +1490,7 @@
           <w:b/>
           <w:bCs/>
         </w:rPr>
-        <w:t xml:space="preserve">Family and level</w:t>
+        <w:t>Family and level</w:t>
       </w:r>
       <w:r>
         <w:t xml:space="preserve"> are the job's coordinates and serve as a </w:t>
@@ -1396,7 +1500,7 @@
           <w:b/>
           <w:bCs/>
         </w:rPr>
-        <w:t xml:space="preserve">fallback grain</w:t>
+        <w:t>fallback grain</w:t>
       </w:r>
       <w:r>
         <w:t xml:space="preserve"> when a survey is coarser than your job list (e.g. “finance roles, IC level” that several jobs share); grade is another fallback. A </w:t>
@@ -1406,7 +1510,7 @@
           <w:b/>
           <w:bCs/>
         </w:rPr>
-        <w:t xml:space="preserve">position</w:t>
+        <w:t>position</w:t>
       </w:r>
       <w:r>
         <w:t xml:space="preserve"> never carries a market price — it inherits its band through job → grade → band — and only the </w:t>
@@ -1416,7 +1520,7 @@
           <w:b/>
           <w:bCs/>
         </w:rPr>
-        <w:t xml:space="preserve">employee</w:t>
+        <w:t>employee</w:t>
       </w:r>
       <w:r>
         <w:t xml:space="preserve"> has an actual salary, compared to the band for compa-ratio.</w:t>
@@ -1427,12 +1531,12 @@
         <w:pStyle w:val="Heading2"/>
       </w:pPr>
       <w:r>
-        <w:t xml:space="preserve">Bands</w:t>
-      </w:r>
-    </w:p>
-    <w:p>
-      <w:pPr>
-        <w:spacing w:after="140" w:line="276"/>
+        <w:t>Bands</w:t>
+      </w:r>
+    </w:p>
+    <w:p>
+      <w:pPr>
+        <w:spacing w:after="140" w:line="276" w:lineRule="auto"/>
       </w:pPr>
       <w:r>
         <w:t xml:space="preserve">Positioning is set </w:t>
@@ -1442,7 +1546,7 @@
           <w:b/>
           <w:bCs/>
         </w:rPr>
-        <w:t xml:space="preserve">per family</w:t>
+        <w:t>per family</w:t>
       </w:r>
       <w:r>
         <w:t xml:space="preserve"> (match-the-market for El-Delta, varying by family). Each grade's </w:t>
@@ -1452,7 +1556,7 @@
           <w:b/>
           <w:bCs/>
         </w:rPr>
-        <w:t xml:space="preserve">midpoint</w:t>
+        <w:t>midpoint</w:t>
       </w:r>
       <w:r>
         <w:t xml:space="preserve"> derives from market × positioning, then the </w:t>
@@ -1462,7 +1566,7 @@
           <w:b/>
           <w:bCs/>
         </w:rPr>
-        <w:t xml:space="preserve">67% spread</w:t>
+        <w:t>67% spread</w:t>
       </w:r>
       <w:r>
         <w:t xml:space="preserve"> (max ÷ min = 1.67) gives min 75%, midpoint 100%, max 125% of midpoint; consecutive midpoints step up by the </w:t>
@@ -1472,7 +1576,7 @@
           <w:b/>
           <w:bCs/>
         </w:rPr>
-        <w:t xml:space="preserve">25% overlap</w:t>
+        <w:t>25% overlap</w:t>
       </w:r>
       <w:r>
         <w:t xml:space="preserve"> (progression). Adjacent grades overlap by design, so a senior person in a lower grade can out-earn a junior in a higher one. Money is stored as exact decimal with an explicit currency — never float.</w:t>
@@ -1483,14 +1587,15 @@
         <w:pStyle w:val="Heading2"/>
       </w:pPr>
       <w:r>
-        <w:t xml:space="preserve">Grade overlap &amp; auto-building the structure</w:t>
-      </w:r>
-    </w:p>
-    <w:p>
-      <w:pPr>
-        <w:spacing w:after="140" w:line="276"/>
-      </w:pPr>
-      <w:r>
+        <w:t>Grade overlap &amp; auto-building the structure</w:t>
+      </w:r>
+    </w:p>
+    <w:p>
+      <w:pPr>
+        <w:spacing w:after="140" w:line="276" w:lineRule="auto"/>
+      </w:pPr>
+      <w:r>
+        <w:lastRenderedPageBreak/>
         <w:t xml:space="preserve">Two controls, defined by Farouk's formulas. </w:t>
       </w:r>
       <w:r>
@@ -1498,7 +1603,7 @@
           <w:b/>
           <w:bCs/>
         </w:rPr>
-        <w:t xml:space="preserve">Spread = (max / min) − 1</w:t>
+        <w:t>Spread = (max / min) − 1</w:t>
       </w:r>
       <w:r>
         <w:t xml:space="preserve"> — the band's width as the ratio of its top to its bottom. </w:t>
@@ -1508,7 +1613,7 @@
           <w:b/>
           <w:bCs/>
         </w:rPr>
-        <w:t xml:space="preserve">Overlap = (midpoint of current grade / midpoint of previous grade) − 1</w:t>
+        <w:t>Overlap = (midpoint of current grade / midpoint of previous grade) − 1</w:t>
       </w:r>
       <w:r>
         <w:t xml:space="preserve"> — strictly the midpoint progression between consecutive grades. A naming note: what is labelled “overlap” here is the midpoint progression; whether two bands physically share range depends on it relative to the spread — with arithmetic-mean midpoints, adjacent bands overlap only when progression &lt; spread (equal = they touch; greater = a gap).</w:t>
@@ -1516,7 +1621,7 @@
     </w:p>
     <w:p>
       <w:pPr>
-        <w:spacing w:after="140" w:line="276"/>
+        <w:spacing w:after="140" w:line="276" w:lineRule="auto"/>
       </w:pPr>
       <w:r>
         <w:t xml:space="preserve">One disambiguation the formula fixes: the band we sketched (min 75%, max 125% of midpoint) is a </w:t>
@@ -1526,7 +1631,7 @@
           <w:b/>
           <w:bCs/>
         </w:rPr>
-        <w:t xml:space="preserve">67% spread</w:t>
+        <w:t>67% spread</w:t>
       </w:r>
       <w:r>
         <w:t xml:space="preserve"> under this definition (1.25 / 0.75 − 1), not 25%. El-Delta's confirmed defaults are a </w:t>
@@ -1536,7 +1641,7 @@
           <w:b/>
           <w:bCs/>
         </w:rPr>
-        <w:t xml:space="preserve">67% spread and 25% overlap (progression)</w:t>
+        <w:t>67% spread and 25% overlap (progression)</w:t>
       </w:r>
       <w:r>
         <w:t xml:space="preserve"> — a common, defensible “healthy structure” starting point. Because the progression (25%) sits well below the spread (67%), adjacent bands overlap substantially, which is the intended effect. In practice spreads often widen toward senior grades; the uniform default is an editable starting point the consultant can tune per grade.</w:t>
@@ -1544,7 +1649,7 @@
     </w:p>
     <w:p>
       <w:pPr>
-        <w:spacing w:after="140" w:line="276"/>
+        <w:spacing w:after="140" w:line="276" w:lineRule="auto"/>
       </w:pPr>
       <w:r>
         <w:t xml:space="preserve">To accelerate setup — exactly what a consultant wants for a new organization — the system can </w:t>
@@ -1554,7 +1659,7 @@
           <w:b/>
           <w:bCs/>
         </w:rPr>
-        <w:t xml:space="preserve">auto-build the grade structure from a grade count</w:t>
+        <w:t>auto-build the grade structure from a grade count</w:t>
       </w:r>
       <w:r>
         <w:t xml:space="preserve">. The user says “we have N grades,” supplies a range to span (a lowest and highest anchor, or a starting midpoint plus a progression rate), and the system scaffolds N grades with evenly spaced midpoints, each with its spread and overlap applied per the formulas above. Two design notes: the output is an </w:t>
@@ -1564,7 +1669,7 @@
           <w:b/>
           <w:bCs/>
         </w:rPr>
-        <w:t xml:space="preserve">editable starting point</w:t>
+        <w:t>editable starting point</w:t>
       </w:r>
       <w:r>
         <w:t xml:space="preserve"> (real structures are never perfectly even, so the user can nudge midpoints and widen individual bands), and it needs the range to be meaningful — which usually comes from the market data or the lowest/highest roles, so auto-build typically runs after some market reference exists. Both controls are additive to the schema (salary_band already carries spread_pct and overlap_pct).</w:t>
@@ -1575,12 +1680,12 @@
         <w:pStyle w:val="Heading2"/>
       </w:pPr>
       <w:r>
-        <w:t xml:space="preserve">Compa-ratio &amp; internal equity (integrated only)</w:t>
-      </w:r>
-    </w:p>
-    <w:p>
-      <w:pPr>
-        <w:spacing w:after="140" w:line="276"/>
+        <w:t>Compa-ratio &amp; internal equity (integrated only)</w:t>
+      </w:r>
+    </w:p>
+    <w:p>
+      <w:pPr>
+        <w:spacing w:after="140" w:line="276" w:lineRule="auto"/>
       </w:pPr>
       <w:r>
         <w:t xml:space="preserve">Once real salaries are imported, </w:t>
@@ -1590,7 +1695,7 @@
           <w:b/>
           <w:bCs/>
         </w:rPr>
-        <w:t xml:space="preserve">compa-ratio</w:t>
+        <w:t>compa-ratio</w:t>
       </w:r>
       <w:r>
         <w:t xml:space="preserve"> (actual pay ÷ band midpoint; below 75% = below scale) and internal-equity dispersion light up. Internal-equity findings can be legally sensitive (protected classes), so the methodology is defined with HR + legal. This layer needs consented, carefully handled data (PDPL-aware).</w:t>
@@ -1601,12 +1706,12 @@
         <w:pStyle w:val="Heading1"/>
       </w:pPr>
       <w:r>
-        <w:t xml:space="preserve">7. Data Model</w:t>
-      </w:r>
-    </w:p>
-    <w:p>
-      <w:pPr>
-        <w:spacing w:after="140" w:line="276"/>
+        <w:t>7. Data Model</w:t>
+      </w:r>
+    </w:p>
+    <w:p>
+      <w:pPr>
+        <w:spacing w:after="140" w:line="276" w:lineRule="auto"/>
       </w:pPr>
       <w:r>
         <w:t xml:space="preserve">The Phase 1 schema is 23 tables across three areas (full DDL in </w:t>
@@ -1616,10 +1721,10 @@
           <w:b/>
           <w:bCs/>
         </w:rPr>
-        <w:t xml:space="preserve">people_rise_phase1_schema.sql</w:t>
-      </w:r>
-      <w:r>
-        <w:t xml:space="preserve">). It assumes DB-per-tenant — there is no tenant_id column; the database boundary is the tenant boundary. UUID keys, exact decimal money, versioned methodology, and an immutable evaluation-answer table are the load-bearing choices.</w:t>
+        <w:t>people_rise_phase1_schema.sql</w:t>
+      </w:r>
+      <w:r>
+        <w:t>). It assumes DB-per-tenant — there is no tenant_id column; the database boundary is the tenant boundary. UUID keys, exact decimal money, versioned methodology, and an immutable evaluation-answer table are the load-bearing choices.</w:t>
       </w:r>
     </w:p>
     <w:p>
@@ -1629,7 +1734,7 @@
           <w:ilvl w:val="0"/>
           <w:numId w:val="2"/>
         </w:numPr>
-        <w:spacing w:after="90" w:line="276"/>
+        <w:spacing w:after="90" w:line="276" w:lineRule="auto"/>
       </w:pPr>
       <w:r>
         <w:rPr>
@@ -1639,7 +1744,7 @@
         <w:t xml:space="preserve">Structure: </w:t>
       </w:r>
       <w:r>
-        <w:t xml:space="preserve">org_unit, level, job_family, grade, job, job_position, employee, employee_assignment.</w:t>
+        <w:t>org_unit, level, job_family, grade, job, job_position, employee, employee_assignment.</w:t>
       </w:r>
     </w:p>
     <w:p>
@@ -1649,7 +1754,7 @@
           <w:ilvl w:val="0"/>
           <w:numId w:val="2"/>
         </w:numPr>
-        <w:spacing w:after="90" w:line="276"/>
+        <w:spacing w:after="90" w:line="276" w:lineRule="auto"/>
       </w:pPr>
       <w:r>
         <w:rPr>
@@ -1659,7 +1764,7 @@
         <w:t xml:space="preserve">Evaluation: </w:t>
       </w:r>
       <w:r>
-        <w:t xml:space="preserve">methodology, methodology_version, factor, question, answer_option, grade_mapping, evaluation, evaluation_answer (immutable), evaluation_factor_score.</w:t>
+        <w:t>methodology, methodology_version, factor, question, answer_option, grade_mapping, evaluation, evaluation_answer (immutable), evaluation_factor_score.</w:t>
       </w:r>
     </w:p>
     <w:p>
@@ -1669,7 +1774,7 @@
           <w:ilvl w:val="0"/>
           <w:numId w:val="2"/>
         </w:numPr>
-        <w:spacing w:after="90" w:line="276"/>
+        <w:spacing w:after="90" w:line="276" w:lineRule="auto"/>
       </w:pPr>
       <w:r>
         <w:rPr>
@@ -1679,20 +1784,24 @@
         <w:t xml:space="preserve">Salary: </w:t>
       </w:r>
       <w:r>
-        <w:t xml:space="preserve">market_data_snapshot, market_data_point, band_positioning_policy, salary_band, salary_import_batch, employee_compensation.</w:t>
-      </w:r>
-    </w:p>
-    <w:p>
-      <w:pPr>
-        <w:spacing w:after="40" w:before="120"/>
+        <w:t>market_data_snapshot, market_data_point, band_positioning_policy, salary_band, salary_import_batch, employee_compensation.</w:t>
+      </w:r>
+    </w:p>
+    <w:p>
+      <w:pPr>
+        <w:spacing w:before="120" w:after="40"/>
         <w:jc w:val="center"/>
       </w:pPr>
       <w:r>
+        <w:rPr>
+          <w:noProof/>
+        </w:rPr>
+        <w:lastRenderedPageBreak/>
         <w:drawing>
-          <wp:inline distT="0" distB="0" distL="0" distR="0">
+          <wp:inline distT="0" distB="0" distL="0" distR="0" wp14:anchorId="4A8EB1A3" wp14:editId="5F418D29">
             <wp:extent cx="5524500" cy="2390775"/>
-            <wp:effectExtent t="0" r="0" b="0" l="0"/>
-            <wp:docPr id="1" name="Entity-relationship diagram of the 23 Phase 1 tables across structure, evaluation, and salary areas" descr="Entity-relationship diagram of the 23 Phase 1 tables across structure, evaluation, and salary areas" title="Entity-relationship diagram of the 23 Phase 1 tables across structure, evaluation, and salary areas"/>
+            <wp:effectExtent l="0" t="0" r="0" b="0"/>
+            <wp:docPr id="1762697623" name="Entity-relationship diagram of the 23 Phase 1 tables across structure, evaluation, and salary areas" descr="Entity-relationship diagram of the 23 Phase 1 tables across structure, evaluation, and salary areas" title="Entity-relationship diagram of the 23 Phase 1 tables across structure, evaluation, and salary areas"/>
             <wp:cNvGraphicFramePr>
               <a:graphicFrameLocks xmlns:a="http://schemas.openxmlformats.org/drawingml/2006/main" noChangeAspect="1"/>
             </wp:cNvGraphicFramePr>
@@ -1700,13 +1809,13 @@
               <a:graphicData uri="http://schemas.openxmlformats.org/drawingml/2006/picture">
                 <pic:pic xmlns:pic="http://schemas.openxmlformats.org/drawingml/2006/picture">
                   <pic:nvPicPr>
-                    <pic:cNvPr id="0" name="" descr=""/>
+                    <pic:cNvPr id="0" name=""/>
                     <pic:cNvPicPr>
                       <a:picLocks noChangeAspect="1" noChangeArrowheads="1"/>
                     </pic:cNvPicPr>
                   </pic:nvPicPr>
                   <pic:blipFill>
-                    <a:blip r:embed="rId13" cstate="none"/>
+                    <a:blip r:embed="rId11"/>
                     <a:srcRect/>
                     <a:stretch>
                       <a:fillRect/>
@@ -1741,7 +1850,7 @@
           <w:sz w:val="18"/>
           <w:szCs w:val="18"/>
         </w:rPr>
-        <w:t xml:space="preserve">Phase 1 ERD — structure (left), evaluation (right), reward (centre). Full DDL in the .sql file.</w:t>
+        <w:t>Phase 1 ERD — structure (left), evaluation (right), reward (centre). Full DDL in the .sql file.</w:t>
       </w:r>
     </w:p>
     <w:p>
@@ -1749,12 +1858,12 @@
         <w:pStyle w:val="Heading1"/>
       </w:pPr>
       <w:r>
-        <w:t xml:space="preserve">8. Calibration Back-test (the Gate)</w:t>
-      </w:r>
-    </w:p>
-    <w:p>
-      <w:pPr>
-        <w:spacing w:after="140" w:line="276"/>
+        <w:t>8. Calibration Back-test (the Gate)</w:t>
+      </w:r>
+    </w:p>
+    <w:p>
+      <w:pPr>
+        <w:spacing w:after="140" w:line="276" w:lineRule="auto"/>
       </w:pPr>
       <w:r>
         <w:t xml:space="preserve">Before any UI is built, the methodology must be proven. Once the engine can score jobs (seeded data or a rough screen), run </w:t>
@@ -1764,7 +1873,7 @@
           <w:b/>
           <w:bCs/>
         </w:rPr>
-        <w:t xml:space="preserve">6–10 real El-Delta jobs</w:t>
+        <w:t>6–10 real El-Delta jobs</w:t>
       </w:r>
       <w:r>
         <w:t xml:space="preserve"> of agreed relative seniority through it and confirm the rankings match expectations. If the CFO's role doesn't out-score a department manager, tune the weights, publish a v2, and re-test. This is a </w:t>
@@ -1774,10 +1883,10 @@
           <w:b/>
           <w:bCs/>
         </w:rPr>
-        <w:t xml:space="preserve">go/no-go gate</w:t>
-      </w:r>
-      <w:r>
-        <w:t xml:space="preserve">: in a consulting-led model, a system that produces grades people can't defend burns trust fast, so proving the model is the first real milestone — ahead of UI polish.</w:t>
+        <w:t>go/no-go gate</w:t>
+      </w:r>
+      <w:r>
+        <w:t>: in a consulting-led model, a system that produces grades people can't defend burns trust fast, so proving the model is the first real milestone — ahead of UI polish.</w:t>
       </w:r>
     </w:p>
     <w:p>
@@ -1785,15 +1894,15 @@
         <w:pStyle w:val="Heading1"/>
       </w:pPr>
       <w:r>
-        <w:t xml:space="preserve">9. El-Delta Defaults &amp; Open Items</w:t>
-      </w:r>
-    </w:p>
-    <w:p>
-      <w:pPr>
-        <w:spacing w:after="140" w:line="276"/>
-      </w:pPr>
-      <w:r>
-        <w:t xml:space="preserve">Phase-1-relevant defaults, confirmed with Farouk (full list in the Product Scope, Section 2):</w:t>
+        <w:t>9. El-Delta Defaults &amp; Open Items</w:t>
+      </w:r>
+    </w:p>
+    <w:p>
+      <w:pPr>
+        <w:spacing w:after="140" w:line="276" w:lineRule="auto"/>
+      </w:pPr>
+      <w:r>
+        <w:t>Phase-1-relevant defaults, confirmed with Farouk (full list in the Product Scope, Section 2):</w:t>
       </w:r>
     </w:p>
     <w:p>
@@ -1803,10 +1912,10 @@
           <w:ilvl w:val="0"/>
           <w:numId w:val="2"/>
         </w:numPr>
-        <w:spacing w:after="90" w:line="276"/>
-      </w:pPr>
-      <w:r>
-        <w:t xml:space="preserve">Point-factor methodology; simple-rule questionnaire, HR-owned; four-level scope, C-level excluded.</w:t>
+        <w:spacing w:after="90" w:line="276" w:lineRule="auto"/>
+      </w:pPr>
+      <w:r>
+        <w:t>Weighted point-factor methodology (percentage-weighted factors and questions over a 200–1000 point budget, unified 1–5 answer rating), HR-owned; four-level scope, C-level excluded.</w:t>
       </w:r>
     </w:p>
     <w:p>
@@ -1816,10 +1925,10 @@
           <w:ilvl w:val="0"/>
           <w:numId w:val="2"/>
         </w:numPr>
-        <w:spacing w:after="90" w:line="276"/>
-      </w:pPr>
-      <w:r>
-        <w:t xml:space="preserve">Five levels (Blue Collar → IC → Supervisory → Managerial → C-level); one role per level; no existing families or competency framework (built from scratch, uniform 1–5).</w:t>
+        <w:spacing w:after="90" w:line="276" w:lineRule="auto"/>
+      </w:pPr>
+      <w:r>
+        <w:t>Five levels (Blue Collar → IC → Supervisory → Managerial → C-level); one role per level; no existing families or competency framework (built from scratch, uniform 1–5).</w:t>
       </w:r>
     </w:p>
     <w:p>
@@ -1829,10 +1938,10 @@
           <w:ilvl w:val="0"/>
           <w:numId w:val="2"/>
         </w:numPr>
-        <w:spacing w:after="90" w:line="276"/>
-      </w:pPr>
-      <w:r>
-        <w:t xml:space="preserve">Bands 67% spread + 25% overlap (progression), match-the-market varying by family; compa-ratio at midpoint = 100%, below 75% = below scale.</w:t>
+        <w:spacing w:after="90" w:line="276" w:lineRule="auto"/>
+      </w:pPr>
+      <w:r>
+        <w:t>Bands 67% spread + 25% overlap (progression), match-the-market varying by family; compa-ratio at midpoint = 100%, below 75% = below scale.</w:t>
       </w:r>
     </w:p>
     <w:p>
@@ -1842,15 +1951,15 @@
           <w:ilvl w:val="0"/>
           <w:numId w:val="2"/>
         </w:numPr>
-        <w:spacing w:after="90" w:line="276"/>
-      </w:pPr>
-      <w:r>
-        <w:t xml:space="preserve">Position-control / establishment model; market data via point-in-time snapshot.</w:t>
-      </w:r>
-    </w:p>
-    <w:p>
-      <w:pPr>
-        <w:spacing w:after="140" w:line="276"/>
+        <w:spacing w:after="90" w:line="276" w:lineRule="auto"/>
+      </w:pPr>
+      <w:r>
+        <w:t>Position-control / establishment model; market data via point-in-time snapshot.</w:t>
+      </w:r>
+    </w:p>
+    <w:p>
+      <w:pPr>
+        <w:spacing w:after="140" w:line="276" w:lineRule="auto"/>
       </w:pPr>
       <w:r>
         <w:rPr>
@@ -1860,38 +1969,25 @@
         <w:t xml:space="preserve">Open for the design phase: </w:t>
       </w:r>
       <w:r>
-        <w:t xml:space="preserve">Farouk's factor definitions and point values plus the calibration back-test; defining the job families and placing roles into the grid; confirming one questionnaire per methodology (recommended for comparability).</w:t>
+        <w:t>Farouk's factor definitions with their weights, the per-factor question weights, and the point budget, plus the calibration back-test; defining the job families and placing roles into the grid; confirming one questionnaire per methodology (recommended for comparability).</w:t>
       </w:r>
     </w:p>
     <w:sectPr>
-      <w:headerReference w:type="default" r:id="rId7"/>
-      <w:footerReference w:type="default" r:id="rId8"/>
-      <w:pgSz w:w="12240" w:h="15840" w:orient="portrait"/>
+      <w:headerReference w:type="default" r:id="rId12"/>
+      <w:footerReference w:type="default" r:id="rId13"/>
+      <w:pgSz w:w="12240" w:h="15840"/>
       <w:pgMar w:top="1440" w:right="1440" w:bottom="1440" w:left="1440" w:header="708" w:footer="708" w:gutter="0"/>
-      <w:pgNumType/>
+      <w:cols w:space="720"/>
       <w:docGrid w:linePitch="360"/>
     </w:sectPr>
   </w:body>
 </w:document>
 </file>
 
-<file path=word/comments.xml><?xml version="1.0" encoding="utf-8"?>
-<w:comments xmlns:cx="http://schemas.microsoft.com/office/drawing/2014/chartex" xmlns:cx1="http://schemas.microsoft.com/office/drawing/2015/9/8/chartex" xmlns:cx2="http://schemas.microsoft.com/office/drawing/2015/10/21/chartex" xmlns:cx3="http://schemas.microsoft.com/office/drawing/2016/5/9/chartex" xmlns:cx4="http://schemas.microsoft.com/office/drawing/2016/5/10/chartex" xmlns:cx5="http://schemas.microsoft.com/office/drawing/2016/5/11/chartex" xmlns:cx6="http://schemas.microsoft.com/office/drawing/2016/5/12/chartex" xmlns:cx7="http://schemas.microsoft.com/office/drawing/2016/5/13/chartex" xmlns:cx8="http://schemas.microsoft.com/office/drawing/2016/5/14/chartex" xmlns:mc="http://schemas.openxmlformats.org/markup-compatibility/2006" xmlns:aink="http://schemas.microsoft.com/office/drawing/2016/ink" xmlns:am3d="http://schemas.microsoft.com/office/drawing/2017/model3d" xmlns:o="urn:schemas-microsoft-com:office:office" xmlns:r="http://schemas.openxmlformats.org/officeDocument/2006/relationships" xmlns:m="http://schemas.openxmlformats.org/officeDocument/2006/math" xmlns:v="urn:schemas-microsoft-com:vml" xmlns:wp14="http://schemas.microsoft.com/office/word/2010/wordprocessingDrawing" xmlns:wp="http://schemas.openxmlformats.org/drawingml/2006/wordprocessingDrawing" xmlns:w10="urn:schemas-microsoft-com:office:word" xmlns:w="http://schemas.openxmlformats.org/wordprocessingml/2006/main" xmlns:w14="http://schemas.microsoft.com/office/word/2010/wordml" xmlns:w15="http://schemas.microsoft.com/office/word/2012/wordml" xmlns:w16cex="http://schemas.microsoft.com/office/word/2018/wordml/cex" xmlns:w16cid="http://schemas.microsoft.com/office/word/2016/wordml/cid" xmlns:w16="http://schemas.microsoft.com/office/word/2018/wordml" xmlns:w16sdtdh="http://schemas.microsoft.com/office/word/2020/wordml/sdtdatahash" xmlns:w16se="http://schemas.microsoft.com/office/word/2015/wordml/symex" xmlns:wpg="http://schemas.microsoft.com/office/word/2010/wordprocessingGroup" xmlns:wpi="http://schemas.microsoft.com/office/word/2010/wordprocessingInk" xmlns:wne="http://schemas.microsoft.com/office/word/2006/wordml" xmlns:wps="http://schemas.microsoft.com/office/word/2010/wordprocessingShape"/>
-</file>
-
 <file path=word/endnotes.xml><?xml version="1.0" encoding="utf-8"?>
-<w:endnotes xmlns:wpc="http://schemas.microsoft.com/office/word/2010/wordprocessingCanvas" xmlns:mc="http://schemas.openxmlformats.org/markup-compatibility/2006" xmlns:o="urn:schemas-microsoft-com:office:office" xmlns:r="http://schemas.openxmlformats.org/officeDocument/2006/relationships" xmlns:m="http://schemas.openxmlformats.org/officeDocument/2006/math" xmlns:v="urn:schemas-microsoft-com:vml" xmlns:wp14="http://schemas.microsoft.com/office/word/2010/wordprocessingDrawing" xmlns:wp="http://schemas.openxmlformats.org/drawingml/2006/wordprocessingDrawing" xmlns:w10="urn:schemas-microsoft-com:office:word" xmlns:w="http://schemas.openxmlformats.org/wordprocessingml/2006/main" xmlns:w14="http://schemas.microsoft.com/office/word/2010/wordml" xmlns:w15="http://schemas.microsoft.com/office/word/2012/wordml" xmlns:wpg="http://schemas.microsoft.com/office/word/2010/wordprocessingGroup" xmlns:wpi="http://schemas.microsoft.com/office/word/2010/wordprocessingInk" xmlns:wne="http://schemas.microsoft.com/office/word/2006/wordml" xmlns:wps="http://schemas.microsoft.com/office/word/2010/wordprocessingShape" mc:Ignorable="w14 w15 wp14">
+<w:endnotes xmlns:wpc="http://schemas.microsoft.com/office/word/2010/wordprocessingCanvas" xmlns:cx="http://schemas.microsoft.com/office/drawing/2014/chartex" xmlns:cx1="http://schemas.microsoft.com/office/drawing/2015/9/8/chartex" xmlns:cx2="http://schemas.microsoft.com/office/drawing/2015/10/21/chartex" xmlns:cx3="http://schemas.microsoft.com/office/drawing/2016/5/9/chartex" xmlns:cx4="http://schemas.microsoft.com/office/drawing/2016/5/10/chartex" xmlns:cx5="http://schemas.microsoft.com/office/drawing/2016/5/11/chartex" xmlns:cx6="http://schemas.microsoft.com/office/drawing/2016/5/12/chartex" xmlns:cx7="http://schemas.microsoft.com/office/drawing/2016/5/13/chartex" xmlns:cx8="http://schemas.microsoft.com/office/drawing/2016/5/14/chartex" xmlns:mc="http://schemas.openxmlformats.org/markup-compatibility/2006" xmlns:aink="http://schemas.microsoft.com/office/drawing/2016/ink" xmlns:am3d="http://schemas.microsoft.com/office/drawing/2017/model3d" xmlns:o="urn:schemas-microsoft-com:office:office" xmlns:oel="http://schemas.microsoft.com/office/2019/extlst" xmlns:r="http://schemas.openxmlformats.org/officeDocument/2006/relationships" xmlns:m="http://schemas.openxmlformats.org/officeDocument/2006/math" xmlns:v="urn:schemas-microsoft-com:vml" xmlns:wp14="http://schemas.microsoft.com/office/word/2010/wordprocessingDrawing" xmlns:wp="http://schemas.openxmlformats.org/drawingml/2006/wordprocessingDrawing" xmlns:w10="urn:schemas-microsoft-com:office:word" xmlns:w="http://schemas.openxmlformats.org/wordprocessingml/2006/main" xmlns:w14="http://schemas.microsoft.com/office/word/2010/wordml" xmlns:w15="http://schemas.microsoft.com/office/word/2012/wordml" xmlns:w16cex="http://schemas.microsoft.com/office/word/2018/wordml/cex" xmlns:w16cid="http://schemas.microsoft.com/office/word/2016/wordml/cid" xmlns:w16="http://schemas.microsoft.com/office/word/2018/wordml" xmlns:w16du="http://schemas.microsoft.com/office/word/2023/wordml/word16du" xmlns:w16sdtdh="http://schemas.microsoft.com/office/word/2020/wordml/sdtdatahash" xmlns:w16sdtfl="http://schemas.microsoft.com/office/word/2024/wordml/sdtformatlock" xmlns:w16se="http://schemas.microsoft.com/office/word/2015/wordml/symex" xmlns:wpg="http://schemas.microsoft.com/office/word/2010/wordprocessingGroup" xmlns:wpi="http://schemas.microsoft.com/office/word/2010/wordprocessingInk" xmlns:wne="http://schemas.microsoft.com/office/word/2006/wordml" xmlns:wps="http://schemas.microsoft.com/office/word/2010/wordprocessingShape" mc:Ignorable="w14 w15 w16se w16cid w16 w16cex w16sdtdh w16sdtfl w16du wp14">
   <w:endnote w:type="separator" w:id="-1">
     <w:p>
-      <w:pPr>
-        <w:spacing w:after="0" w:line="240" w:lineRule="auto"/>
-      </w:pPr>
-      <w:r>
-        <w:rPr>
-          <w:rStyle w:val="EndnoteReference"/>
-        </w:rPr>
-        <w:endnoteRef/>
-      </w:r>
       <w:r>
         <w:separator/>
       </w:r>
@@ -1899,15 +1995,6 @@
   </w:endnote>
   <w:endnote w:type="continuationSeparator" w:id="0">
     <w:p>
-      <w:pPr>
-        <w:spacing w:after="0" w:line="240" w:lineRule="auto"/>
-      </w:pPr>
-      <w:r>
-        <w:rPr>
-          <w:rStyle w:val="EndnoteReference"/>
-        </w:rPr>
-        <w:endnoteRef/>
-      </w:r>
       <w:r>
         <w:continuationSeparator/>
       </w:r>
@@ -1917,7 +2004,7 @@
 </file>
 
 <file path=word/footer1.xml><?xml version="1.0" encoding="utf-8"?>
-<w:ftr xmlns:wpc="http://schemas.microsoft.com/office/word/2010/wordprocessingCanvas" xmlns:mc="http://schemas.openxmlformats.org/markup-compatibility/2006" xmlns:o="urn:schemas-microsoft-com:office:office" xmlns:r="http://schemas.openxmlformats.org/officeDocument/2006/relationships" xmlns:m="http://schemas.openxmlformats.org/officeDocument/2006/math" xmlns:v="urn:schemas-microsoft-com:vml" xmlns:wp14="http://schemas.microsoft.com/office/word/2010/wordprocessingDrawing" xmlns:wp="http://schemas.openxmlformats.org/drawingml/2006/wordprocessingDrawing" xmlns:w10="urn:schemas-microsoft-com:office:word" xmlns:w="http://schemas.openxmlformats.org/wordprocessingml/2006/main" xmlns:w14="http://schemas.microsoft.com/office/word/2010/wordml" xmlns:w15="http://schemas.microsoft.com/office/word/2012/wordml" xmlns:wpg="http://schemas.microsoft.com/office/word/2010/wordprocessingGroup" xmlns:wpi="http://schemas.microsoft.com/office/word/2010/wordprocessingInk" xmlns:wne="http://schemas.microsoft.com/office/word/2006/wordml" xmlns:wps="http://schemas.microsoft.com/office/word/2010/wordprocessingShape">
+<w:ftr xmlns:wpc="http://schemas.microsoft.com/office/word/2010/wordprocessingCanvas" xmlns:cx="http://schemas.microsoft.com/office/drawing/2014/chartex" xmlns:cx1="http://schemas.microsoft.com/office/drawing/2015/9/8/chartex" xmlns:cx2="http://schemas.microsoft.com/office/drawing/2015/10/21/chartex" xmlns:cx3="http://schemas.microsoft.com/office/drawing/2016/5/9/chartex" xmlns:cx4="http://schemas.microsoft.com/office/drawing/2016/5/10/chartex" xmlns:cx5="http://schemas.microsoft.com/office/drawing/2016/5/11/chartex" xmlns:cx6="http://schemas.microsoft.com/office/drawing/2016/5/12/chartex" xmlns:cx7="http://schemas.microsoft.com/office/drawing/2016/5/13/chartex" xmlns:cx8="http://schemas.microsoft.com/office/drawing/2016/5/14/chartex" xmlns:mc="http://schemas.openxmlformats.org/markup-compatibility/2006" xmlns:aink="http://schemas.microsoft.com/office/drawing/2016/ink" xmlns:am3d="http://schemas.microsoft.com/office/drawing/2017/model3d" xmlns:o="urn:schemas-microsoft-com:office:office" xmlns:oel="http://schemas.microsoft.com/office/2019/extlst" xmlns:r="http://schemas.openxmlformats.org/officeDocument/2006/relationships" xmlns:m="http://schemas.openxmlformats.org/officeDocument/2006/math" xmlns:v="urn:schemas-microsoft-com:vml" xmlns:wp14="http://schemas.microsoft.com/office/word/2010/wordprocessingDrawing" xmlns:wp="http://schemas.openxmlformats.org/drawingml/2006/wordprocessingDrawing" xmlns:w10="urn:schemas-microsoft-com:office:word" xmlns:w="http://schemas.openxmlformats.org/wordprocessingml/2006/main" xmlns:w14="http://schemas.microsoft.com/office/word/2010/wordml" xmlns:w15="http://schemas.microsoft.com/office/word/2012/wordml" xmlns:w16cex="http://schemas.microsoft.com/office/word/2018/wordml/cex" xmlns:w16cid="http://schemas.microsoft.com/office/word/2016/wordml/cid" xmlns:w16="http://schemas.microsoft.com/office/word/2018/wordml" xmlns:w16du="http://schemas.microsoft.com/office/word/2023/wordml/word16du" xmlns:w16sdtdh="http://schemas.microsoft.com/office/word/2020/wordml/sdtdatahash" xmlns:w16sdtfl="http://schemas.microsoft.com/office/word/2024/wordml/sdtformatlock" xmlns:w16se="http://schemas.microsoft.com/office/word/2015/wordml/symex" xmlns:wpg="http://schemas.microsoft.com/office/word/2010/wordprocessingGroup" xmlns:wpi="http://schemas.microsoft.com/office/word/2010/wordprocessingInk" xmlns:wne="http://schemas.microsoft.com/office/word/2006/wordml" xmlns:wps="http://schemas.microsoft.com/office/word/2010/wordprocessingShape" mc:Ignorable="w14 w15 w16se w16cid w16 w16cex w16sdtdh w16sdtfl w16du wp14">
   <w:p>
     <w:pPr>
       <w:jc w:val="center"/>
@@ -1937,8 +2024,38 @@
         <w:szCs w:val="16"/>
       </w:rPr>
       <w:fldChar w:fldCharType="begin"/>
-      <w:instrText xml:space="preserve">PAGE</w:instrText>
+    </w:r>
+    <w:r>
+      <w:rPr>
+        <w:color w:val="595959"/>
+        <w:sz w:val="16"/>
+        <w:szCs w:val="16"/>
+      </w:rPr>
+      <w:instrText>PAGE</w:instrText>
+    </w:r>
+    <w:r>
+      <w:rPr>
+        <w:color w:val="595959"/>
+        <w:sz w:val="16"/>
+        <w:szCs w:val="16"/>
+      </w:rPr>
       <w:fldChar w:fldCharType="separate"/>
+    </w:r>
+    <w:r>
+      <w:rPr>
+        <w:noProof/>
+        <w:color w:val="595959"/>
+        <w:sz w:val="16"/>
+        <w:szCs w:val="16"/>
+      </w:rPr>
+      <w:t>1</w:t>
+    </w:r>
+    <w:r>
+      <w:rPr>
+        <w:color w:val="595959"/>
+        <w:sz w:val="16"/>
+        <w:szCs w:val="16"/>
+      </w:rPr>
       <w:fldChar w:fldCharType="end"/>
     </w:r>
     <w:r>
@@ -1954,18 +2071,9 @@
 </file>
 
 <file path=word/footnotes.xml><?xml version="1.0" encoding="utf-8"?>
-<w:footnotes xmlns:wpc="http://schemas.microsoft.com/office/word/2010/wordprocessingCanvas" xmlns:mc="http://schemas.openxmlformats.org/markup-compatibility/2006" xmlns:o="urn:schemas-microsoft-com:office:office" xmlns:r="http://schemas.openxmlformats.org/officeDocument/2006/relationships" xmlns:m="http://schemas.openxmlformats.org/officeDocument/2006/math" xmlns:v="urn:schemas-microsoft-com:vml" xmlns:wp14="http://schemas.microsoft.com/office/word/2010/wordprocessingDrawing" xmlns:wp="http://schemas.openxmlformats.org/drawingml/2006/wordprocessingDrawing" xmlns:w10="urn:schemas-microsoft-com:office:word" xmlns:w="http://schemas.openxmlformats.org/wordprocessingml/2006/main" xmlns:w14="http://schemas.microsoft.com/office/word/2010/wordml" xmlns:w15="http://schemas.microsoft.com/office/word/2012/wordml" xmlns:wpg="http://schemas.microsoft.com/office/word/2010/wordprocessingGroup" xmlns:wpi="http://schemas.microsoft.com/office/word/2010/wordprocessingInk" xmlns:wne="http://schemas.microsoft.com/office/word/2006/wordml" xmlns:wps="http://schemas.microsoft.com/office/word/2010/wordprocessingShape" mc:Ignorable="w14 w15 wp14">
+<w:footnotes xmlns:wpc="http://schemas.microsoft.com/office/word/2010/wordprocessingCanvas" xmlns:cx="http://schemas.microsoft.com/office/drawing/2014/chartex" xmlns:cx1="http://schemas.microsoft.com/office/drawing/2015/9/8/chartex" xmlns:cx2="http://schemas.microsoft.com/office/drawing/2015/10/21/chartex" xmlns:cx3="http://schemas.microsoft.com/office/drawing/2016/5/9/chartex" xmlns:cx4="http://schemas.microsoft.com/office/drawing/2016/5/10/chartex" xmlns:cx5="http://schemas.microsoft.com/office/drawing/2016/5/11/chartex" xmlns:cx6="http://schemas.microsoft.com/office/drawing/2016/5/12/chartex" xmlns:cx7="http://schemas.microsoft.com/office/drawing/2016/5/13/chartex" xmlns:cx8="http://schemas.microsoft.com/office/drawing/2016/5/14/chartex" xmlns:mc="http://schemas.openxmlformats.org/markup-compatibility/2006" xmlns:aink="http://schemas.microsoft.com/office/drawing/2016/ink" xmlns:am3d="http://schemas.microsoft.com/office/drawing/2017/model3d" xmlns:o="urn:schemas-microsoft-com:office:office" xmlns:oel="http://schemas.microsoft.com/office/2019/extlst" xmlns:r="http://schemas.openxmlformats.org/officeDocument/2006/relationships" xmlns:m="http://schemas.openxmlformats.org/officeDocument/2006/math" xmlns:v="urn:schemas-microsoft-com:vml" xmlns:wp14="http://schemas.microsoft.com/office/word/2010/wordprocessingDrawing" xmlns:wp="http://schemas.openxmlformats.org/drawingml/2006/wordprocessingDrawing" xmlns:w10="urn:schemas-microsoft-com:office:word" xmlns:w="http://schemas.openxmlformats.org/wordprocessingml/2006/main" xmlns:w14="http://schemas.microsoft.com/office/word/2010/wordml" xmlns:w15="http://schemas.microsoft.com/office/word/2012/wordml" xmlns:w16cex="http://schemas.microsoft.com/office/word/2018/wordml/cex" xmlns:w16cid="http://schemas.microsoft.com/office/word/2016/wordml/cid" xmlns:w16="http://schemas.microsoft.com/office/word/2018/wordml" xmlns:w16du="http://schemas.microsoft.com/office/word/2023/wordml/word16du" xmlns:w16sdtdh="http://schemas.microsoft.com/office/word/2020/wordml/sdtdatahash" xmlns:w16sdtfl="http://schemas.microsoft.com/office/word/2024/wordml/sdtformatlock" xmlns:w16se="http://schemas.microsoft.com/office/word/2015/wordml/symex" xmlns:wpg="http://schemas.microsoft.com/office/word/2010/wordprocessingGroup" xmlns:wpi="http://schemas.microsoft.com/office/word/2010/wordprocessingInk" xmlns:wne="http://schemas.microsoft.com/office/word/2006/wordml" xmlns:wps="http://schemas.microsoft.com/office/word/2010/wordprocessingShape" mc:Ignorable="w14 w15 w16se w16cid w16 w16cex w16sdtdh w16sdtfl w16du wp14">
   <w:footnote w:type="separator" w:id="-1">
     <w:p>
-      <w:pPr>
-        <w:spacing w:after="0" w:line="240" w:lineRule="auto"/>
-      </w:pPr>
-      <w:r>
-        <w:rPr>
-          <w:rStyle w:val="FootnoteReference"/>
-        </w:rPr>
-        <w:footnoteRef/>
-      </w:r>
       <w:r>
         <w:separator/>
       </w:r>
@@ -1973,15 +2081,6 @@
   </w:footnote>
   <w:footnote w:type="continuationSeparator" w:id="0">
     <w:p>
-      <w:pPr>
-        <w:spacing w:after="0" w:line="240" w:lineRule="auto"/>
-      </w:pPr>
-      <w:r>
-        <w:rPr>
-          <w:rStyle w:val="FootnoteReference"/>
-        </w:rPr>
-        <w:footnoteRef/>
-      </w:r>
       <w:r>
         <w:continuationSeparator/>
       </w:r>
@@ -1991,11 +2090,11 @@
 </file>
 
 <file path=word/header1.xml><?xml version="1.0" encoding="utf-8"?>
-<w:hdr xmlns:wpc="http://schemas.microsoft.com/office/word/2010/wordprocessingCanvas" xmlns:mc="http://schemas.openxmlformats.org/markup-compatibility/2006" xmlns:o="urn:schemas-microsoft-com:office:office" xmlns:r="http://schemas.openxmlformats.org/officeDocument/2006/relationships" xmlns:m="http://schemas.openxmlformats.org/officeDocument/2006/math" xmlns:v="urn:schemas-microsoft-com:vml" xmlns:wp14="http://schemas.microsoft.com/office/word/2010/wordprocessingDrawing" xmlns:wp="http://schemas.openxmlformats.org/drawingml/2006/wordprocessingDrawing" xmlns:w10="urn:schemas-microsoft-com:office:word" xmlns:w="http://schemas.openxmlformats.org/wordprocessingml/2006/main" xmlns:w14="http://schemas.microsoft.com/office/word/2010/wordml" xmlns:w15="http://schemas.microsoft.com/office/word/2012/wordml" xmlns:wpg="http://schemas.microsoft.com/office/word/2010/wordprocessingGroup" xmlns:wpi="http://schemas.microsoft.com/office/word/2010/wordprocessingInk" xmlns:wne="http://schemas.microsoft.com/office/word/2006/wordml" xmlns:wps="http://schemas.microsoft.com/office/word/2010/wordprocessingShape" xmlns:cx="http://schemas.microsoft.com/office/drawing/2014/chartex" xmlns:cx1="http://schemas.microsoft.com/office/drawing/2015/9/8/chartex" xmlns:cx2="http://schemas.microsoft.com/office/drawing/2015/10/21/chartex" xmlns:cx3="http://schemas.microsoft.com/office/drawing/2016/5/9/chartex" xmlns:cx4="http://schemas.microsoft.com/office/drawing/2016/5/10/chartex" xmlns:cx5="http://schemas.microsoft.com/office/drawing/2016/5/11/chartex" xmlns:cx6="http://schemas.microsoft.com/office/drawing/2016/5/12/chartex" xmlns:cx7="http://schemas.microsoft.com/office/drawing/2016/5/13/chartex" xmlns:cx8="http://schemas.microsoft.com/office/drawing/2016/5/14/chartex" xmlns:w16cid="http://schemas.microsoft.com/office/word/2016/wordml/cid" xmlns:w16se="http://schemas.microsoft.com/office/word/2015/wordml/symex">
+<w:hdr xmlns:wpc="http://schemas.microsoft.com/office/word/2010/wordprocessingCanvas" xmlns:cx="http://schemas.microsoft.com/office/drawing/2014/chartex" xmlns:cx1="http://schemas.microsoft.com/office/drawing/2015/9/8/chartex" xmlns:cx2="http://schemas.microsoft.com/office/drawing/2015/10/21/chartex" xmlns:cx3="http://schemas.microsoft.com/office/drawing/2016/5/9/chartex" xmlns:cx4="http://schemas.microsoft.com/office/drawing/2016/5/10/chartex" xmlns:cx5="http://schemas.microsoft.com/office/drawing/2016/5/11/chartex" xmlns:cx6="http://schemas.microsoft.com/office/drawing/2016/5/12/chartex" xmlns:cx7="http://schemas.microsoft.com/office/drawing/2016/5/13/chartex" xmlns:cx8="http://schemas.microsoft.com/office/drawing/2016/5/14/chartex" xmlns:mc="http://schemas.openxmlformats.org/markup-compatibility/2006" xmlns:aink="http://schemas.microsoft.com/office/drawing/2016/ink" xmlns:am3d="http://schemas.microsoft.com/office/drawing/2017/model3d" xmlns:o="urn:schemas-microsoft-com:office:office" xmlns:oel="http://schemas.microsoft.com/office/2019/extlst" xmlns:r="http://schemas.openxmlformats.org/officeDocument/2006/relationships" xmlns:m="http://schemas.openxmlformats.org/officeDocument/2006/math" xmlns:v="urn:schemas-microsoft-com:vml" xmlns:wp14="http://schemas.microsoft.com/office/word/2010/wordprocessingDrawing" xmlns:wp="http://schemas.openxmlformats.org/drawingml/2006/wordprocessingDrawing" xmlns:w10="urn:schemas-microsoft-com:office:word" xmlns:w="http://schemas.openxmlformats.org/wordprocessingml/2006/main" xmlns:w14="http://schemas.microsoft.com/office/word/2010/wordml" xmlns:w15="http://schemas.microsoft.com/office/word/2012/wordml" xmlns:w16cex="http://schemas.microsoft.com/office/word/2018/wordml/cex" xmlns:w16cid="http://schemas.microsoft.com/office/word/2016/wordml/cid" xmlns:w16="http://schemas.microsoft.com/office/word/2018/wordml" xmlns:w16du="http://schemas.microsoft.com/office/word/2023/wordml/word16du" xmlns:w16sdtdh="http://schemas.microsoft.com/office/word/2020/wordml/sdtdatahash" xmlns:w16sdtfl="http://schemas.microsoft.com/office/word/2024/wordml/sdtformatlock" xmlns:w16se="http://schemas.microsoft.com/office/word/2015/wordml/symex" xmlns:wpg="http://schemas.microsoft.com/office/word/2010/wordprocessingGroup" xmlns:wpi="http://schemas.microsoft.com/office/word/2010/wordprocessingInk" xmlns:wne="http://schemas.microsoft.com/office/word/2006/wordml" xmlns:wps="http://schemas.microsoft.com/office/word/2010/wordprocessingShape" mc:Ignorable="w14 w15 w16se w16cid w16 w16cex w16sdtdh w16sdtfl w16du wp14">
   <w:p>
     <w:pPr>
       <w:pBdr>
-        <w:bottom w:val="single" w:color="CCCCCC" w:sz="4" w:space="4"/>
+        <w:bottom w:val="single" w:sz="4" w:space="4" w:color="CCCCCC"/>
       </w:pBdr>
       <w:tabs>
         <w:tab w:val="right" w:pos="9360"/>
@@ -2009,7 +2108,7 @@
         <w:sz w:val="16"/>
         <w:szCs w:val="16"/>
       </w:rPr>
-      <w:t xml:space="preserve">People Rise</w:t>
+      <w:t>People Rise</w:t>
     </w:r>
     <w:r>
       <w:rPr>
@@ -2017,17 +2116,20 @@
         <w:sz w:val="16"/>
         <w:szCs w:val="16"/>
       </w:rPr>
-      <w:t xml:space="preserve">	Phase 1 — Detailed Design</w:t>
+      <w:tab/>
+      <w:t>Phase 1 — Detailed Design</w:t>
     </w:r>
   </w:p>
 </w:hdr>
 </file>
 
 <file path=word/numbering.xml><?xml version="1.0" encoding="utf-8"?>
-<w:numbering xmlns:wpc="http://schemas.microsoft.com/office/word/2010/wordprocessingCanvas" xmlns:mc="http://schemas.openxmlformats.org/markup-compatibility/2006" xmlns:o="urn:schemas-microsoft-com:office:office" xmlns:r="http://schemas.openxmlformats.org/officeDocument/2006/relationships" xmlns:m="http://schemas.openxmlformats.org/officeDocument/2006/math" xmlns:v="urn:schemas-microsoft-com:vml" xmlns:wp14="http://schemas.microsoft.com/office/word/2010/wordprocessingDrawing" xmlns:wp="http://schemas.openxmlformats.org/drawingml/2006/wordprocessingDrawing" xmlns:w10="urn:schemas-microsoft-com:office:word" xmlns:w="http://schemas.openxmlformats.org/wordprocessingml/2006/main" xmlns:w14="http://schemas.microsoft.com/office/word/2010/wordml" xmlns:w15="http://schemas.microsoft.com/office/word/2012/wordml" xmlns:wpg="http://schemas.microsoft.com/office/word/2010/wordprocessingGroup" xmlns:wpi="http://schemas.microsoft.com/office/word/2010/wordprocessingInk" xmlns:wne="http://schemas.microsoft.com/office/word/2006/wordml" xmlns:wps="http://schemas.microsoft.com/office/word/2010/wordprocessingShape" mc:Ignorable="w14 w15 wp14">
-  <w:abstractNum w:abstractNumId="1" w15:restartNumberingAfterBreak="0">
+<w:numbering xmlns:wpc="http://schemas.microsoft.com/office/word/2010/wordprocessingCanvas" xmlns:cx="http://schemas.microsoft.com/office/drawing/2014/chartex" xmlns:cx1="http://schemas.microsoft.com/office/drawing/2015/9/8/chartex" xmlns:cx2="http://schemas.microsoft.com/office/drawing/2015/10/21/chartex" xmlns:cx3="http://schemas.microsoft.com/office/drawing/2016/5/9/chartex" xmlns:cx4="http://schemas.microsoft.com/office/drawing/2016/5/10/chartex" xmlns:cx5="http://schemas.microsoft.com/office/drawing/2016/5/11/chartex" xmlns:cx6="http://schemas.microsoft.com/office/drawing/2016/5/12/chartex" xmlns:cx7="http://schemas.microsoft.com/office/drawing/2016/5/13/chartex" xmlns:cx8="http://schemas.microsoft.com/office/drawing/2016/5/14/chartex" xmlns:mc="http://schemas.openxmlformats.org/markup-compatibility/2006" xmlns:aink="http://schemas.microsoft.com/office/drawing/2016/ink" xmlns:am3d="http://schemas.microsoft.com/office/drawing/2017/model3d" xmlns:o="urn:schemas-microsoft-com:office:office" xmlns:oel="http://schemas.microsoft.com/office/2019/extlst" xmlns:r="http://schemas.openxmlformats.org/officeDocument/2006/relationships" xmlns:m="http://schemas.openxmlformats.org/officeDocument/2006/math" xmlns:v="urn:schemas-microsoft-com:vml" xmlns:wp14="http://schemas.microsoft.com/office/word/2010/wordprocessingDrawing" xmlns:wp="http://schemas.openxmlformats.org/drawingml/2006/wordprocessingDrawing" xmlns:w10="urn:schemas-microsoft-com:office:word" xmlns:w="http://schemas.openxmlformats.org/wordprocessingml/2006/main" xmlns:w14="http://schemas.microsoft.com/office/word/2010/wordml" xmlns:w15="http://schemas.microsoft.com/office/word/2012/wordml" xmlns:w16cex="http://schemas.microsoft.com/office/word/2018/wordml/cex" xmlns:w16cid="http://schemas.microsoft.com/office/word/2016/wordml/cid" xmlns:w16="http://schemas.microsoft.com/office/word/2018/wordml" xmlns:w16du="http://schemas.microsoft.com/office/word/2023/wordml/word16du" xmlns:w16sdtdh="http://schemas.microsoft.com/office/word/2020/wordml/sdtdatahash" xmlns:w16sdtfl="http://schemas.microsoft.com/office/word/2024/wordml/sdtformatlock" xmlns:w16se="http://schemas.microsoft.com/office/word/2015/wordml/symex" xmlns:wpg="http://schemas.microsoft.com/office/word/2010/wordprocessingGroup" xmlns:wpi="http://schemas.microsoft.com/office/word/2010/wordprocessingInk" xmlns:wne="http://schemas.microsoft.com/office/word/2006/wordml" xmlns:wps="http://schemas.microsoft.com/office/word/2010/wordprocessingShape" mc:Ignorable="w14 w15 w16se w16cid w16 w16cex w16sdtdh w16sdtfl w16du wp14">
+  <w:abstractNum w:abstractNumId="0" w15:restartNumberingAfterBreak="0">
+    <w:nsid w:val="235D4FB6"/>
     <w:multiLevelType w:val="hybridMultilevel"/>
-    <w:lvl w:ilvl="0" w15:tentative="1">
+    <w:tmpl w:val="5BB8074A"/>
+    <w:lvl w:ilvl="0" w:tplc="09787DD4">
       <w:start w:val="1"/>
       <w:numFmt w:val="bullet"/>
       <w:lvlText w:val="●"/>
@@ -2036,7 +2138,7 @@
         <w:ind w:left="720" w:hanging="360"/>
       </w:pPr>
     </w:lvl>
-    <w:lvl w:ilvl="1" w15:tentative="1">
+    <w:lvl w:ilvl="1" w:tplc="C3DA2B68">
       <w:start w:val="1"/>
       <w:numFmt w:val="bullet"/>
       <w:lvlText w:val="○"/>
@@ -2045,7 +2147,7 @@
         <w:ind w:left="1440" w:hanging="360"/>
       </w:pPr>
     </w:lvl>
-    <w:lvl w:ilvl="2" w15:tentative="1">
+    <w:lvl w:ilvl="2" w:tplc="9ECC8E7C">
       <w:start w:val="1"/>
       <w:numFmt w:val="bullet"/>
       <w:lvlText w:val="■"/>
@@ -2054,7 +2156,7 @@
         <w:ind w:left="2160" w:hanging="360"/>
       </w:pPr>
     </w:lvl>
-    <w:lvl w:ilvl="3" w15:tentative="1">
+    <w:lvl w:ilvl="3" w:tplc="AAA869B6">
       <w:start w:val="1"/>
       <w:numFmt w:val="bullet"/>
       <w:lvlText w:val="●"/>
@@ -2063,7 +2165,7 @@
         <w:ind w:left="2880" w:hanging="360"/>
       </w:pPr>
     </w:lvl>
-    <w:lvl w:ilvl="4" w15:tentative="1">
+    <w:lvl w:ilvl="4" w:tplc="D5641BC6">
       <w:start w:val="1"/>
       <w:numFmt w:val="bullet"/>
       <w:lvlText w:val="○"/>
@@ -2072,7 +2174,7 @@
         <w:ind w:left="3600" w:hanging="360"/>
       </w:pPr>
     </w:lvl>
-    <w:lvl w:ilvl="5" w15:tentative="1">
+    <w:lvl w:ilvl="5" w:tplc="DEFABD16">
       <w:start w:val="1"/>
       <w:numFmt w:val="bullet"/>
       <w:lvlText w:val="■"/>
@@ -2081,7 +2183,7 @@
         <w:ind w:left="4320" w:hanging="360"/>
       </w:pPr>
     </w:lvl>
-    <w:lvl w:ilvl="6" w15:tentative="1">
+    <w:lvl w:ilvl="6" w:tplc="A9603EFA">
       <w:start w:val="1"/>
       <w:numFmt w:val="bullet"/>
       <w:lvlText w:val="●"/>
@@ -2090,7 +2192,7 @@
         <w:ind w:left="5040" w:hanging="360"/>
       </w:pPr>
     </w:lvl>
-    <w:lvl w:ilvl="7" w15:tentative="1">
+    <w:lvl w:ilvl="7" w:tplc="65BA2B78">
       <w:start w:val="1"/>
       <w:numFmt w:val="bullet"/>
       <w:lvlText w:val="●"/>
@@ -2099,7 +2201,7 @@
         <w:ind w:left="5760" w:hanging="360"/>
       </w:pPr>
     </w:lvl>
-    <w:lvl w:ilvl="8" w15:tentative="1">
+    <w:lvl w:ilvl="8" w:tplc="F30A904E">
       <w:start w:val="1"/>
       <w:numFmt w:val="bullet"/>
       <w:lvlText w:val="●"/>
@@ -2109,9 +2211,11 @@
       </w:pPr>
     </w:lvl>
   </w:abstractNum>
-  <w:abstractNum w:abstractNumId="2" w15:restartNumberingAfterBreak="0">
+  <w:abstractNum w:abstractNumId="1" w15:restartNumberingAfterBreak="0">
+    <w:nsid w:val="5F6D318F"/>
     <w:multiLevelType w:val="hybridMultilevel"/>
-    <w:lvl w:ilvl="0" w15:tentative="1">
+    <w:tmpl w:val="E71CE1D4"/>
+    <w:lvl w:ilvl="0" w:tplc="2D241084">
       <w:start w:val="1"/>
       <w:numFmt w:val="bullet"/>
       <w:lvlText w:val="•"/>
@@ -2120,15 +2224,55 @@
         <w:ind w:left="540" w:hanging="280"/>
       </w:pPr>
     </w:lvl>
+    <w:lvl w:ilvl="1" w:tplc="0ACEBBA2">
+      <w:numFmt w:val="decimal"/>
+      <w:lvlText w:val=""/>
+      <w:lvlJc w:val="left"/>
+    </w:lvl>
+    <w:lvl w:ilvl="2" w:tplc="A8C2841C">
+      <w:numFmt w:val="decimal"/>
+      <w:lvlText w:val=""/>
+      <w:lvlJc w:val="left"/>
+    </w:lvl>
+    <w:lvl w:ilvl="3" w:tplc="C83643F0">
+      <w:numFmt w:val="decimal"/>
+      <w:lvlText w:val=""/>
+      <w:lvlJc w:val="left"/>
+    </w:lvl>
+    <w:lvl w:ilvl="4" w:tplc="B4629F4C">
+      <w:numFmt w:val="decimal"/>
+      <w:lvlText w:val=""/>
+      <w:lvlJc w:val="left"/>
+    </w:lvl>
+    <w:lvl w:ilvl="5" w:tplc="C322897E">
+      <w:numFmt w:val="decimal"/>
+      <w:lvlText w:val=""/>
+      <w:lvlJc w:val="left"/>
+    </w:lvl>
+    <w:lvl w:ilvl="6" w:tplc="381288DA">
+      <w:numFmt w:val="decimal"/>
+      <w:lvlText w:val=""/>
+      <w:lvlJc w:val="left"/>
+    </w:lvl>
+    <w:lvl w:ilvl="7" w:tplc="8834CE7A">
+      <w:numFmt w:val="decimal"/>
+      <w:lvlText w:val=""/>
+      <w:lvlJc w:val="left"/>
+    </w:lvl>
+    <w:lvl w:ilvl="8" w:tplc="D9F2A988">
+      <w:numFmt w:val="decimal"/>
+      <w:lvlText w:val=""/>
+      <w:lvlJc w:val="left"/>
+    </w:lvl>
   </w:abstractNum>
-  <w:num w:numId="1">
-    <w:abstractNumId w:val="1"/>
+  <w:num w:numId="1" w16cid:durableId="565148391">
+    <w:abstractNumId w:val="0"/>
     <w:lvlOverride w:ilvl="0">
       <w:startOverride w:val="1"/>
     </w:lvlOverride>
   </w:num>
-  <w:num w:numId="2">
-    <w:abstractNumId w:val="2"/>
+  <w:num w:numId="2" w16cid:durableId="109056771">
+    <w:abstractNumId w:val="1"/>
     <w:lvlOverride w:ilvl="0">
       <w:startOverride w:val="1"/>
     </w:lvlOverride>
@@ -2137,55 +2281,446 @@
 </file>
 
 <file path=word/styles.xml><?xml version="1.0" encoding="utf-8"?>
-<w:styles xmlns:mc="http://schemas.openxmlformats.org/markup-compatibility/2006" xmlns:r="http://schemas.openxmlformats.org/officeDocument/2006/relationships" xmlns:w="http://schemas.openxmlformats.org/wordprocessingml/2006/main" xmlns:w14="http://schemas.microsoft.com/office/word/2010/wordml" xmlns:w15="http://schemas.microsoft.com/office/word/2012/wordml" mc:Ignorable="w14 w15">
+<w:styles xmlns:mc="http://schemas.openxmlformats.org/markup-compatibility/2006" xmlns:r="http://schemas.openxmlformats.org/officeDocument/2006/relationships" xmlns:w="http://schemas.openxmlformats.org/wordprocessingml/2006/main" xmlns:w14="http://schemas.microsoft.com/office/word/2010/wordml" xmlns:w15="http://schemas.microsoft.com/office/word/2012/wordml" xmlns:w16cex="http://schemas.microsoft.com/office/word/2018/wordml/cex" xmlns:w16cid="http://schemas.microsoft.com/office/word/2016/wordml/cid" xmlns:w16="http://schemas.microsoft.com/office/word/2018/wordml" xmlns:w16du="http://schemas.microsoft.com/office/word/2023/wordml/word16du" xmlns:w16sdtdh="http://schemas.microsoft.com/office/word/2020/wordml/sdtdatahash" xmlns:w16sdtfl="http://schemas.microsoft.com/office/word/2024/wordml/sdtformatlock" xmlns:w16se="http://schemas.microsoft.com/office/word/2015/wordml/symex" mc:Ignorable="w14 w15 w16se w16cid w16 w16cex w16sdtdh w16sdtfl w16du">
   <w:docDefaults>
     <w:rPrDefault>
       <w:rPr>
-        <w:rFonts w:ascii="Arial" w:cs="Arial" w:eastAsia="Arial" w:hAnsi="Arial"/>
+        <w:rFonts w:ascii="Arial" w:eastAsia="Arial" w:hAnsi="Arial" w:cs="Arial"/>
         <w:color w:val="262626"/>
         <w:sz w:val="22"/>
         <w:szCs w:val="22"/>
+        <w:lang w:val="en-US" w:eastAsia="en-US" w:bidi="ar-SA"/>
       </w:rPr>
     </w:rPrDefault>
     <w:pPrDefault/>
   </w:docDefaults>
-  <w:style w:type="paragraph" w:styleId="Title">
-    <w:name w:val="Title"/>
-    <w:basedOn w:val="Normal"/>
-    <w:next w:val="Normal"/>
+  <w:latentStyles w:defLockedState="0" w:defUIPriority="99" w:defSemiHidden="0" w:defUnhideWhenUsed="0" w:defQFormat="0" w:count="376">
+    <w:lsdException w:name="Normal" w:uiPriority="0" w:qFormat="1"/>
+    <w:lsdException w:name="heading 1" w:uiPriority="9" w:qFormat="1"/>
+    <w:lsdException w:name="heading 2" w:semiHidden="1" w:uiPriority="9" w:unhideWhenUsed="1" w:qFormat="1"/>
+    <w:lsdException w:name="heading 3" w:semiHidden="1" w:uiPriority="9" w:unhideWhenUsed="1" w:qFormat="1"/>
+    <w:lsdException w:name="heading 4" w:semiHidden="1" w:uiPriority="9" w:unhideWhenUsed="1" w:qFormat="1"/>
+    <w:lsdException w:name="heading 5" w:semiHidden="1" w:uiPriority="9" w:unhideWhenUsed="1" w:qFormat="1"/>
+    <w:lsdException w:name="heading 6" w:semiHidden="1" w:uiPriority="9" w:unhideWhenUsed="1" w:qFormat="1"/>
+    <w:lsdException w:name="heading 7" w:semiHidden="1" w:uiPriority="9" w:unhideWhenUsed="1" w:qFormat="1"/>
+    <w:lsdException w:name="heading 8" w:semiHidden="1" w:uiPriority="9" w:unhideWhenUsed="1" w:qFormat="1"/>
+    <w:lsdException w:name="heading 9" w:semiHidden="1" w:uiPriority="9" w:unhideWhenUsed="1" w:qFormat="1"/>
+    <w:lsdException w:name="index 1" w:semiHidden="1" w:unhideWhenUsed="1"/>
+    <w:lsdException w:name="index 2" w:semiHidden="1" w:unhideWhenUsed="1"/>
+    <w:lsdException w:name="index 3" w:semiHidden="1" w:unhideWhenUsed="1"/>
+    <w:lsdException w:name="index 4" w:semiHidden="1" w:unhideWhenUsed="1"/>
+    <w:lsdException w:name="index 5" w:semiHidden="1" w:unhideWhenUsed="1"/>
+    <w:lsdException w:name="index 6" w:semiHidden="1" w:unhideWhenUsed="1"/>
+    <w:lsdException w:name="index 7" w:semiHidden="1" w:unhideWhenUsed="1"/>
+    <w:lsdException w:name="index 8" w:semiHidden="1" w:unhideWhenUsed="1"/>
+    <w:lsdException w:name="index 9" w:semiHidden="1" w:unhideWhenUsed="1"/>
+    <w:lsdException w:name="toc 1" w:semiHidden="1" w:uiPriority="39" w:unhideWhenUsed="1"/>
+    <w:lsdException w:name="toc 2" w:semiHidden="1" w:uiPriority="39" w:unhideWhenUsed="1"/>
+    <w:lsdException w:name="toc 3" w:semiHidden="1" w:uiPriority="39" w:unhideWhenUsed="1"/>
+    <w:lsdException w:name="toc 4" w:semiHidden="1" w:uiPriority="39" w:unhideWhenUsed="1"/>
+    <w:lsdException w:name="toc 5" w:semiHidden="1" w:uiPriority="39" w:unhideWhenUsed="1"/>
+    <w:lsdException w:name="toc 6" w:semiHidden="1" w:uiPriority="39" w:unhideWhenUsed="1"/>
+    <w:lsdException w:name="toc 7" w:semiHidden="1" w:uiPriority="39" w:unhideWhenUsed="1"/>
+    <w:lsdException w:name="toc 8" w:semiHidden="1" w:uiPriority="39" w:unhideWhenUsed="1"/>
+    <w:lsdException w:name="toc 9" w:semiHidden="1" w:uiPriority="39" w:unhideWhenUsed="1"/>
+    <w:lsdException w:name="Normal Indent" w:semiHidden="1" w:unhideWhenUsed="1"/>
+    <w:lsdException w:name="footnote text" w:semiHidden="1" w:unhideWhenUsed="1"/>
+    <w:lsdException w:name="annotation text" w:semiHidden="1" w:unhideWhenUsed="1"/>
+    <w:lsdException w:name="header" w:semiHidden="1" w:unhideWhenUsed="1"/>
+    <w:lsdException w:name="footer" w:semiHidden="1" w:unhideWhenUsed="1"/>
+    <w:lsdException w:name="index heading" w:semiHidden="1" w:unhideWhenUsed="1"/>
+    <w:lsdException w:name="caption" w:semiHidden="1" w:uiPriority="35" w:unhideWhenUsed="1" w:qFormat="1"/>
+    <w:lsdException w:name="table of figures" w:semiHidden="1" w:unhideWhenUsed="1"/>
+    <w:lsdException w:name="envelope address" w:semiHidden="1" w:unhideWhenUsed="1"/>
+    <w:lsdException w:name="envelope return" w:semiHidden="1" w:unhideWhenUsed="1"/>
+    <w:lsdException w:name="footnote reference" w:semiHidden="1" w:unhideWhenUsed="1"/>
+    <w:lsdException w:name="annotation reference" w:semiHidden="1" w:unhideWhenUsed="1"/>
+    <w:lsdException w:name="line number" w:semiHidden="1" w:unhideWhenUsed="1"/>
+    <w:lsdException w:name="page number" w:semiHidden="1" w:unhideWhenUsed="1"/>
+    <w:lsdException w:name="endnote reference" w:semiHidden="1" w:unhideWhenUsed="1"/>
+    <w:lsdException w:name="endnote text" w:semiHidden="1" w:unhideWhenUsed="1"/>
+    <w:lsdException w:name="table of authorities" w:semiHidden="1" w:unhideWhenUsed="1"/>
+    <w:lsdException w:name="macro" w:semiHidden="1" w:unhideWhenUsed="1"/>
+    <w:lsdException w:name="toa heading" w:semiHidden="1" w:unhideWhenUsed="1"/>
+    <w:lsdException w:name="List" w:semiHidden="1" w:unhideWhenUsed="1"/>
+    <w:lsdException w:name="List Bullet" w:semiHidden="1" w:unhideWhenUsed="1"/>
+    <w:lsdException w:name="List Number" w:semiHidden="1" w:unhideWhenUsed="1"/>
+    <w:lsdException w:name="List 2" w:semiHidden="1" w:unhideWhenUsed="1"/>
+    <w:lsdException w:name="List 3" w:semiHidden="1" w:unhideWhenUsed="1"/>
+    <w:lsdException w:name="List 4" w:semiHidden="1" w:unhideWhenUsed="1"/>
+    <w:lsdException w:name="List 5" w:semiHidden="1" w:unhideWhenUsed="1"/>
+    <w:lsdException w:name="List Bullet 2" w:semiHidden="1" w:unhideWhenUsed="1"/>
+    <w:lsdException w:name="List Bullet 3" w:semiHidden="1" w:unhideWhenUsed="1"/>
+    <w:lsdException w:name="List Bullet 4" w:semiHidden="1" w:unhideWhenUsed="1"/>
+    <w:lsdException w:name="List Bullet 5" w:semiHidden="1" w:unhideWhenUsed="1"/>
+    <w:lsdException w:name="List Number 2" w:semiHidden="1" w:unhideWhenUsed="1"/>
+    <w:lsdException w:name="List Number 3" w:semiHidden="1" w:unhideWhenUsed="1"/>
+    <w:lsdException w:name="List Number 4" w:semiHidden="1" w:unhideWhenUsed="1"/>
+    <w:lsdException w:name="List Number 5" w:semiHidden="1" w:unhideWhenUsed="1"/>
+    <w:lsdException w:name="Title" w:uiPriority="10" w:qFormat="1"/>
+    <w:lsdException w:name="Closing" w:semiHidden="1" w:unhideWhenUsed="1"/>
+    <w:lsdException w:name="Signature" w:semiHidden="1" w:unhideWhenUsed="1"/>
+    <w:lsdException w:name="Default Paragraph Font" w:semiHidden="1" w:uiPriority="1" w:unhideWhenUsed="1"/>
+    <w:lsdException w:name="Body Text" w:semiHidden="1" w:unhideWhenUsed="1"/>
+    <w:lsdException w:name="Body Text Indent" w:semiHidden="1" w:unhideWhenUsed="1"/>
+    <w:lsdException w:name="List Continue" w:semiHidden="1" w:unhideWhenUsed="1"/>
+    <w:lsdException w:name="List Continue 2" w:semiHidden="1" w:unhideWhenUsed="1"/>
+    <w:lsdException w:name="List Continue 3" w:semiHidden="1" w:unhideWhenUsed="1"/>
+    <w:lsdException w:name="List Continue 4" w:semiHidden="1" w:unhideWhenUsed="1"/>
+    <w:lsdException w:name="List Continue 5" w:semiHidden="1" w:unhideWhenUsed="1"/>
+    <w:lsdException w:name="Message Header" w:semiHidden="1" w:unhideWhenUsed="1"/>
+    <w:lsdException w:name="Subtitle" w:uiPriority="11" w:qFormat="1"/>
+    <w:lsdException w:name="Salutation" w:semiHidden="1" w:unhideWhenUsed="1"/>
+    <w:lsdException w:name="Date" w:semiHidden="1" w:unhideWhenUsed="1"/>
+    <w:lsdException w:name="Body Text First Indent" w:semiHidden="1" w:unhideWhenUsed="1"/>
+    <w:lsdException w:name="Body Text First Indent 2" w:semiHidden="1" w:unhideWhenUsed="1"/>
+    <w:lsdException w:name="Note Heading" w:semiHidden="1" w:unhideWhenUsed="1"/>
+    <w:lsdException w:name="Body Text 2" w:semiHidden="1" w:unhideWhenUsed="1"/>
+    <w:lsdException w:name="Body Text 3" w:semiHidden="1" w:unhideWhenUsed="1"/>
+    <w:lsdException w:name="Body Text Indent 2" w:semiHidden="1" w:unhideWhenUsed="1"/>
+    <w:lsdException w:name="Body Text Indent 3" w:semiHidden="1" w:unhideWhenUsed="1"/>
+    <w:lsdException w:name="Block Text" w:semiHidden="1" w:unhideWhenUsed="1"/>
+    <w:lsdException w:name="Hyperlink" w:semiHidden="1" w:unhideWhenUsed="1"/>
+    <w:lsdException w:name="FollowedHyperlink" w:semiHidden="1" w:unhideWhenUsed="1"/>
+    <w:lsdException w:name="Strong" w:uiPriority="22" w:qFormat="1"/>
+    <w:lsdException w:name="Emphasis" w:uiPriority="20" w:qFormat="1"/>
+    <w:lsdException w:name="Document Map" w:semiHidden="1" w:unhideWhenUsed="1"/>
+    <w:lsdException w:name="Plain Text" w:semiHidden="1" w:unhideWhenUsed="1"/>
+    <w:lsdException w:name="E-mail Signature" w:semiHidden="1" w:unhideWhenUsed="1"/>
+    <w:lsdException w:name="HTML Top of Form" w:semiHidden="1" w:unhideWhenUsed="1"/>
+    <w:lsdException w:name="HTML Bottom of Form" w:semiHidden="1" w:unhideWhenUsed="1"/>
+    <w:lsdException w:name="Normal (Web)" w:semiHidden="1" w:unhideWhenUsed="1"/>
+    <w:lsdException w:name="HTML Acronym" w:semiHidden="1" w:unhideWhenUsed="1"/>
+    <w:lsdException w:name="HTML Address" w:semiHidden="1" w:unhideWhenUsed="1"/>
+    <w:lsdException w:name="HTML Cite" w:semiHidden="1" w:unhideWhenUsed="1"/>
+    <w:lsdException w:name="HTML Code" w:semiHidden="1" w:unhideWhenUsed="1"/>
+    <w:lsdException w:name="HTML Definition" w:semiHidden="1" w:unhideWhenUsed="1"/>
+    <w:lsdException w:name="HTML Keyboard" w:semiHidden="1" w:unhideWhenUsed="1"/>
+    <w:lsdException w:name="HTML Preformatted" w:semiHidden="1" w:unhideWhenUsed="1"/>
+    <w:lsdException w:name="HTML Sample" w:semiHidden="1" w:unhideWhenUsed="1"/>
+    <w:lsdException w:name="HTML Typewriter" w:semiHidden="1" w:unhideWhenUsed="1"/>
+    <w:lsdException w:name="HTML Variable" w:semiHidden="1" w:unhideWhenUsed="1"/>
+    <w:lsdException w:name="Normal Table" w:semiHidden="1" w:unhideWhenUsed="1"/>
+    <w:lsdException w:name="annotation subject" w:semiHidden="1" w:unhideWhenUsed="1"/>
+    <w:lsdException w:name="No List" w:semiHidden="1" w:unhideWhenUsed="1"/>
+    <w:lsdException w:name="Outline List 1" w:semiHidden="1" w:unhideWhenUsed="1"/>
+    <w:lsdException w:name="Outline List 2" w:semiHidden="1" w:unhideWhenUsed="1"/>
+    <w:lsdException w:name="Outline List 3" w:semiHidden="1" w:unhideWhenUsed="1"/>
+    <w:lsdException w:name="Table Simple 1" w:semiHidden="1" w:unhideWhenUsed="1"/>
+    <w:lsdException w:name="Table Simple 2" w:semiHidden="1" w:unhideWhenUsed="1"/>
+    <w:lsdException w:name="Table Simple 3" w:semiHidden="1" w:unhideWhenUsed="1"/>
+    <w:lsdException w:name="Table Classic 1" w:semiHidden="1" w:unhideWhenUsed="1"/>
+    <w:lsdException w:name="Table Classic 2" w:semiHidden="1" w:unhideWhenUsed="1"/>
+    <w:lsdException w:name="Table Classic 3" w:semiHidden="1" w:unhideWhenUsed="1"/>
+    <w:lsdException w:name="Table Classic 4" w:semiHidden="1" w:unhideWhenUsed="1"/>
+    <w:lsdException w:name="Table Colorful 1" w:semiHidden="1" w:unhideWhenUsed="1"/>
+    <w:lsdException w:name="Table Colorful 2" w:semiHidden="1" w:unhideWhenUsed="1"/>
+    <w:lsdException w:name="Table Colorful 3" w:semiHidden="1" w:unhideWhenUsed="1"/>
+    <w:lsdException w:name="Table Columns 1" w:semiHidden="1" w:unhideWhenUsed="1"/>
+    <w:lsdException w:name="Table Columns 2" w:semiHidden="1" w:unhideWhenUsed="1"/>
+    <w:lsdException w:name="Table Columns 3" w:semiHidden="1" w:unhideWhenUsed="1"/>
+    <w:lsdException w:name="Table Columns 4" w:semiHidden="1" w:unhideWhenUsed="1"/>
+    <w:lsdException w:name="Table Columns 5" w:semiHidden="1" w:unhideWhenUsed="1"/>
+    <w:lsdException w:name="Table Grid 1" w:semiHidden="1" w:unhideWhenUsed="1"/>
+    <w:lsdException w:name="Table Grid 2" w:semiHidden="1" w:unhideWhenUsed="1"/>
+    <w:lsdException w:name="Table Grid 3" w:semiHidden="1" w:unhideWhenUsed="1"/>
+    <w:lsdException w:name="Table Grid 4" w:semiHidden="1" w:unhideWhenUsed="1"/>
+    <w:lsdException w:name="Table Grid 5" w:semiHidden="1" w:unhideWhenUsed="1"/>
+    <w:lsdException w:name="Table Grid 6" w:semiHidden="1" w:unhideWhenUsed="1"/>
+    <w:lsdException w:name="Table Grid 7" w:semiHidden="1" w:unhideWhenUsed="1"/>
+    <w:lsdException w:name="Table Grid 8" w:semiHidden="1" w:unhideWhenUsed="1"/>
+    <w:lsdException w:name="Table List 1" w:semiHidden="1" w:unhideWhenUsed="1"/>
+    <w:lsdException w:name="Table List 2" w:semiHidden="1" w:unhideWhenUsed="1"/>
+    <w:lsdException w:name="Table List 3" w:semiHidden="1" w:unhideWhenUsed="1"/>
+    <w:lsdException w:name="Table List 4" w:semiHidden="1" w:unhideWhenUsed="1"/>
+    <w:lsdException w:name="Table List 5" w:semiHidden="1" w:unhideWhenUsed="1"/>
+    <w:lsdException w:name="Table List 6" w:semiHidden="1" w:unhideWhenUsed="1"/>
+    <w:lsdException w:name="Table List 7" w:semiHidden="1" w:unhideWhenUsed="1"/>
+    <w:lsdException w:name="Table List 8" w:semiHidden="1" w:unhideWhenUsed="1"/>
+    <w:lsdException w:name="Table 3D effects 1" w:semiHidden="1" w:unhideWhenUsed="1"/>
+    <w:lsdException w:name="Table 3D effects 2" w:semiHidden="1" w:unhideWhenUsed="1"/>
+    <w:lsdException w:name="Table 3D effects 3" w:semiHidden="1" w:unhideWhenUsed="1"/>
+    <w:lsdException w:name="Table Contemporary" w:semiHidden="1" w:unhideWhenUsed="1"/>
+    <w:lsdException w:name="Table Elegant" w:semiHidden="1" w:unhideWhenUsed="1"/>
+    <w:lsdException w:name="Table Professional" w:semiHidden="1" w:unhideWhenUsed="1"/>
+    <w:lsdException w:name="Table Subtle 1" w:semiHidden="1" w:unhideWhenUsed="1"/>
+    <w:lsdException w:name="Table Subtle 2" w:semiHidden="1" w:unhideWhenUsed="1"/>
+    <w:lsdException w:name="Table Web 1" w:semiHidden="1" w:unhideWhenUsed="1"/>
+    <w:lsdException w:name="Table Web 2" w:semiHidden="1" w:unhideWhenUsed="1"/>
+    <w:lsdException w:name="Table Web 3" w:semiHidden="1" w:unhideWhenUsed="1"/>
+    <w:lsdException w:name="Balloon Text" w:semiHidden="1" w:unhideWhenUsed="1"/>
+    <w:lsdException w:name="Table Grid" w:uiPriority="39"/>
+    <w:lsdException w:name="Table Theme" w:semiHidden="1" w:unhideWhenUsed="1"/>
+    <w:lsdException w:name="Placeholder Text" w:semiHidden="1"/>
+    <w:lsdException w:name="No Spacing" w:uiPriority="1" w:qFormat="1"/>
+    <w:lsdException w:name="Light Shading" w:uiPriority="60"/>
+    <w:lsdException w:name="Light List" w:uiPriority="61"/>
+    <w:lsdException w:name="Light Grid" w:uiPriority="62"/>
+    <w:lsdException w:name="Medium Shading 1" w:uiPriority="63"/>
+    <w:lsdException w:name="Medium Shading 2" w:uiPriority="64"/>
+    <w:lsdException w:name="Medium List 1" w:uiPriority="65"/>
+    <w:lsdException w:name="Medium List 2" w:uiPriority="66"/>
+    <w:lsdException w:name="Medium Grid 1" w:uiPriority="67"/>
+    <w:lsdException w:name="Medium Grid 2" w:uiPriority="68"/>
+    <w:lsdException w:name="Medium Grid 3" w:uiPriority="69"/>
+    <w:lsdException w:name="Dark List" w:uiPriority="70"/>
+    <w:lsdException w:name="Colorful Shading" w:uiPriority="71"/>
+    <w:lsdException w:name="Colorful List" w:uiPriority="72"/>
+    <w:lsdException w:name="Colorful Grid" w:uiPriority="73"/>
+    <w:lsdException w:name="Light Shading Accent 1" w:uiPriority="60"/>
+    <w:lsdException w:name="Light List Accent 1" w:uiPriority="61"/>
+    <w:lsdException w:name="Light Grid Accent 1" w:uiPriority="62"/>
+    <w:lsdException w:name="Medium Shading 1 Accent 1" w:uiPriority="63"/>
+    <w:lsdException w:name="Medium Shading 2 Accent 1" w:uiPriority="64"/>
+    <w:lsdException w:name="Medium List 1 Accent 1" w:uiPriority="65"/>
+    <w:lsdException w:name="Revision" w:semiHidden="1"/>
+    <w:lsdException w:name="List Paragraph" w:uiPriority="34" w:qFormat="1"/>
+    <w:lsdException w:name="Quote" w:uiPriority="29" w:qFormat="1"/>
+    <w:lsdException w:name="Intense Quote" w:uiPriority="30" w:qFormat="1"/>
+    <w:lsdException w:name="Medium List 2 Accent 1" w:uiPriority="66"/>
+    <w:lsdException w:name="Medium Grid 1 Accent 1" w:uiPriority="67"/>
+    <w:lsdException w:name="Medium Grid 2 Accent 1" w:uiPriority="68"/>
+    <w:lsdException w:name="Medium Grid 3 Accent 1" w:uiPriority="69"/>
+    <w:lsdException w:name="Dark List Accent 1" w:uiPriority="70"/>
+    <w:lsdException w:name="Colorful Shading Accent 1" w:uiPriority="71"/>
+    <w:lsdException w:name="Colorful List Accent 1" w:uiPriority="72"/>
+    <w:lsdException w:name="Colorful Grid Accent 1" w:uiPriority="73"/>
+    <w:lsdException w:name="Light Shading Accent 2" w:uiPriority="60"/>
+    <w:lsdException w:name="Light List Accent 2" w:uiPriority="61"/>
+    <w:lsdException w:name="Light Grid Accent 2" w:uiPriority="62"/>
+    <w:lsdException w:name="Medium Shading 1 Accent 2" w:uiPriority="63"/>
+    <w:lsdException w:name="Medium Shading 2 Accent 2" w:uiPriority="64"/>
+    <w:lsdException w:name="Medium List 1 Accent 2" w:uiPriority="65"/>
+    <w:lsdException w:name="Medium List 2 Accent 2" w:uiPriority="66"/>
+    <w:lsdException w:name="Medium Grid 1 Accent 2" w:uiPriority="67"/>
+    <w:lsdException w:name="Medium Grid 2 Accent 2" w:uiPriority="68"/>
+    <w:lsdException w:name="Medium Grid 3 Accent 2" w:uiPriority="69"/>
+    <w:lsdException w:name="Dark List Accent 2" w:uiPriority="70"/>
+    <w:lsdException w:name="Colorful Shading Accent 2" w:uiPriority="71"/>
+    <w:lsdException w:name="Colorful List Accent 2" w:uiPriority="72"/>
+    <w:lsdException w:name="Colorful Grid Accent 2" w:uiPriority="73"/>
+    <w:lsdException w:name="Light Shading Accent 3" w:uiPriority="60"/>
+    <w:lsdException w:name="Light List Accent 3" w:uiPriority="61"/>
+    <w:lsdException w:name="Light Grid Accent 3" w:uiPriority="62"/>
+    <w:lsdException w:name="Medium Shading 1 Accent 3" w:uiPriority="63"/>
+    <w:lsdException w:name="Medium Shading 2 Accent 3" w:uiPriority="64"/>
+    <w:lsdException w:name="Medium List 1 Accent 3" w:uiPriority="65"/>
+    <w:lsdException w:name="Medium List 2 Accent 3" w:uiPriority="66"/>
+    <w:lsdException w:name="Medium Grid 1 Accent 3" w:uiPriority="67"/>
+    <w:lsdException w:name="Medium Grid 2 Accent 3" w:uiPriority="68"/>
+    <w:lsdException w:name="Medium Grid 3 Accent 3" w:uiPriority="69"/>
+    <w:lsdException w:name="Dark List Accent 3" w:uiPriority="70"/>
+    <w:lsdException w:name="Colorful Shading Accent 3" w:uiPriority="71"/>
+    <w:lsdException w:name="Colorful List Accent 3" w:uiPriority="72"/>
+    <w:lsdException w:name="Colorful Grid Accent 3" w:uiPriority="73"/>
+    <w:lsdException w:name="Light Shading Accent 4" w:uiPriority="60"/>
+    <w:lsdException w:name="Light List Accent 4" w:uiPriority="61"/>
+    <w:lsdException w:name="Light Grid Accent 4" w:uiPriority="62"/>
+    <w:lsdException w:name="Medium Shading 1 Accent 4" w:uiPriority="63"/>
+    <w:lsdException w:name="Medium Shading 2 Accent 4" w:uiPriority="64"/>
+    <w:lsdException w:name="Medium List 1 Accent 4" w:uiPriority="65"/>
+    <w:lsdException w:name="Medium List 2 Accent 4" w:uiPriority="66"/>
+    <w:lsdException w:name="Medium Grid 1 Accent 4" w:uiPriority="67"/>
+    <w:lsdException w:name="Medium Grid 2 Accent 4" w:uiPriority="68"/>
+    <w:lsdException w:name="Medium Grid 3 Accent 4" w:uiPriority="69"/>
+    <w:lsdException w:name="Dark List Accent 4" w:uiPriority="70"/>
+    <w:lsdException w:name="Colorful Shading Accent 4" w:uiPriority="71"/>
+    <w:lsdException w:name="Colorful List Accent 4" w:uiPriority="72"/>
+    <w:lsdException w:name="Colorful Grid Accent 4" w:uiPriority="73"/>
+    <w:lsdException w:name="Light Shading Accent 5" w:uiPriority="60"/>
+    <w:lsdException w:name="Light List Accent 5" w:uiPriority="61"/>
+    <w:lsdException w:name="Light Grid Accent 5" w:uiPriority="62"/>
+    <w:lsdException w:name="Medium Shading 1 Accent 5" w:uiPriority="63"/>
+    <w:lsdException w:name="Medium Shading 2 Accent 5" w:uiPriority="64"/>
+    <w:lsdException w:name="Medium List 1 Accent 5" w:uiPriority="65"/>
+    <w:lsdException w:name="Medium List 2 Accent 5" w:uiPriority="66"/>
+    <w:lsdException w:name="Medium Grid 1 Accent 5" w:uiPriority="67"/>
+    <w:lsdException w:name="Medium Grid 2 Accent 5" w:uiPriority="68"/>
+    <w:lsdException w:name="Medium Grid 3 Accent 5" w:uiPriority="69"/>
+    <w:lsdException w:name="Dark List Accent 5" w:uiPriority="70"/>
+    <w:lsdException w:name="Colorful Shading Accent 5" w:uiPriority="71"/>
+    <w:lsdException w:name="Colorful List Accent 5" w:uiPriority="72"/>
+    <w:lsdException w:name="Colorful Grid Accent 5" w:uiPriority="73"/>
+    <w:lsdException w:name="Light Shading Accent 6" w:uiPriority="60"/>
+    <w:lsdException w:name="Light List Accent 6" w:uiPriority="61"/>
+    <w:lsdException w:name="Light Grid Accent 6" w:uiPriority="62"/>
+    <w:lsdException w:name="Medium Shading 1 Accent 6" w:uiPriority="63"/>
+    <w:lsdException w:name="Medium Shading 2 Accent 6" w:uiPriority="64"/>
+    <w:lsdException w:name="Medium List 1 Accent 6" w:uiPriority="65"/>
+    <w:lsdException w:name="Medium List 2 Accent 6" w:uiPriority="66"/>
+    <w:lsdException w:name="Medium Grid 1 Accent 6" w:uiPriority="67"/>
+    <w:lsdException w:name="Medium Grid 2 Accent 6" w:uiPriority="68"/>
+    <w:lsdException w:name="Medium Grid 3 Accent 6" w:uiPriority="69"/>
+    <w:lsdException w:name="Dark List Accent 6" w:uiPriority="70"/>
+    <w:lsdException w:name="Colorful Shading Accent 6" w:uiPriority="71"/>
+    <w:lsdException w:name="Colorful List Accent 6" w:uiPriority="72"/>
+    <w:lsdException w:name="Colorful Grid Accent 6" w:uiPriority="73"/>
+    <w:lsdException w:name="Subtle Emphasis" w:uiPriority="19" w:qFormat="1"/>
+    <w:lsdException w:name="Intense Emphasis" w:uiPriority="21" w:qFormat="1"/>
+    <w:lsdException w:name="Subtle Reference" w:uiPriority="31" w:qFormat="1"/>
+    <w:lsdException w:name="Intense Reference" w:uiPriority="32" w:qFormat="1"/>
+    <w:lsdException w:name="Book Title" w:uiPriority="33" w:qFormat="1"/>
+    <w:lsdException w:name="Bibliography" w:semiHidden="1" w:uiPriority="37" w:unhideWhenUsed="1"/>
+    <w:lsdException w:name="TOC Heading" w:semiHidden="1" w:uiPriority="39" w:unhideWhenUsed="1" w:qFormat="1"/>
+    <w:lsdException w:name="Plain Table 1" w:uiPriority="41"/>
+    <w:lsdException w:name="Plain Table 2" w:uiPriority="42"/>
+    <w:lsdException w:name="Plain Table 3" w:uiPriority="43"/>
+    <w:lsdException w:name="Plain Table 4" w:uiPriority="44"/>
+    <w:lsdException w:name="Plain Table 5" w:uiPriority="45"/>
+    <w:lsdException w:name="Grid Table Light" w:uiPriority="40"/>
+    <w:lsdException w:name="Grid Table 1 Light" w:uiPriority="46"/>
+    <w:lsdException w:name="Grid Table 2" w:uiPriority="47"/>
+    <w:lsdException w:name="Grid Table 3" w:uiPriority="48"/>
+    <w:lsdException w:name="Grid Table 4" w:uiPriority="49"/>
+    <w:lsdException w:name="Grid Table 5 Dark" w:uiPriority="50"/>
+    <w:lsdException w:name="Grid Table 6 Colorful" w:uiPriority="51"/>
+    <w:lsdException w:name="Grid Table 7 Colorful" w:uiPriority="52"/>
+    <w:lsdException w:name="Grid Table 1 Light Accent 1" w:uiPriority="46"/>
+    <w:lsdException w:name="Grid Table 2 Accent 1" w:uiPriority="47"/>
+    <w:lsdException w:name="Grid Table 3 Accent 1" w:uiPriority="48"/>
+    <w:lsdException w:name="Grid Table 4 Accent 1" w:uiPriority="49"/>
+    <w:lsdException w:name="Grid Table 5 Dark Accent 1" w:uiPriority="50"/>
+    <w:lsdException w:name="Grid Table 6 Colorful Accent 1" w:uiPriority="51"/>
+    <w:lsdException w:name="Grid Table 7 Colorful Accent 1" w:uiPriority="52"/>
+    <w:lsdException w:name="Grid Table 1 Light Accent 2" w:uiPriority="46"/>
+    <w:lsdException w:name="Grid Table 2 Accent 2" w:uiPriority="47"/>
+    <w:lsdException w:name="Grid Table 3 Accent 2" w:uiPriority="48"/>
+    <w:lsdException w:name="Grid Table 4 Accent 2" w:uiPriority="49"/>
+    <w:lsdException w:name="Grid Table 5 Dark Accent 2" w:uiPriority="50"/>
+    <w:lsdException w:name="Grid Table 6 Colorful Accent 2" w:uiPriority="51"/>
+    <w:lsdException w:name="Grid Table 7 Colorful Accent 2" w:uiPriority="52"/>
+    <w:lsdException w:name="Grid Table 1 Light Accent 3" w:uiPriority="46"/>
+    <w:lsdException w:name="Grid Table 2 Accent 3" w:uiPriority="47"/>
+    <w:lsdException w:name="Grid Table 3 Accent 3" w:uiPriority="48"/>
+    <w:lsdException w:name="Grid Table 4 Accent 3" w:uiPriority="49"/>
+    <w:lsdException w:name="Grid Table 5 Dark Accent 3" w:uiPriority="50"/>
+    <w:lsdException w:name="Grid Table 6 Colorful Accent 3" w:uiPriority="51"/>
+    <w:lsdException w:name="Grid Table 7 Colorful Accent 3" w:uiPriority="52"/>
+    <w:lsdException w:name="Grid Table 1 Light Accent 4" w:uiPriority="46"/>
+    <w:lsdException w:name="Grid Table 2 Accent 4" w:uiPriority="47"/>
+    <w:lsdException w:name="Grid Table 3 Accent 4" w:uiPriority="48"/>
+    <w:lsdException w:name="Grid Table 4 Accent 4" w:uiPriority="49"/>
+    <w:lsdException w:name="Grid Table 5 Dark Accent 4" w:uiPriority="50"/>
+    <w:lsdException w:name="Grid Table 6 Colorful Accent 4" w:uiPriority="51"/>
+    <w:lsdException w:name="Grid Table 7 Colorful Accent 4" w:uiPriority="52"/>
+    <w:lsdException w:name="Grid Table 1 Light Accent 5" w:uiPriority="46"/>
+    <w:lsdException w:name="Grid Table 2 Accent 5" w:uiPriority="47"/>
+    <w:lsdException w:name="Grid Table 3 Accent 5" w:uiPriority="48"/>
+    <w:lsdException w:name="Grid Table 4 Accent 5" w:uiPriority="49"/>
+    <w:lsdException w:name="Grid Table 5 Dark Accent 5" w:uiPriority="50"/>
+    <w:lsdException w:name="Grid Table 6 Colorful Accent 5" w:uiPriority="51"/>
+    <w:lsdException w:name="Grid Table 7 Colorful Accent 5" w:uiPriority="52"/>
+    <w:lsdException w:name="Grid Table 1 Light Accent 6" w:uiPriority="46"/>
+    <w:lsdException w:name="Grid Table 2 Accent 6" w:uiPriority="47"/>
+    <w:lsdException w:name="Grid Table 3 Accent 6" w:uiPriority="48"/>
+    <w:lsdException w:name="Grid Table 4 Accent 6" w:uiPriority="49"/>
+    <w:lsdException w:name="Grid Table 5 Dark Accent 6" w:uiPriority="50"/>
+    <w:lsdException w:name="Grid Table 6 Colorful Accent 6" w:uiPriority="51"/>
+    <w:lsdException w:name="Grid Table 7 Colorful Accent 6" w:uiPriority="52"/>
+    <w:lsdException w:name="List Table 1 Light" w:uiPriority="46"/>
+    <w:lsdException w:name="List Table 2" w:uiPriority="47"/>
+    <w:lsdException w:name="List Table 3" w:uiPriority="48"/>
+    <w:lsdException w:name="List Table 4" w:uiPriority="49"/>
+    <w:lsdException w:name="List Table 5 Dark" w:uiPriority="50"/>
+    <w:lsdException w:name="List Table 6 Colorful" w:uiPriority="51"/>
+    <w:lsdException w:name="List Table 7 Colorful" w:uiPriority="52"/>
+    <w:lsdException w:name="List Table 1 Light Accent 1" w:uiPriority="46"/>
+    <w:lsdException w:name="List Table 2 Accent 1" w:uiPriority="47"/>
+    <w:lsdException w:name="List Table 3 Accent 1" w:uiPriority="48"/>
+    <w:lsdException w:name="List Table 4 Accent 1" w:uiPriority="49"/>
+    <w:lsdException w:name="List Table 5 Dark Accent 1" w:uiPriority="50"/>
+    <w:lsdException w:name="List Table 6 Colorful Accent 1" w:uiPriority="51"/>
+    <w:lsdException w:name="List Table 7 Colorful Accent 1" w:uiPriority="52"/>
+    <w:lsdException w:name="List Table 1 Light Accent 2" w:uiPriority="46"/>
+    <w:lsdException w:name="List Table 2 Accent 2" w:uiPriority="47"/>
+    <w:lsdException w:name="List Table 3 Accent 2" w:uiPriority="48"/>
+    <w:lsdException w:name="List Table 4 Accent 2" w:uiPriority="49"/>
+    <w:lsdException w:name="List Table 5 Dark Accent 2" w:uiPriority="50"/>
+    <w:lsdException w:name="List Table 6 Colorful Accent 2" w:uiPriority="51"/>
+    <w:lsdException w:name="List Table 7 Colorful Accent 2" w:uiPriority="52"/>
+    <w:lsdException w:name="List Table 1 Light Accent 3" w:uiPriority="46"/>
+    <w:lsdException w:name="List Table 2 Accent 3" w:uiPriority="47"/>
+    <w:lsdException w:name="List Table 3 Accent 3" w:uiPriority="48"/>
+    <w:lsdException w:name="List Table 4 Accent 3" w:uiPriority="49"/>
+    <w:lsdException w:name="List Table 5 Dark Accent 3" w:uiPriority="50"/>
+    <w:lsdException w:name="List Table 6 Colorful Accent 3" w:uiPriority="51"/>
+    <w:lsdException w:name="List Table 7 Colorful Accent 3" w:uiPriority="52"/>
+    <w:lsdException w:name="List Table 1 Light Accent 4" w:uiPriority="46"/>
+    <w:lsdException w:name="List Table 2 Accent 4" w:uiPriority="47"/>
+    <w:lsdException w:name="List Table 3 Accent 4" w:uiPriority="48"/>
+    <w:lsdException w:name="List Table 4 Accent 4" w:uiPriority="49"/>
+    <w:lsdException w:name="List Table 5 Dark Accent 4" w:uiPriority="50"/>
+    <w:lsdException w:name="List Table 6 Colorful Accent 4" w:uiPriority="51"/>
+    <w:lsdException w:name="List Table 7 Colorful Accent 4" w:uiPriority="52"/>
+    <w:lsdException w:name="List Table 1 Light Accent 5" w:uiPriority="46"/>
+    <w:lsdException w:name="List Table 2 Accent 5" w:uiPriority="47"/>
+    <w:lsdException w:name="List Table 3 Accent 5" w:uiPriority="48"/>
+    <w:lsdException w:name="List Table 4 Accent 5" w:uiPriority="49"/>
+    <w:lsdException w:name="List Table 5 Dark Accent 5" w:uiPriority="50"/>
+    <w:lsdException w:name="List Table 6 Colorful Accent 5" w:uiPriority="51"/>
+    <w:lsdException w:name="List Table 7 Colorful Accent 5" w:uiPriority="52"/>
+    <w:lsdException w:name="List Table 1 Light Accent 6" w:uiPriority="46"/>
+    <w:lsdException w:name="List Table 2 Accent 6" w:uiPriority="47"/>
+    <w:lsdException w:name="List Table 3 Accent 6" w:uiPriority="48"/>
+    <w:lsdException w:name="List Table 4 Accent 6" w:uiPriority="49"/>
+    <w:lsdException w:name="List Table 5 Dark Accent 6" w:uiPriority="50"/>
+    <w:lsdException w:name="List Table 6 Colorful Accent 6" w:uiPriority="51"/>
+    <w:lsdException w:name="List Table 7 Colorful Accent 6" w:uiPriority="52"/>
+    <w:lsdException w:name="Mention" w:semiHidden="1" w:unhideWhenUsed="1"/>
+    <w:lsdException w:name="Smart Hyperlink" w:semiHidden="1" w:unhideWhenUsed="1"/>
+    <w:lsdException w:name="Hashtag" w:semiHidden="1" w:unhideWhenUsed="1"/>
+    <w:lsdException w:name="Unresolved Mention" w:semiHidden="1" w:unhideWhenUsed="1"/>
+    <w:lsdException w:name="Smart Link" w:semiHidden="1" w:unhideWhenUsed="1"/>
+  </w:latentStyles>
+  <w:style w:type="paragraph" w:default="1" w:styleId="Normal">
+    <w:name w:val="Normal"/>
     <w:qFormat/>
-    <w:rPr>
-      <w:sz w:val="56"/>
-      <w:szCs w:val="56"/>
-    </w:rPr>
   </w:style>
   <w:style w:type="paragraph" w:styleId="Heading1">
-    <w:name w:val="Heading 1"/>
-    <w:basedOn w:val="Normal"/>
-    <w:next w:val="Normal"/>
+    <w:name w:val="heading 1"/>
+    <w:uiPriority w:val="9"/>
     <w:qFormat/>
+    <w:pPr>
+      <w:pBdr>
+        <w:bottom w:val="single" w:sz="6" w:space="4" w:color="2E75B6"/>
+      </w:pBdr>
+      <w:spacing w:before="320" w:after="160"/>
+      <w:outlineLvl w:val="0"/>
+    </w:pPr>
     <w:rPr>
-      <w:color w:val="2E74B5"/>
-      <w:sz w:val="32"/>
-      <w:szCs w:val="32"/>
+      <w:b/>
+      <w:bCs/>
+      <w:color w:val="1F3A5F"/>
+      <w:sz w:val="30"/>
+      <w:szCs w:val="30"/>
     </w:rPr>
   </w:style>
   <w:style w:type="paragraph" w:styleId="Heading2">
-    <w:name w:val="Heading 2"/>
-    <w:basedOn w:val="Normal"/>
-    <w:next w:val="Normal"/>
+    <w:name w:val="heading 2"/>
+    <w:uiPriority w:val="9"/>
+    <w:unhideWhenUsed/>
     <w:qFormat/>
+    <w:pPr>
+      <w:spacing w:before="240" w:after="100"/>
+      <w:outlineLvl w:val="1"/>
+    </w:pPr>
     <w:rPr>
-      <w:color w:val="2E74B5"/>
-      <w:sz w:val="26"/>
-      <w:szCs w:val="26"/>
+      <w:b/>
+      <w:bCs/>
+      <w:color w:val="2E75B6"/>
+      <w:sz w:val="24"/>
+      <w:szCs w:val="24"/>
     </w:rPr>
   </w:style>
   <w:style w:type="paragraph" w:styleId="Heading3">
-    <w:name w:val="Heading 3"/>
-    <w:basedOn w:val="Normal"/>
-    <w:next w:val="Normal"/>
+    <w:name w:val="heading 3"/>
+    <w:uiPriority w:val="9"/>
+    <w:semiHidden/>
+    <w:unhideWhenUsed/>
     <w:qFormat/>
+    <w:pPr>
+      <w:outlineLvl w:val="2"/>
+    </w:pPr>
     <w:rPr>
       <w:color w:val="1F4D78"/>
       <w:sz w:val="24"/>
@@ -2193,10 +2728,14 @@
     </w:rPr>
   </w:style>
   <w:style w:type="paragraph" w:styleId="Heading4">
-    <w:name w:val="Heading 4"/>
-    <w:basedOn w:val="Normal"/>
-    <w:next w:val="Normal"/>
+    <w:name w:val="heading 4"/>
+    <w:uiPriority w:val="9"/>
+    <w:semiHidden/>
+    <w:unhideWhenUsed/>
     <w:qFormat/>
+    <w:pPr>
+      <w:outlineLvl w:val="3"/>
+    </w:pPr>
     <w:rPr>
       <w:i/>
       <w:iCs/>
@@ -2204,27 +2743,69 @@
     </w:rPr>
   </w:style>
   <w:style w:type="paragraph" w:styleId="Heading5">
-    <w:name w:val="Heading 5"/>
-    <w:basedOn w:val="Normal"/>
-    <w:next w:val="Normal"/>
+    <w:name w:val="heading 5"/>
+    <w:uiPriority w:val="9"/>
+    <w:semiHidden/>
+    <w:unhideWhenUsed/>
     <w:qFormat/>
+    <w:pPr>
+      <w:outlineLvl w:val="4"/>
+    </w:pPr>
     <w:rPr>
       <w:color w:val="2E74B5"/>
     </w:rPr>
   </w:style>
   <w:style w:type="paragraph" w:styleId="Heading6">
-    <w:name w:val="Heading 6"/>
-    <w:basedOn w:val="Normal"/>
-    <w:next w:val="Normal"/>
+    <w:name w:val="heading 6"/>
+    <w:uiPriority w:val="9"/>
+    <w:semiHidden/>
+    <w:unhideWhenUsed/>
     <w:qFormat/>
+    <w:pPr>
+      <w:outlineLvl w:val="5"/>
+    </w:pPr>
     <w:rPr>
       <w:color w:val="1F4D78"/>
     </w:rPr>
   </w:style>
-  <w:style w:type="paragraph" w:styleId="Strong">
-    <w:name w:val="Strong"/>
-    <w:basedOn w:val="Normal"/>
-    <w:next w:val="Normal"/>
+  <w:style w:type="character" w:default="1" w:styleId="DefaultParagraphFont">
+    <w:name w:val="Default Paragraph Font"/>
+    <w:uiPriority w:val="1"/>
+    <w:semiHidden/>
+    <w:unhideWhenUsed/>
+  </w:style>
+  <w:style w:type="table" w:default="1" w:styleId="TableNormal">
+    <w:name w:val="Normal Table"/>
+    <w:uiPriority w:val="99"/>
+    <w:semiHidden/>
+    <w:unhideWhenUsed/>
+    <w:tblPr>
+      <w:tblInd w:w="0" w:type="dxa"/>
+      <w:tblCellMar>
+        <w:top w:w="0" w:type="dxa"/>
+        <w:left w:w="108" w:type="dxa"/>
+        <w:bottom w:w="0" w:type="dxa"/>
+        <w:right w:w="108" w:type="dxa"/>
+      </w:tblCellMar>
+    </w:tblPr>
+  </w:style>
+  <w:style w:type="numbering" w:default="1" w:styleId="NoList">
+    <w:name w:val="No List"/>
+    <w:uiPriority w:val="99"/>
+    <w:semiHidden/>
+    <w:unhideWhenUsed/>
+  </w:style>
+  <w:style w:type="paragraph" w:styleId="Title">
+    <w:name w:val="Title"/>
+    <w:uiPriority w:val="10"/>
+    <w:qFormat/>
+    <w:rPr>
+      <w:sz w:val="56"/>
+      <w:szCs w:val="56"/>
+    </w:rPr>
+  </w:style>
+  <w:style w:type="paragraph" w:customStyle="1" w:styleId="Strong1">
+    <w:name w:val="Strong1"/>
     <w:qFormat/>
     <w:rPr>
       <w:b/>
@@ -2233,12 +2814,10 @@
   </w:style>
   <w:style w:type="paragraph" w:styleId="ListParagraph">
     <w:name w:val="List Paragraph"/>
-    <w:basedOn w:val="Normal"/>
     <w:qFormat/>
   </w:style>
   <w:style w:type="character" w:styleId="Hyperlink">
     <w:name w:val="Hyperlink"/>
-    <w:basedOn w:val="DefaultParagraphFont"/>
     <w:uiPriority w:val="99"/>
     <w:unhideWhenUsed/>
     <w:rPr>
@@ -2248,7 +2827,6 @@
   </w:style>
   <w:style w:type="character" w:styleId="FootnoteReference">
     <w:name w:val="footnote reference"/>
-    <w:basedOn w:val="DefaultParagraphFont"/>
     <w:uiPriority w:val="99"/>
     <w:semiHidden/>
     <w:unhideWhenUsed/>
@@ -2258,22 +2836,17 @@
   </w:style>
   <w:style w:type="paragraph" w:styleId="FootnoteText">
     <w:name w:val="footnote text"/>
-    <w:basedOn w:val="Normal"/>
     <w:link w:val="FootnoteTextChar"/>
     <w:uiPriority w:val="99"/>
     <w:semiHidden/>
     <w:unhideWhenUsed/>
-    <w:pPr>
-      <w:spacing w:after="0" w:line="240" w:lineRule="auto"/>
-    </w:pPr>
     <w:rPr>
       <w:sz w:val="20"/>
       <w:szCs w:val="20"/>
     </w:rPr>
   </w:style>
-  <w:style w:type="character" w:styleId="FootnoteTextChar">
+  <w:style w:type="character" w:customStyle="1" w:styleId="FootnoteTextChar">
     <w:name w:val="Footnote Text Char"/>
-    <w:basedOn w:val="DefaultParagraphFont"/>
     <w:link w:val="FootnoteText"/>
     <w:uiPriority w:val="99"/>
     <w:semiHidden/>
@@ -2285,7 +2858,6 @@
   </w:style>
   <w:style w:type="character" w:styleId="EndnoteReference">
     <w:name w:val="endnote reference"/>
-    <w:basedOn w:val="DefaultParagraphFont"/>
     <w:uiPriority w:val="99"/>
     <w:semiHidden/>
     <w:unhideWhenUsed/>
@@ -2295,22 +2867,17 @@
   </w:style>
   <w:style w:type="paragraph" w:styleId="EndnoteText">
     <w:name w:val="endnote text"/>
-    <w:basedOn w:val="Normal"/>
     <w:link w:val="EndnoteTextChar"/>
     <w:uiPriority w:val="99"/>
     <w:semiHidden/>
     <w:unhideWhenUsed/>
-    <w:pPr>
-      <w:spacing w:after="0" w:line="240" w:lineRule="auto"/>
-    </w:pPr>
     <w:rPr>
       <w:sz w:val="20"/>
       <w:szCs w:val="20"/>
     </w:rPr>
   </w:style>
-  <w:style w:type="character" w:styleId="EndnoteTextChar">
+  <w:style w:type="character" w:customStyle="1" w:styleId="EndnoteTextChar">
     <w:name w:val="Endnote Text Char"/>
-    <w:basedOn w:val="DefaultParagraphFont"/>
     <w:link w:val="EndnoteText"/>
     <w:uiPriority w:val="99"/>
     <w:semiHidden/>
@@ -2320,44 +2887,300 @@
       <w:szCs w:val="20"/>
     </w:rPr>
   </w:style>
-  <w:style w:type="paragraph" w:styleId="Heading1">
-    <w:name w:val="Heading 1"/>
-    <w:basedOn w:val="Normal"/>
-    <w:next w:val="Normal"/>
-    <w:qFormat/>
-    <w:pPr>
-      <w:pBdr>
-        <w:bottom w:val="single" w:color="2E75B6" w:sz="6" w:space="4"/>
-      </w:pBdr>
-      <w:spacing w:after="160" w:before="320"/>
-      <w:outlineLvl w:val="0"/>
-    </w:pPr>
-    <w:rPr>
-      <w:rFonts w:ascii="Arial" w:cs="Arial" w:eastAsia="Arial" w:hAnsi="Arial"/>
-      <w:b/>
-      <w:bCs/>
-      <w:color w:val="1F3A5F"/>
-      <w:sz w:val="30"/>
-      <w:szCs w:val="30"/>
-    </w:rPr>
-  </w:style>
-  <w:style w:type="paragraph" w:styleId="Heading2">
-    <w:name w:val="Heading 2"/>
-    <w:basedOn w:val="Normal"/>
-    <w:next w:val="Normal"/>
-    <w:qFormat/>
-    <w:pPr>
-      <w:spacing w:after="100" w:before="240"/>
-      <w:outlineLvl w:val="1"/>
-    </w:pPr>
-    <w:rPr>
-      <w:rFonts w:ascii="Arial" w:cs="Arial" w:eastAsia="Arial" w:hAnsi="Arial"/>
-      <w:b/>
-      <w:bCs/>
-      <w:color w:val="2E75B6"/>
-      <w:sz w:val="24"/>
-      <w:szCs w:val="24"/>
-    </w:rPr>
-  </w:style>
 </w:styles>
+</file>
+
+<file path=word/theme/theme1.xml><?xml version="1.0" encoding="utf-8"?>
+<a:theme xmlns:a="http://schemas.openxmlformats.org/drawingml/2006/main" name="Office Theme">
+  <a:themeElements>
+    <a:clrScheme name="Office">
+      <a:dk1>
+        <a:sysClr val="windowText" lastClr="000000"/>
+      </a:dk1>
+      <a:lt1>
+        <a:sysClr val="window" lastClr="FFFFFF"/>
+      </a:lt1>
+      <a:dk2>
+        <a:srgbClr val="44546A"/>
+      </a:dk2>
+      <a:lt2>
+        <a:srgbClr val="E7E6E6"/>
+      </a:lt2>
+      <a:accent1>
+        <a:srgbClr val="4472C4"/>
+      </a:accent1>
+      <a:accent2>
+        <a:srgbClr val="ED7D31"/>
+      </a:accent2>
+      <a:accent3>
+        <a:srgbClr val="A5A5A5"/>
+      </a:accent3>
+      <a:accent4>
+        <a:srgbClr val="FFC000"/>
+      </a:accent4>
+      <a:accent5>
+        <a:srgbClr val="5B9BD5"/>
+      </a:accent5>
+      <a:accent6>
+        <a:srgbClr val="70AD47"/>
+      </a:accent6>
+      <a:hlink>
+        <a:srgbClr val="0563C1"/>
+      </a:hlink>
+      <a:folHlink>
+        <a:srgbClr val="954F72"/>
+      </a:folHlink>
+    </a:clrScheme>
+    <a:fontScheme name="Office">
+      <a:majorFont>
+        <a:latin typeface="Calibri Light" panose="020F0302020204030204"/>
+        <a:ea typeface=""/>
+        <a:cs typeface=""/>
+        <a:font script="Jpan" typeface="游ゴシック Light"/>
+        <a:font script="Hang" typeface="맑은 고딕"/>
+        <a:font script="Hans" typeface="等线 Light"/>
+        <a:font script="Hant" typeface="新細明體"/>
+        <a:font script="Arab" typeface="Times New Roman"/>
+        <a:font script="Hebr" typeface="Times New Roman"/>
+        <a:font script="Thai" typeface="Angsana New"/>
+        <a:font script="Ethi" typeface="Nyala"/>
+        <a:font script="Beng" typeface="Vrinda"/>
+        <a:font script="Gujr" typeface="Shruti"/>
+        <a:font script="Khmr" typeface="MoolBoran"/>
+        <a:font script="Knda" typeface="Tunga"/>
+        <a:font script="Guru" typeface="Raavi"/>
+        <a:font script="Cans" typeface="Euphemia"/>
+        <a:font script="Cher" typeface="Plantagenet Cherokee"/>
+        <a:font script="Yiii" typeface="Microsoft Yi Baiti"/>
+        <a:font script="Tibt" typeface="Microsoft Himalaya"/>
+        <a:font script="Thaa" typeface="MV Boli"/>
+        <a:font script="Deva" typeface="Mangal"/>
+        <a:font script="Telu" typeface="Gautami"/>
+        <a:font script="Taml" typeface="Latha"/>
+        <a:font script="Syrc" typeface="Estrangelo Edessa"/>
+        <a:font script="Orya" typeface="Kalinga"/>
+        <a:font script="Mlym" typeface="Kartika"/>
+        <a:font script="Laoo" typeface="DokChampa"/>
+        <a:font script="Sinh" typeface="Iskoola Pota"/>
+        <a:font script="Mong" typeface="Mongolian Baiti"/>
+        <a:font script="Viet" typeface="Times New Roman"/>
+        <a:font script="Uigh" typeface="Microsoft Uighur"/>
+        <a:font script="Geor" typeface="Sylfaen"/>
+        <a:font script="Armn" typeface="Arial"/>
+        <a:font script="Bugi" typeface="Leelawadee UI"/>
+        <a:font script="Bopo" typeface="Microsoft JhengHei"/>
+        <a:font script="Java" typeface="Javanese Text"/>
+        <a:font script="Lisu" typeface="Segoe UI"/>
+        <a:font script="Mymr" typeface="Myanmar Text"/>
+        <a:font script="Nkoo" typeface="Ebrima"/>
+        <a:font script="Olck" typeface="Nirmala UI"/>
+        <a:font script="Osma" typeface="Ebrima"/>
+        <a:font script="Phag" typeface="Phagspa"/>
+        <a:font script="Syrn" typeface="Estrangelo Edessa"/>
+        <a:font script="Syrj" typeface="Estrangelo Edessa"/>
+        <a:font script="Syre" typeface="Estrangelo Edessa"/>
+        <a:font script="Sora" typeface="Nirmala UI"/>
+        <a:font script="Tale" typeface="Microsoft Tai Le"/>
+        <a:font script="Talu" typeface="Microsoft New Tai Lue"/>
+        <a:font script="Tfng" typeface="Ebrima"/>
+      </a:majorFont>
+      <a:minorFont>
+        <a:latin typeface="Calibri" panose="020F0502020204030204"/>
+        <a:ea typeface=""/>
+        <a:cs typeface=""/>
+        <a:font script="Jpan" typeface="游明朝"/>
+        <a:font script="Hang" typeface="맑은 고딕"/>
+        <a:font script="Hans" typeface="等线"/>
+        <a:font script="Hant" typeface="新細明體"/>
+        <a:font script="Arab" typeface="Arial"/>
+        <a:font script="Hebr" typeface="Arial"/>
+        <a:font script="Thai" typeface="Cordia New"/>
+        <a:font script="Ethi" typeface="Nyala"/>
+        <a:font script="Beng" typeface="Vrinda"/>
+        <a:font script="Gujr" typeface="Shruti"/>
+        <a:font script="Khmr" typeface="DaunPenh"/>
+        <a:font script="Knda" typeface="Tunga"/>
+        <a:font script="Guru" typeface="Raavi"/>
+        <a:font script="Cans" typeface="Euphemia"/>
+        <a:font script="Cher" typeface="Plantagenet Cherokee"/>
+        <a:font script="Yiii" typeface="Microsoft Yi Baiti"/>
+        <a:font script="Tibt" typeface="Microsoft Himalaya"/>
+        <a:font script="Thaa" typeface="MV Boli"/>
+        <a:font script="Deva" typeface="Mangal"/>
+        <a:font script="Telu" typeface="Gautami"/>
+        <a:font script="Taml" typeface="Latha"/>
+        <a:font script="Syrc" typeface="Estrangelo Edessa"/>
+        <a:font script="Orya" typeface="Kalinga"/>
+        <a:font script="Mlym" typeface="Kartika"/>
+        <a:font script="Laoo" typeface="DokChampa"/>
+        <a:font script="Sinh" typeface="Iskoola Pota"/>
+        <a:font script="Mong" typeface="Mongolian Baiti"/>
+        <a:font script="Viet" typeface="Arial"/>
+        <a:font script="Uigh" typeface="Microsoft Uighur"/>
+        <a:font script="Geor" typeface="Sylfaen"/>
+        <a:font script="Armn" typeface="Arial"/>
+        <a:font script="Bugi" typeface="Leelawadee UI"/>
+        <a:font script="Bopo" typeface="Microsoft JhengHei"/>
+        <a:font script="Java" typeface="Javanese Text"/>
+        <a:font script="Lisu" typeface="Segoe UI"/>
+        <a:font script="Mymr" typeface="Myanmar Text"/>
+        <a:font script="Nkoo" typeface="Ebrima"/>
+        <a:font script="Olck" typeface="Nirmala UI"/>
+        <a:font script="Osma" typeface="Ebrima"/>
+        <a:font script="Phag" typeface="Phagspa"/>
+        <a:font script="Syrn" typeface="Estrangelo Edessa"/>
+        <a:font script="Syrj" typeface="Estrangelo Edessa"/>
+        <a:font script="Syre" typeface="Estrangelo Edessa"/>
+        <a:font script="Sora" typeface="Nirmala UI"/>
+        <a:font script="Tale" typeface="Microsoft Tai Le"/>
+        <a:font script="Talu" typeface="Microsoft New Tai Lue"/>
+        <a:font script="Tfng" typeface="Ebrima"/>
+      </a:minorFont>
+    </a:fontScheme>
+    <a:fmtScheme name="Office">
+      <a:fillStyleLst>
+        <a:solidFill>
+          <a:schemeClr val="phClr"/>
+        </a:solidFill>
+        <a:gradFill rotWithShape="1">
+          <a:gsLst>
+            <a:gs pos="0">
+              <a:schemeClr val="phClr">
+                <a:lumMod val="110000"/>
+                <a:satMod val="105000"/>
+                <a:tint val="67000"/>
+              </a:schemeClr>
+            </a:gs>
+            <a:gs pos="50000">
+              <a:schemeClr val="phClr">
+                <a:lumMod val="105000"/>
+                <a:satMod val="103000"/>
+                <a:tint val="73000"/>
+              </a:schemeClr>
+            </a:gs>
+            <a:gs pos="100000">
+              <a:schemeClr val="phClr">
+                <a:lumMod val="105000"/>
+                <a:satMod val="109000"/>
+                <a:tint val="81000"/>
+              </a:schemeClr>
+            </a:gs>
+          </a:gsLst>
+          <a:lin ang="5400000" scaled="0"/>
+        </a:gradFill>
+        <a:gradFill rotWithShape="1">
+          <a:gsLst>
+            <a:gs pos="0">
+              <a:schemeClr val="phClr">
+                <a:satMod val="103000"/>
+                <a:lumMod val="102000"/>
+                <a:tint val="94000"/>
+              </a:schemeClr>
+            </a:gs>
+            <a:gs pos="50000">
+              <a:schemeClr val="phClr">
+                <a:satMod val="110000"/>
+                <a:lumMod val="100000"/>
+                <a:shade val="100000"/>
+              </a:schemeClr>
+            </a:gs>
+            <a:gs pos="100000">
+              <a:schemeClr val="phClr">
+                <a:lumMod val="99000"/>
+                <a:satMod val="120000"/>
+                <a:shade val="78000"/>
+              </a:schemeClr>
+            </a:gs>
+          </a:gsLst>
+          <a:lin ang="5400000" scaled="0"/>
+        </a:gradFill>
+      </a:fillStyleLst>
+      <a:lnStyleLst>
+        <a:ln w="6350" cap="flat" cmpd="sng" algn="ctr">
+          <a:solidFill>
+            <a:schemeClr val="phClr"/>
+          </a:solidFill>
+          <a:prstDash val="solid"/>
+          <a:miter lim="800000"/>
+        </a:ln>
+        <a:ln w="12700" cap="flat" cmpd="sng" algn="ctr">
+          <a:solidFill>
+            <a:schemeClr val="phClr"/>
+          </a:solidFill>
+          <a:prstDash val="solid"/>
+          <a:miter lim="800000"/>
+        </a:ln>
+        <a:ln w="19050" cap="flat" cmpd="sng" algn="ctr">
+          <a:solidFill>
+            <a:schemeClr val="phClr"/>
+          </a:solidFill>
+          <a:prstDash val="solid"/>
+          <a:miter lim="800000"/>
+        </a:ln>
+      </a:lnStyleLst>
+      <a:effectStyleLst>
+        <a:effectStyle>
+          <a:effectLst/>
+        </a:effectStyle>
+        <a:effectStyle>
+          <a:effectLst/>
+        </a:effectStyle>
+        <a:effectStyle>
+          <a:effectLst>
+            <a:outerShdw blurRad="57150" dist="19050" dir="5400000" algn="ctr" rotWithShape="0">
+              <a:srgbClr val="000000">
+                <a:alpha val="63000"/>
+              </a:srgbClr>
+            </a:outerShdw>
+          </a:effectLst>
+        </a:effectStyle>
+      </a:effectStyleLst>
+      <a:bgFillStyleLst>
+        <a:solidFill>
+          <a:schemeClr val="phClr"/>
+        </a:solidFill>
+        <a:solidFill>
+          <a:schemeClr val="phClr">
+            <a:tint val="95000"/>
+            <a:satMod val="170000"/>
+          </a:schemeClr>
+        </a:solidFill>
+        <a:gradFill rotWithShape="1">
+          <a:gsLst>
+            <a:gs pos="0">
+              <a:schemeClr val="phClr">
+                <a:tint val="93000"/>
+                <a:satMod val="150000"/>
+                <a:shade val="98000"/>
+                <a:lumMod val="102000"/>
+              </a:schemeClr>
+            </a:gs>
+            <a:gs pos="50000">
+              <a:schemeClr val="phClr">
+                <a:tint val="98000"/>
+                <a:satMod val="130000"/>
+                <a:shade val="90000"/>
+                <a:lumMod val="103000"/>
+              </a:schemeClr>
+            </a:gs>
+            <a:gs pos="100000">
+              <a:schemeClr val="phClr">
+                <a:shade val="63000"/>
+                <a:satMod val="120000"/>
+              </a:schemeClr>
+            </a:gs>
+          </a:gsLst>
+          <a:lin ang="5400000" scaled="0"/>
+        </a:gradFill>
+      </a:bgFillStyleLst>
+    </a:fmtScheme>
+  </a:themeElements>
+  <a:objectDefaults/>
+  <a:extraClrSchemeLst/>
+  <a:extLst>
+    <a:ext uri="{05A4C25C-085E-4340-85A3-A5531E510DB2}">
+      <thm15:themeFamily xmlns:thm15="http://schemas.microsoft.com/office/thememl/2012/main" name="Office Theme" id="{62F939B6-93AF-4DB8-9C6B-D6C7DFDC589F}" vid="{4A3C46E8-61CC-4603-A589-7422A47A8E4A}"/>
+    </a:ext>
+  </a:extLst>
+</a:theme>
 </file>
</xml_diff>